<commit_message>
Word edition: 43 readiness documents and two volumes (P0; P1 and P2)
docs/30-READINESS-P1-P2.docx (335 pages) joins the P0 volume; the P0
files are rebuilt with the latest text. All 45 files pass the OOXML
validator; the 73 diagrams are rendered as pictures.

Claude-Session: https://claude.ai/code/session_012HHcRrzuvMBTL2FYxXtsyv
</commit_message>
<xml_diff>
--- a/treasury-platform/docs/30-readiness/word/DOC-B01-test-strategy-and-plan.docx
+++ b/treasury-platform/docs/30-readiness/word/DOC-B01-test-strategy-and-plan.docx
@@ -663,7 +663,7 @@
                 <w:szCs w:val="18"/>
                 <w:rtl/>
               </w:rPr>
-              <w:t xml:space="preserve">docs/10-detailed-analysis/00-overview-and-cross-cutting.md، docs/10-detailed-analysis/10-m0-m1-platform-organization.md، tools/ci/db_ci.sh، .github/workflows/db-ci.yml، db/tests/tenant_isolation_tests.sql، db/tests/fac_share_rule_tests.sql، tools/dbgen/check_grants.py، tools/dbgen/check_review_fixes.py، tools/dbgen/check_fk_indexes.py، tools/dbgen/check_deployed.py، docs/20-database-design.md، tools/dbgen/erd_open_items.py</w:t>
+              <w:t xml:space="preserve">docs/10-detailed-analysis/00-overview-and-cross-cutting.md، docs/10-detailed-analysis/10-m0-m1-platform-organization.md، tools/ci/db_ci.sh، ../.github/workflows/treasury-db-ci.yml (جذر المستودع)، db/tests/tenant_isolation_tests.sql، db/tests/fac_share_rule_tests.sql، tools/dbgen/check_grants.py، tools/dbgen/check_review_fixes.py، tools/dbgen/check_fk_indexes.py، tools/dbgen/check_deployed.py، docs/20-database-design.md، tools/dbgen/erd_open_items.py</w:t>
             </w:r>
           </w:p>
         </w:tc>
@@ -1158,7 +1158,7 @@
           <w:szCs w:val="21"/>
           <w:rtl/>
         </w:rPr>
-        <w:t xml:space="preserve">يُعرَّف الخط ليعمل على كل دفع إلى main وclaude/** وعلى كل طلب دمج، ولكن فقط عند تغيّر db/ أو tools/dbgen/ أو tools/ci/ أو ملف الخط نفسه (.github/workflows/db-ci.yml:6-20)، على ubuntu-24.04 (السطر 27) مع حاوية mcr.microsoft.com/mssql/server:2025-latest (السطر 32). لكنه </w:t>
+        <w:t xml:space="preserve">ملف الخط في جذر المستودع، ../.github/workflows/treasury-db-ci.yml، لأن GitHub يقرأ الخطوط من الجذر فقط. يعمل على كل دفع إلى main وclaude/** وعلى كل طلب دمج، ولكن فقط عند تغيّر treasury-platform/db/ أو tools/dbgen/ أو tools/ci/ أو ملف الخط نفسه (السطور 7-20)، ويمكن تشغيله يدويًا (السطر 21)، وينفّذ أوامره داخل treasury-platform/ (السطور 26-28)، على ubuntu-24.04 (السطر 32) مع حاوية mcr.microsoft.com/mssql/server:2025-latest (السطر 37). يثبّت Pillow (pillow==12.3.0، السطور 57-59) لأن check_fk_indexes.py يستورد erd_layout.py الذي يستورد PIL. </w:t>
       </w:r>
       <w:r>
         <w:rPr>
@@ -1169,7 +1169,7 @@
           <w:szCs w:val="21"/>
           <w:rtl/>
         </w:rPr>
-        <w:t xml:space="preserve">لم يعمل على GitHub قط</w:t>
+        <w:t xml:space="preserve">يعمل على GitHub ويمر</w:t>
       </w:r>
       <w:r>
         <w:rPr>
@@ -1180,7 +1180,7 @@
           <w:szCs w:val="21"/>
           <w:rtl/>
         </w:rPr>
-        <w:t xml:space="preserve">: ملف الخط تحت treasury-platform/.github/workflows/، وGitHub يقرأ الخطوط من جذر المستودع فقط، وملف ci.yml هناك لمشروع آخر (O-02، tools/dbgen/erd_open_items.py:22-23؛ docs/adr/0001-schema-work-on-linux.md:11). السكربت tools/ci/db_ci.sh نفسه يمر كاملًا في حاوية التطوير </w:t>
+        <w:t xml:space="preserve"> </w:t>
       </w:r>
       <w:r>
         <w:rPr>
@@ -1201,7 +1201,7 @@
           <w:szCs w:val="21"/>
           <w:rtl/>
         </w:rPr>
-        <w:t xml:space="preserve">.</w:t>
+        <w:t xml:space="preserve">: أول تشغيل أخضر في 2026-10-12 (https://github.com/thawrasy/smartlines/actions/runs/38283663041) نفّذ الخطوات الثماني كلها، 6 حالات للمشغّلات و41 حالة عزل؛ والتشغيل الذي سبقه، قبل خطوة Pillow، فشل في الخطوة 3 (التشغيل 38267525934) (O-02، tools/dbgen/erd_open_items.py:22؛ docs/adr/0001-schema-work-on-linux.md:11). والسكربت tools/ci/db_ci.sh نفسه يمر كاملًا في حاوية التطوير أيضًا.</w:t>
       </w:r>
     </w:p>
     <w:tbl>
@@ -4432,7 +4432,7 @@
           <w:szCs w:val="21"/>
           <w:rtl/>
         </w:rPr>
-        <w:t xml:space="preserve">خط CI لا يعمل عند تغيّر كود التطبيق، لأن مرشّح المسارات يقتصر على ملفات القاعدة (.github/workflows/db-ci.yml:9-13).</w:t>
+        <w:t xml:space="preserve">خط CI لا يعمل عند تغيّر كود التطبيق، لأن مرشّح المسارات يقتصر على ملفات القاعدة (../.github/workflows/treasury-db-ci.yml:10-14 و16-20).</w:t>
       </w:r>
     </w:p>
     <w:p>
@@ -4447,6 +4447,15 @@
       </w:pPr>
       <w:r>
         <w:rPr>
+          <w:rFonts w:ascii="Segoe UI Emoji" w:cs="Segoe UI Emoji" w:eastAsia="Segoe UI Emoji" w:hAnsi="Segoe UI Emoji"/>
+          <w:sz w:val="21"/>
+          <w:szCs w:val="21"/>
+          <w:rtl/>
+        </w:rPr>
+        <w:t xml:space="preserve">✅</w:t>
+      </w:r>
+      <w:r>
+        <w:rPr>
           <w:rFonts w:ascii="Arial" w:cs="Arial" w:eastAsia="Arial" w:hAnsi="Arial"/>
           <w:b w:val="false"/>
           <w:bCs w:val="false"/>
@@ -4454,7 +4463,7 @@
           <w:szCs w:val="21"/>
           <w:rtl/>
         </w:rPr>
-        <w:t xml:space="preserve">الخط لم يعمل على GitHub قط، فلا سجل تشغيل ولا حماية فرع تعتمد عليه؛ تشغيله يحتاج ملف خط في جذر المستودع بموافقة المالك (O-02، tools/dbgen/erd_open_items.py:23).</w:t>
+        <w:t xml:space="preserve"> صُحّح (2026-10-12): يعمل على GitHub من ../.github/workflows/treasury-db-ci.yml (جذر المستودع)، وأول تشغيل أخضر https://github.com/thawrasy/smartlines/actions/runs/38283663041 (O-02، tools/dbgen/erd_open_items.py:22). يبقى أن تشترطه حماية الفرع main قبل الدمج (DOC-B11 §4.1).</w:t>
       </w:r>
     </w:p>
     <w:p>
@@ -16483,7 +16492,7 @@
                 <w:szCs w:val="18"/>
                 <w:rtl/>
               </w:rPr>
-              <w:t xml:space="preserve">docs/10-detailed-analysis/10-m0-m1-platform-organization.md:147؛ .github/workflows/db-ci.yml:32</w:t>
+              <w:t xml:space="preserve">docs/10-detailed-analysis/10-m0-m1-platform-organization.md:147؛ ../.github/workflows/treasury-db-ci.yml:37</w:t>
             </w:r>
           </w:p>
         </w:tc>

</xml_diff>

<commit_message>
Readiness Word files rebuilt for the deployment preflight (ADR 0014)
Co-Authored-By: Claude Opus 5.5 <noreply@anthropic.com>
Claude-Session: https://claude.ai/code/session_012HHcRrzuvMBTL2FYxXtsyv
</commit_message>
<xml_diff>
--- a/treasury-platform/docs/30-readiness/word/DOC-B01-test-strategy-and-plan.docx
+++ b/treasury-platform/docs/30-readiness/word/DOC-B01-test-strategy-and-plan.docx
@@ -13142,11 +13142,11 @@
         </w:tblBorders>
       </w:tblPr>
       <w:tblGrid>
-        <w:gridCol w:w="962"/>
-        <w:gridCol w:w="5583"/>
-        <w:gridCol w:w="1395"/>
-        <w:gridCol w:w="962"/>
-        <w:gridCol w:w="962"/>
+        <w:gridCol w:w="936"/>
+        <w:gridCol w:w="4868"/>
+        <w:gridCol w:w="2188"/>
+        <w:gridCol w:w="936"/>
+        <w:gridCol w:w="936"/>
       </w:tblGrid>
       <w:tr>
         <w:trPr>
@@ -13155,7 +13155,7 @@
         </w:trPr>
         <w:tc>
           <w:tcPr>
-            <w:tcW w:type="dxa" w:w="962"/>
+            <w:tcW w:type="dxa" w:w="936"/>
             <w:tcBorders>
               <w:top w:val="single" w:color="BFC9D6" w:sz="4"/>
               <w:left w:val="single" w:color="BFC9D6" w:sz="4"/>
@@ -13193,7 +13193,7 @@
         </w:tc>
         <w:tc>
           <w:tcPr>
-            <w:tcW w:type="dxa" w:w="5583"/>
+            <w:tcW w:type="dxa" w:w="4868"/>
             <w:tcBorders>
               <w:top w:val="single" w:color="BFC9D6" w:sz="4"/>
               <w:left w:val="single" w:color="BFC9D6" w:sz="4"/>
@@ -13231,7 +13231,7 @@
         </w:tc>
         <w:tc>
           <w:tcPr>
-            <w:tcW w:type="dxa" w:w="1395"/>
+            <w:tcW w:type="dxa" w:w="2188"/>
             <w:tcBorders>
               <w:top w:val="single" w:color="BFC9D6" w:sz="4"/>
               <w:left w:val="single" w:color="BFC9D6" w:sz="4"/>
@@ -13269,7 +13269,7 @@
         </w:tc>
         <w:tc>
           <w:tcPr>
-            <w:tcW w:type="dxa" w:w="962"/>
+            <w:tcW w:type="dxa" w:w="936"/>
             <w:tcBorders>
               <w:top w:val="single" w:color="BFC9D6" w:sz="4"/>
               <w:left w:val="single" w:color="BFC9D6" w:sz="4"/>
@@ -13307,7 +13307,7 @@
         </w:tc>
         <w:tc>
           <w:tcPr>
-            <w:tcW w:type="dxa" w:w="962"/>
+            <w:tcW w:type="dxa" w:w="936"/>
             <w:tcBorders>
               <w:top w:val="single" w:color="BFC9D6" w:sz="4"/>
               <w:left w:val="single" w:color="BFC9D6" w:sz="4"/>
@@ -13350,7 +13350,7 @@
         </w:trPr>
         <w:tc>
           <w:tcPr>
-            <w:tcW w:type="dxa" w:w="962"/>
+            <w:tcW w:type="dxa" w:w="936"/>
             <w:tcBorders>
               <w:top w:val="single" w:color="BFC9D6" w:sz="4"/>
               <w:left w:val="single" w:color="BFC9D6" w:sz="4"/>
@@ -13386,7 +13386,7 @@
         </w:tc>
         <w:tc>
           <w:tcPr>
-            <w:tcW w:type="dxa" w:w="5583"/>
+            <w:tcW w:type="dxa" w:w="4868"/>
             <w:tcBorders>
               <w:top w:val="single" w:color="BFC9D6" w:sz="4"/>
               <w:left w:val="single" w:color="BFC9D6" w:sz="4"/>
@@ -13422,7 +13422,7 @@
         </w:tc>
         <w:tc>
           <w:tcPr>
-            <w:tcW w:type="dxa" w:w="1395"/>
+            <w:tcW w:type="dxa" w:w="2188"/>
             <w:tcBorders>
               <w:top w:val="single" w:color="BFC9D6" w:sz="4"/>
               <w:left w:val="single" w:color="BFC9D6" w:sz="4"/>
@@ -13468,7 +13468,7 @@
         </w:tc>
         <w:tc>
           <w:tcPr>
-            <w:tcW w:type="dxa" w:w="962"/>
+            <w:tcW w:type="dxa" w:w="936"/>
             <w:tcBorders>
               <w:top w:val="single" w:color="BFC9D6" w:sz="4"/>
               <w:left w:val="single" w:color="BFC9D6" w:sz="4"/>
@@ -13504,7 +13504,7 @@
         </w:tc>
         <w:tc>
           <w:tcPr>
-            <w:tcW w:type="dxa" w:w="962"/>
+            <w:tcW w:type="dxa" w:w="936"/>
             <w:tcBorders>
               <w:top w:val="single" w:color="BFC9D6" w:sz="4"/>
               <w:left w:val="single" w:color="BFC9D6" w:sz="4"/>
@@ -13545,7 +13545,7 @@
         </w:trPr>
         <w:tc>
           <w:tcPr>
-            <w:tcW w:type="dxa" w:w="962"/>
+            <w:tcW w:type="dxa" w:w="936"/>
             <w:tcBorders>
               <w:top w:val="single" w:color="BFC9D6" w:sz="4"/>
               <w:left w:val="single" w:color="BFC9D6" w:sz="4"/>
@@ -13582,7 +13582,7 @@
         </w:tc>
         <w:tc>
           <w:tcPr>
-            <w:tcW w:type="dxa" w:w="5583"/>
+            <w:tcW w:type="dxa" w:w="4868"/>
             <w:tcBorders>
               <w:top w:val="single" w:color="BFC9D6" w:sz="4"/>
               <w:left w:val="single" w:color="BFC9D6" w:sz="4"/>
@@ -13619,7 +13619,7 @@
         </w:tc>
         <w:tc>
           <w:tcPr>
-            <w:tcW w:type="dxa" w:w="1395"/>
+            <w:tcW w:type="dxa" w:w="2188"/>
             <w:tcBorders>
               <w:top w:val="single" w:color="BFC9D6" w:sz="4"/>
               <w:left w:val="single" w:color="BFC9D6" w:sz="4"/>
@@ -13650,13 +13650,70 @@
                 <w:szCs w:val="18"/>
                 <w:rtl/>
               </w:rPr>
-              <w:t xml:space="preserve">تثبيت وسم تحديث تراكمي محدد يطابق سجل الإصدارات بدل 2025-latest</w:t>
-            </w:r>
-          </w:p>
-        </w:tc>
-        <w:tc>
-          <w:tcPr>
-            <w:tcW w:type="dxa" w:w="962"/>
+              <w:t xml:space="preserve">تثبيت وسم تحديث تراكمي محدد يطابق سجل الإصدارات بدل 2025-latest. </w:t>
+            </w:r>
+            <w:r>
+              <w:rPr>
+                <w:rFonts w:ascii="Segoe UI Emoji" w:cs="Segoe UI Emoji" w:eastAsia="Segoe UI Emoji" w:hAnsi="Segoe UI Emoji"/>
+                <w:sz w:val="18"/>
+                <w:szCs w:val="18"/>
+                <w:rtl/>
+              </w:rPr>
+              <w:t xml:space="preserve">✅</w:t>
+            </w:r>
+            <w:r>
+              <w:rPr>
+                <w:rFonts w:ascii="Arial" w:cs="Arial" w:eastAsia="Arial" w:hAnsi="Arial"/>
+                <w:b w:val="false"/>
+                <w:bCs w:val="false"/>
+                <w:sz w:val="18"/>
+                <w:szCs w:val="18"/>
+                <w:rtl/>
+              </w:rPr>
+              <w:t xml:space="preserve"> منفّذ (2026-10-13، ADR 0014): </w:t>
+            </w:r>
+            <w:r>
+              <w:rPr>
+                <w:rFonts w:ascii="Courier New" w:cs="Courier New" w:eastAsia="Courier New" w:hAnsi="Courier New"/>
+                <w:b w:val="false"/>
+                <w:bCs w:val="false"/>
+                <w:color w:val="1F2937"/>
+                <w:sz w:val="16"/>
+                <w:szCs w:val="16"/>
+                <w:shd w:fill="F1F3F5" w:color="auto" w:val="clear"/>
+                <w:rtl/>
+              </w:rPr>
+              <w:t xml:space="preserve">‎2025-CU9-GDR1-ubuntu-24.04‎</w:t>
+            </w:r>
+            <w:r>
+              <w:rPr>
+                <w:rFonts w:ascii="Arial" w:cs="Arial" w:eastAsia="Arial" w:hAnsi="Arial"/>
+                <w:b w:val="false"/>
+                <w:bCs w:val="false"/>
+                <w:sz w:val="18"/>
+                <w:szCs w:val="18"/>
+                <w:rtl/>
+              </w:rPr>
+              <w:t xml:space="preserve">، تفحص CI تطابقه مع </w:t>
+            </w:r>
+            <w:r>
+              <w:rPr>
+                <w:rFonts w:ascii="Courier New" w:cs="Courier New" w:eastAsia="Courier New" w:hAnsi="Courier New"/>
+                <w:b w:val="false"/>
+                <w:bCs w:val="false"/>
+                <w:color w:val="1F2937"/>
+                <w:sz w:val="16"/>
+                <w:szCs w:val="16"/>
+                <w:shd w:fill="F1F3F5" w:color="auto" w:val="clear"/>
+                <w:rtl/>
+              </w:rPr>
+              <w:t xml:space="preserve">‎versions.json‎</w:t>
+            </w:r>
+          </w:p>
+        </w:tc>
+        <w:tc>
+          <w:tcPr>
+            <w:tcW w:type="dxa" w:w="936"/>
             <w:tcBorders>
               <w:top w:val="single" w:color="BFC9D6" w:sz="4"/>
               <w:left w:val="single" w:color="BFC9D6" w:sz="4"/>
@@ -13693,7 +13750,7 @@
         </w:tc>
         <w:tc>
           <w:tcPr>
-            <w:tcW w:type="dxa" w:w="962"/>
+            <w:tcW w:type="dxa" w:w="936"/>
             <w:tcBorders>
               <w:top w:val="single" w:color="BFC9D6" w:sz="4"/>
               <w:left w:val="single" w:color="BFC9D6" w:sz="4"/>
@@ -13735,7 +13792,7 @@
         </w:trPr>
         <w:tc>
           <w:tcPr>
-            <w:tcW w:type="dxa" w:w="962"/>
+            <w:tcW w:type="dxa" w:w="936"/>
             <w:tcBorders>
               <w:top w:val="single" w:color="BFC9D6" w:sz="4"/>
               <w:left w:val="single" w:color="BFC9D6" w:sz="4"/>
@@ -13771,7 +13828,7 @@
         </w:tc>
         <w:tc>
           <w:tcPr>
-            <w:tcW w:type="dxa" w:w="5583"/>
+            <w:tcW w:type="dxa" w:w="4868"/>
             <w:tcBorders>
               <w:top w:val="single" w:color="BFC9D6" w:sz="4"/>
               <w:left w:val="single" w:color="BFC9D6" w:sz="4"/>
@@ -13807,7 +13864,7 @@
         </w:tc>
         <w:tc>
           <w:tcPr>
-            <w:tcW w:type="dxa" w:w="1395"/>
+            <w:tcW w:type="dxa" w:w="2188"/>
             <w:tcBorders>
               <w:top w:val="single" w:color="BFC9D6" w:sz="4"/>
               <w:left w:val="single" w:color="BFC9D6" w:sz="4"/>
@@ -13843,7 +13900,7 @@
         </w:tc>
         <w:tc>
           <w:tcPr>
-            <w:tcW w:type="dxa" w:w="962"/>
+            <w:tcW w:type="dxa" w:w="936"/>
             <w:tcBorders>
               <w:top w:val="single" w:color="BFC9D6" w:sz="4"/>
               <w:left w:val="single" w:color="BFC9D6" w:sz="4"/>
@@ -13879,7 +13936,7 @@
         </w:tc>
         <w:tc>
           <w:tcPr>
-            <w:tcW w:type="dxa" w:w="962"/>
+            <w:tcW w:type="dxa" w:w="936"/>
             <w:tcBorders>
               <w:top w:val="single" w:color="BFC9D6" w:sz="4"/>
               <w:left w:val="single" w:color="BFC9D6" w:sz="4"/>
@@ -13920,7 +13977,7 @@
         </w:trPr>
         <w:tc>
           <w:tcPr>
-            <w:tcW w:type="dxa" w:w="962"/>
+            <w:tcW w:type="dxa" w:w="936"/>
             <w:tcBorders>
               <w:top w:val="single" w:color="BFC9D6" w:sz="4"/>
               <w:left w:val="single" w:color="BFC9D6" w:sz="4"/>
@@ -13957,7 +14014,7 @@
         </w:tc>
         <w:tc>
           <w:tcPr>
-            <w:tcW w:type="dxa" w:w="5583"/>
+            <w:tcW w:type="dxa" w:w="4868"/>
             <w:tcBorders>
               <w:top w:val="single" w:color="BFC9D6" w:sz="4"/>
               <w:left w:val="single" w:color="BFC9D6" w:sz="4"/>
@@ -13994,7 +14051,7 @@
         </w:tc>
         <w:tc>
           <w:tcPr>
-            <w:tcW w:type="dxa" w:w="1395"/>
+            <w:tcW w:type="dxa" w:w="2188"/>
             <w:tcBorders>
               <w:top w:val="single" w:color="BFC9D6" w:sz="4"/>
               <w:left w:val="single" w:color="BFC9D6" w:sz="4"/>
@@ -14031,7 +14088,7 @@
         </w:tc>
         <w:tc>
           <w:tcPr>
-            <w:tcW w:type="dxa" w:w="962"/>
+            <w:tcW w:type="dxa" w:w="936"/>
             <w:tcBorders>
               <w:top w:val="single" w:color="BFC9D6" w:sz="4"/>
               <w:left w:val="single" w:color="BFC9D6" w:sz="4"/>
@@ -14068,7 +14125,7 @@
         </w:tc>
         <w:tc>
           <w:tcPr>
-            <w:tcW w:type="dxa" w:w="962"/>
+            <w:tcW w:type="dxa" w:w="936"/>
             <w:tcBorders>
               <w:top w:val="single" w:color="BFC9D6" w:sz="4"/>
               <w:left w:val="single" w:color="BFC9D6" w:sz="4"/>
@@ -14110,7 +14167,7 @@
         </w:trPr>
         <w:tc>
           <w:tcPr>
-            <w:tcW w:type="dxa" w:w="962"/>
+            <w:tcW w:type="dxa" w:w="936"/>
             <w:tcBorders>
               <w:top w:val="single" w:color="BFC9D6" w:sz="4"/>
               <w:left w:val="single" w:color="BFC9D6" w:sz="4"/>
@@ -14146,7 +14203,7 @@
         </w:tc>
         <w:tc>
           <w:tcPr>
-            <w:tcW w:type="dxa" w:w="5583"/>
+            <w:tcW w:type="dxa" w:w="4868"/>
             <w:tcBorders>
               <w:top w:val="single" w:color="BFC9D6" w:sz="4"/>
               <w:left w:val="single" w:color="BFC9D6" w:sz="4"/>
@@ -14182,7 +14239,7 @@
         </w:tc>
         <w:tc>
           <w:tcPr>
-            <w:tcW w:type="dxa" w:w="1395"/>
+            <w:tcW w:type="dxa" w:w="2188"/>
             <w:tcBorders>
               <w:top w:val="single" w:color="BFC9D6" w:sz="4"/>
               <w:left w:val="single" w:color="BFC9D6" w:sz="4"/>
@@ -14218,7 +14275,7 @@
         </w:tc>
         <w:tc>
           <w:tcPr>
-            <w:tcW w:type="dxa" w:w="962"/>
+            <w:tcW w:type="dxa" w:w="936"/>
             <w:tcBorders>
               <w:top w:val="single" w:color="BFC9D6" w:sz="4"/>
               <w:left w:val="single" w:color="BFC9D6" w:sz="4"/>
@@ -14254,7 +14311,7 @@
         </w:tc>
         <w:tc>
           <w:tcPr>
-            <w:tcW w:type="dxa" w:w="962"/>
+            <w:tcW w:type="dxa" w:w="936"/>
             <w:tcBorders>
               <w:top w:val="single" w:color="BFC9D6" w:sz="4"/>
               <w:left w:val="single" w:color="BFC9D6" w:sz="4"/>
@@ -14295,7 +14352,7 @@
         </w:trPr>
         <w:tc>
           <w:tcPr>
-            <w:tcW w:type="dxa" w:w="962"/>
+            <w:tcW w:type="dxa" w:w="936"/>
             <w:tcBorders>
               <w:top w:val="single" w:color="BFC9D6" w:sz="4"/>
               <w:left w:val="single" w:color="BFC9D6" w:sz="4"/>
@@ -14332,7 +14389,7 @@
         </w:tc>
         <w:tc>
           <w:tcPr>
-            <w:tcW w:type="dxa" w:w="5583"/>
+            <w:tcW w:type="dxa" w:w="4868"/>
             <w:tcBorders>
               <w:top w:val="single" w:color="BFC9D6" w:sz="4"/>
               <w:left w:val="single" w:color="BFC9D6" w:sz="4"/>
@@ -14369,7 +14426,7 @@
         </w:tc>
         <w:tc>
           <w:tcPr>
-            <w:tcW w:type="dxa" w:w="1395"/>
+            <w:tcW w:type="dxa" w:w="2188"/>
             <w:tcBorders>
               <w:top w:val="single" w:color="BFC9D6" w:sz="4"/>
               <w:left w:val="single" w:color="BFC9D6" w:sz="4"/>
@@ -14416,7 +14473,7 @@
         </w:tc>
         <w:tc>
           <w:tcPr>
-            <w:tcW w:type="dxa" w:w="962"/>
+            <w:tcW w:type="dxa" w:w="936"/>
             <w:tcBorders>
               <w:top w:val="single" w:color="BFC9D6" w:sz="4"/>
               <w:left w:val="single" w:color="BFC9D6" w:sz="4"/>
@@ -14453,7 +14510,7 @@
         </w:tc>
         <w:tc>
           <w:tcPr>
-            <w:tcW w:type="dxa" w:w="962"/>
+            <w:tcW w:type="dxa" w:w="936"/>
             <w:tcBorders>
               <w:top w:val="single" w:color="BFC9D6" w:sz="4"/>
               <w:left w:val="single" w:color="BFC9D6" w:sz="4"/>
@@ -14495,7 +14552,7 @@
         </w:trPr>
         <w:tc>
           <w:tcPr>
-            <w:tcW w:type="dxa" w:w="962"/>
+            <w:tcW w:type="dxa" w:w="936"/>
             <w:tcBorders>
               <w:top w:val="single" w:color="BFC9D6" w:sz="4"/>
               <w:left w:val="single" w:color="BFC9D6" w:sz="4"/>
@@ -14531,7 +14588,7 @@
         </w:tc>
         <w:tc>
           <w:tcPr>
-            <w:tcW w:type="dxa" w:w="5583"/>
+            <w:tcW w:type="dxa" w:w="4868"/>
             <w:tcBorders>
               <w:top w:val="single" w:color="BFC9D6" w:sz="4"/>
               <w:left w:val="single" w:color="BFC9D6" w:sz="4"/>
@@ -14567,7 +14624,7 @@
         </w:tc>
         <w:tc>
           <w:tcPr>
-            <w:tcW w:type="dxa" w:w="1395"/>
+            <w:tcW w:type="dxa" w:w="2188"/>
             <w:tcBorders>
               <w:top w:val="single" w:color="BFC9D6" w:sz="4"/>
               <w:left w:val="single" w:color="BFC9D6" w:sz="4"/>
@@ -14613,7 +14670,7 @@
         </w:tc>
         <w:tc>
           <w:tcPr>
-            <w:tcW w:type="dxa" w:w="962"/>
+            <w:tcW w:type="dxa" w:w="936"/>
             <w:tcBorders>
               <w:top w:val="single" w:color="BFC9D6" w:sz="4"/>
               <w:left w:val="single" w:color="BFC9D6" w:sz="4"/>
@@ -14649,7 +14706,7 @@
         </w:tc>
         <w:tc>
           <w:tcPr>
-            <w:tcW w:type="dxa" w:w="962"/>
+            <w:tcW w:type="dxa" w:w="936"/>
             <w:tcBorders>
               <w:top w:val="single" w:color="BFC9D6" w:sz="4"/>
               <w:left w:val="single" w:color="BFC9D6" w:sz="4"/>
@@ -14690,7 +14747,7 @@
         </w:trPr>
         <w:tc>
           <w:tcPr>
-            <w:tcW w:type="dxa" w:w="962"/>
+            <w:tcW w:type="dxa" w:w="936"/>
             <w:tcBorders>
               <w:top w:val="single" w:color="BFC9D6" w:sz="4"/>
               <w:left w:val="single" w:color="BFC9D6" w:sz="4"/>
@@ -14727,7 +14784,7 @@
         </w:tc>
         <w:tc>
           <w:tcPr>
-            <w:tcW w:type="dxa" w:w="5583"/>
+            <w:tcW w:type="dxa" w:w="4868"/>
             <w:tcBorders>
               <w:top w:val="single" w:color="BFC9D6" w:sz="4"/>
               <w:left w:val="single" w:color="BFC9D6" w:sz="4"/>
@@ -14764,7 +14821,7 @@
         </w:tc>
         <w:tc>
           <w:tcPr>
-            <w:tcW w:type="dxa" w:w="1395"/>
+            <w:tcW w:type="dxa" w:w="2188"/>
             <w:tcBorders>
               <w:top w:val="single" w:color="BFC9D6" w:sz="4"/>
               <w:left w:val="single" w:color="BFC9D6" w:sz="4"/>
@@ -14801,7 +14858,7 @@
         </w:tc>
         <w:tc>
           <w:tcPr>
-            <w:tcW w:type="dxa" w:w="962"/>
+            <w:tcW w:type="dxa" w:w="936"/>
             <w:tcBorders>
               <w:top w:val="single" w:color="BFC9D6" w:sz="4"/>
               <w:left w:val="single" w:color="BFC9D6" w:sz="4"/>
@@ -14838,7 +14895,7 @@
         </w:tc>
         <w:tc>
           <w:tcPr>
-            <w:tcW w:type="dxa" w:w="962"/>
+            <w:tcW w:type="dxa" w:w="936"/>
             <w:tcBorders>
               <w:top w:val="single" w:color="BFC9D6" w:sz="4"/>
               <w:left w:val="single" w:color="BFC9D6" w:sz="4"/>
@@ -14880,7 +14937,7 @@
         </w:trPr>
         <w:tc>
           <w:tcPr>
-            <w:tcW w:type="dxa" w:w="962"/>
+            <w:tcW w:type="dxa" w:w="936"/>
             <w:tcBorders>
               <w:top w:val="single" w:color="BFC9D6" w:sz="4"/>
               <w:left w:val="single" w:color="BFC9D6" w:sz="4"/>
@@ -14916,7 +14973,7 @@
         </w:tc>
         <w:tc>
           <w:tcPr>
-            <w:tcW w:type="dxa" w:w="5583"/>
+            <w:tcW w:type="dxa" w:w="4868"/>
             <w:tcBorders>
               <w:top w:val="single" w:color="BFC9D6" w:sz="4"/>
               <w:left w:val="single" w:color="BFC9D6" w:sz="4"/>
@@ -14952,7 +15009,7 @@
         </w:tc>
         <w:tc>
           <w:tcPr>
-            <w:tcW w:type="dxa" w:w="1395"/>
+            <w:tcW w:type="dxa" w:w="2188"/>
             <w:tcBorders>
               <w:top w:val="single" w:color="BFC9D6" w:sz="4"/>
               <w:left w:val="single" w:color="BFC9D6" w:sz="4"/>
@@ -14998,7 +15055,7 @@
         </w:tc>
         <w:tc>
           <w:tcPr>
-            <w:tcW w:type="dxa" w:w="962"/>
+            <w:tcW w:type="dxa" w:w="936"/>
             <w:tcBorders>
               <w:top w:val="single" w:color="BFC9D6" w:sz="4"/>
               <w:left w:val="single" w:color="BFC9D6" w:sz="4"/>
@@ -15034,7 +15091,7 @@
         </w:tc>
         <w:tc>
           <w:tcPr>
-            <w:tcW w:type="dxa" w:w="962"/>
+            <w:tcW w:type="dxa" w:w="936"/>
             <w:tcBorders>
               <w:top w:val="single" w:color="BFC9D6" w:sz="4"/>
               <w:left w:val="single" w:color="BFC9D6" w:sz="4"/>
@@ -15075,7 +15132,7 @@
         </w:trPr>
         <w:tc>
           <w:tcPr>
-            <w:tcW w:type="dxa" w:w="962"/>
+            <w:tcW w:type="dxa" w:w="936"/>
             <w:tcBorders>
               <w:top w:val="single" w:color="BFC9D6" w:sz="4"/>
               <w:left w:val="single" w:color="BFC9D6" w:sz="4"/>
@@ -15112,7 +15169,7 @@
         </w:tc>
         <w:tc>
           <w:tcPr>
-            <w:tcW w:type="dxa" w:w="5583"/>
+            <w:tcW w:type="dxa" w:w="4868"/>
             <w:tcBorders>
               <w:top w:val="single" w:color="BFC9D6" w:sz="4"/>
               <w:left w:val="single" w:color="BFC9D6" w:sz="4"/>
@@ -15149,7 +15206,7 @@
         </w:tc>
         <w:tc>
           <w:tcPr>
-            <w:tcW w:type="dxa" w:w="1395"/>
+            <w:tcW w:type="dxa" w:w="2188"/>
             <w:tcBorders>
               <w:top w:val="single" w:color="BFC9D6" w:sz="4"/>
               <w:left w:val="single" w:color="BFC9D6" w:sz="4"/>
@@ -15186,7 +15243,7 @@
         </w:tc>
         <w:tc>
           <w:tcPr>
-            <w:tcW w:type="dxa" w:w="962"/>
+            <w:tcW w:type="dxa" w:w="936"/>
             <w:tcBorders>
               <w:top w:val="single" w:color="BFC9D6" w:sz="4"/>
               <w:left w:val="single" w:color="BFC9D6" w:sz="4"/>
@@ -15223,7 +15280,7 @@
         </w:tc>
         <w:tc>
           <w:tcPr>
-            <w:tcW w:type="dxa" w:w="962"/>
+            <w:tcW w:type="dxa" w:w="936"/>
             <w:tcBorders>
               <w:top w:val="single" w:color="BFC9D6" w:sz="4"/>
               <w:left w:val="single" w:color="BFC9D6" w:sz="4"/>

</xml_diff>

<commit_message>
Readiness Word files rebuilt after the self-review
The 43 readiness documents, each in its own file, and the P1-P2 volume, from the
documents as corrected by the self-review of 2026-10-18.

Co-Authored-By: Claude Opus 5.5 <noreply@anthropic.com>
Claude-Session: https://claude.ai/code/session_012HHcRrzuvMBTL2FYxXtsyv
</commit_message>
<xml_diff>
--- a/treasury-platform/docs/30-readiness/word/DOC-B01-test-strategy-and-plan.docx
+++ b/treasury-platform/docs/30-readiness/word/DOC-B01-test-strategy-and-plan.docx
@@ -1158,7 +1158,7 @@
           <w:szCs w:val="21"/>
           <w:rtl/>
         </w:rPr>
-        <w:t xml:space="preserve">ملف الخط في جذر المستودع، ../.github/workflows/treasury-db-ci.yml، لأن GitHub يقرأ الخطوط من الجذر فقط. يعمل على كل دفع إلى main وclaude/** وعلى كل طلب دمج، ولكن فقط عند تغيّر treasury-platform/db/ أو tools/dbgen/ أو tools/ci/ أو ملف الخط نفسه (السطور 7-20)، ويمكن تشغيله يدويًا (السطر 21)، وينفّذ أوامره داخل treasury-platform/ (السطور 26-28)، على ubuntu-24.04 (السطر 32) مع حاوية mcr.microsoft.com/mssql/server:2025-latest (السطر 37). يثبّت Pillow (pillow==12.3.0، السطور 57-59) لأن check_fk_indexes.py يستورد erd_layout.py الذي يستورد PIL. </w:t>
+        <w:t xml:space="preserve">ملف الخط في جذر المستودع، ../.github/workflows/treasury-db-ci.yml، لأن GitHub يقرأ الخطوط من الجذر فقط. يعمل على كل دفع إلى main وclaude/** وعلى كل طلب دمج، ولكن فقط عند تغيّر treasury-platform/db/ أو tools/dbgen/ أو tools/ci/ أو tools/deploy/ أو versions.json أو مستندات الجاهزية والتحليل التفصيلي التي تُولَّد منها بذرة الصلاحيات، أو ملف الخط نفسه، ويمكن تشغيله يدويًا، وينفّذ أوامره داخل treasury-platform/، على ubuntu-24.04 مع حاوية mcr.microsoft.com/mssql/server:2025-CU9-GDR1-ubuntu-24.04 مثبّتة ببصمتها (sha256، من versions.json؛ تطابقها الخطوة 3)، والإجراءات مثبّتة بإيداعاتها، والسحب بلا حفظ بيانات الاعتماد (المراجعة الذاتية E13). يثبّت Pillow (pillow==12.3.0) لأن check_fk_indexes.py يستورد erd_layout.py الذي يستورد PIL. </w:t>
       </w:r>
       <w:r>
         <w:rPr>
@@ -1201,7 +1201,7 @@
           <w:szCs w:val="21"/>
           <w:rtl/>
         </w:rPr>
-        <w:t xml:space="preserve">: أول تشغيل أخضر في 2026-10-12 (https://github.com/thawrasy/smartlines/actions/runs/38283663041) نفّذ الخطوات الثماني كلها، 6 حالات للمشغّلات و41 حالة عزل؛ والتشغيل الذي سبقه، قبل خطوة Pillow، فشل في الخطوة 3 (التشغيل 38267525934) (O-02، tools/dbgen/erd_open_items.py:22؛ docs/adr/0001-schema-work-on-linux.md:11). والسكربت tools/ci/db_ci.sh نفسه يمر كاملًا في حاوية التطوير أيضًا.</w:t>
+        <w:t xml:space="preserve">: أول تشغيل أخضر في 2026-10-12 (https://github.com/thawrasy/smartlines/actions/runs/38283663041) نفّذ الخطوات الثماني يومها، 6 حالات للمشغّلات و41 حالة عزل؛ والتشغيل الذي سبقه، قبل خطوة Pillow، فشل في الخطوة 3 (التشغيل 38267525934) (O-02، tools/dbgen/erd_open_items.py:22؛ docs/adr/0001-schema-work-on-linux.md:11). واليوم 25 خطوة (0 إلى 23 و4b، الجدول أدناه)، والسكربت tools/ci/db_ci.sh نفسه يمر كاملًا في حاوية التطوير أيضًا. وتُطابق كل خطوة سطور PASS وFAIL في أي موضع من السطر، وتعدّ كل حالة مرة واحدة (المراجعة الذاتية C9).</w:t>
       </w:r>
     </w:p>
     <w:tbl>
@@ -1218,9 +1218,9 @@
         </w:tblBorders>
       </w:tblPr>
       <w:tblGrid>
-        <w:gridCol w:w="1409"/>
-        <w:gridCol w:w="3053"/>
-        <w:gridCol w:w="5402"/>
+        <w:gridCol w:w="1083"/>
+        <w:gridCol w:w="3181"/>
+        <w:gridCol w:w="5600"/>
       </w:tblGrid>
       <w:tr>
         <w:trPr>
@@ -1229,7 +1229,7 @@
         </w:trPr>
         <w:tc>
           <w:tcPr>
-            <w:tcW w:type="dxa" w:w="1409"/>
+            <w:tcW w:type="dxa" w:w="1083"/>
             <w:tcBorders>
               <w:top w:val="single" w:color="BFC9D6" w:sz="4"/>
               <w:left w:val="single" w:color="BFC9D6" w:sz="4"/>
@@ -1267,7 +1267,7 @@
         </w:tc>
         <w:tc>
           <w:tcPr>
-            <w:tcW w:type="dxa" w:w="3053"/>
+            <w:tcW w:type="dxa" w:w="3181"/>
             <w:tcBorders>
               <w:top w:val="single" w:color="BFC9D6" w:sz="4"/>
               <w:left w:val="single" w:color="BFC9D6" w:sz="4"/>
@@ -1305,7 +1305,7 @@
         </w:tc>
         <w:tc>
           <w:tcPr>
-            <w:tcW w:type="dxa" w:w="5402"/>
+            <w:tcW w:type="dxa" w:w="5600"/>
             <w:tcBorders>
               <w:top w:val="single" w:color="BFC9D6" w:sz="4"/>
               <w:left w:val="single" w:color="BFC9D6" w:sz="4"/>
@@ -1348,7 +1348,7 @@
         </w:trPr>
         <w:tc>
           <w:tcPr>
-            <w:tcW w:type="dxa" w:w="1409"/>
+            <w:tcW w:type="dxa" w:w="1083"/>
             <w:tcBorders>
               <w:top w:val="single" w:color="BFC9D6" w:sz="4"/>
               <w:left w:val="single" w:color="BFC9D6" w:sz="4"/>
@@ -1384,7 +1384,7 @@
         </w:tc>
         <w:tc>
           <w:tcPr>
-            <w:tcW w:type="dxa" w:w="3053"/>
+            <w:tcW w:type="dxa" w:w="3181"/>
             <w:tcBorders>
               <w:top w:val="single" w:color="BFC9D6" w:sz="4"/>
               <w:left w:val="single" w:color="BFC9D6" w:sz="4"/>
@@ -1420,7 +1420,7 @@
         </w:tc>
         <w:tc>
           <w:tcPr>
-            <w:tcW w:type="dxa" w:w="5402"/>
+            <w:tcW w:type="dxa" w:w="5600"/>
             <w:tcBorders>
               <w:top w:val="single" w:color="BFC9D6" w:sz="4"/>
               <w:left w:val="single" w:color="BFC9D6" w:sz="4"/>
@@ -1461,7 +1461,7 @@
         </w:trPr>
         <w:tc>
           <w:tcPr>
-            <w:tcW w:type="dxa" w:w="1409"/>
+            <w:tcW w:type="dxa" w:w="1083"/>
             <w:tcBorders>
               <w:top w:val="single" w:color="BFC9D6" w:sz="4"/>
               <w:left w:val="single" w:color="BFC9D6" w:sz="4"/>
@@ -1498,7 +1498,7 @@
         </w:tc>
         <w:tc>
           <w:tcPr>
-            <w:tcW w:type="dxa" w:w="3053"/>
+            <w:tcW w:type="dxa" w:w="3181"/>
             <w:tcBorders>
               <w:top w:val="single" w:color="BFC9D6" w:sz="4"/>
               <w:left w:val="single" w:color="BFC9D6" w:sz="4"/>
@@ -1548,7 +1548,7 @@
         </w:tc>
         <w:tc>
           <w:tcPr>
-            <w:tcW w:type="dxa" w:w="5402"/>
+            <w:tcW w:type="dxa" w:w="5600"/>
             <w:tcBorders>
               <w:top w:val="single" w:color="BFC9D6" w:sz="4"/>
               <w:left w:val="single" w:color="BFC9D6" w:sz="4"/>
@@ -1590,7 +1590,7 @@
         </w:trPr>
         <w:tc>
           <w:tcPr>
-            <w:tcW w:type="dxa" w:w="1409"/>
+            <w:tcW w:type="dxa" w:w="1083"/>
             <w:tcBorders>
               <w:top w:val="single" w:color="BFC9D6" w:sz="4"/>
               <w:left w:val="single" w:color="BFC9D6" w:sz="4"/>
@@ -1626,7 +1626,7 @@
         </w:tc>
         <w:tc>
           <w:tcPr>
-            <w:tcW w:type="dxa" w:w="3053"/>
+            <w:tcW w:type="dxa" w:w="3181"/>
             <w:tcBorders>
               <w:top w:val="single" w:color="BFC9D6" w:sz="4"/>
               <w:left w:val="single" w:color="BFC9D6" w:sz="4"/>
@@ -1662,7 +1662,7 @@
         </w:tc>
         <w:tc>
           <w:tcPr>
-            <w:tcW w:type="dxa" w:w="5402"/>
+            <w:tcW w:type="dxa" w:w="5600"/>
             <w:tcBorders>
               <w:top w:val="single" w:color="BFC9D6" w:sz="4"/>
               <w:left w:val="single" w:color="BFC9D6" w:sz="4"/>
@@ -1703,7 +1703,7 @@
         </w:trPr>
         <w:tc>
           <w:tcPr>
-            <w:tcW w:type="dxa" w:w="1409"/>
+            <w:tcW w:type="dxa" w:w="1083"/>
             <w:tcBorders>
               <w:top w:val="single" w:color="BFC9D6" w:sz="4"/>
               <w:left w:val="single" w:color="BFC9D6" w:sz="4"/>
@@ -1740,7 +1740,7 @@
         </w:tc>
         <w:tc>
           <w:tcPr>
-            <w:tcW w:type="dxa" w:w="3053"/>
+            <w:tcW w:type="dxa" w:w="3181"/>
             <w:tcBorders>
               <w:top w:val="single" w:color="BFC9D6" w:sz="4"/>
               <w:left w:val="single" w:color="BFC9D6" w:sz="4"/>
@@ -1777,7 +1777,7 @@
         </w:tc>
         <w:tc>
           <w:tcPr>
-            <w:tcW w:type="dxa" w:w="5402"/>
+            <w:tcW w:type="dxa" w:w="5600"/>
             <w:tcBorders>
               <w:top w:val="single" w:color="BFC9D6" w:sz="4"/>
               <w:left w:val="single" w:color="BFC9D6" w:sz="4"/>
@@ -1819,7 +1819,7 @@
         </w:trPr>
         <w:tc>
           <w:tcPr>
-            <w:tcW w:type="dxa" w:w="1409"/>
+            <w:tcW w:type="dxa" w:w="1083"/>
             <w:tcBorders>
               <w:top w:val="single" w:color="BFC9D6" w:sz="4"/>
               <w:left w:val="single" w:color="BFC9D6" w:sz="4"/>
@@ -1855,7 +1855,7 @@
         </w:tc>
         <w:tc>
           <w:tcPr>
-            <w:tcW w:type="dxa" w:w="3053"/>
+            <w:tcW w:type="dxa" w:w="3181"/>
             <w:tcBorders>
               <w:top w:val="single" w:color="BFC9D6" w:sz="4"/>
               <w:left w:val="single" w:color="BFC9D6" w:sz="4"/>
@@ -1891,7 +1891,7 @@
         </w:tc>
         <w:tc>
           <w:tcPr>
-            <w:tcW w:type="dxa" w:w="5402"/>
+            <w:tcW w:type="dxa" w:w="5600"/>
             <w:tcBorders>
               <w:top w:val="single" w:color="BFC9D6" w:sz="4"/>
               <w:left w:val="single" w:color="BFC9D6" w:sz="4"/>
@@ -1932,7 +1932,7 @@
         </w:trPr>
         <w:tc>
           <w:tcPr>
-            <w:tcW w:type="dxa" w:w="1409"/>
+            <w:tcW w:type="dxa" w:w="1083"/>
             <w:tcBorders>
               <w:top w:val="single" w:color="BFC9D6" w:sz="4"/>
               <w:left w:val="single" w:color="BFC9D6" w:sz="4"/>
@@ -1969,7 +1969,7 @@
         </w:tc>
         <w:tc>
           <w:tcPr>
-            <w:tcW w:type="dxa" w:w="3053"/>
+            <w:tcW w:type="dxa" w:w="3181"/>
             <w:tcBorders>
               <w:top w:val="single" w:color="BFC9D6" w:sz="4"/>
               <w:left w:val="single" w:color="BFC9D6" w:sz="4"/>
@@ -2006,7 +2006,7 @@
         </w:tc>
         <w:tc>
           <w:tcPr>
-            <w:tcW w:type="dxa" w:w="5402"/>
+            <w:tcW w:type="dxa" w:w="5600"/>
             <w:tcBorders>
               <w:top w:val="single" w:color="BFC9D6" w:sz="4"/>
               <w:left w:val="single" w:color="BFC9D6" w:sz="4"/>
@@ -2048,7 +2048,7 @@
         </w:trPr>
         <w:tc>
           <w:tcPr>
-            <w:tcW w:type="dxa" w:w="1409"/>
+            <w:tcW w:type="dxa" w:w="1083"/>
             <w:tcBorders>
               <w:top w:val="single" w:color="BFC9D6" w:sz="4"/>
               <w:left w:val="single" w:color="BFC9D6" w:sz="4"/>
@@ -2084,73 +2084,73 @@
         </w:tc>
         <w:tc>
           <w:tcPr>
-            <w:tcW w:type="dxa" w:w="3053"/>
-            <w:tcBorders>
-              <w:top w:val="single" w:color="BFC9D6" w:sz="4"/>
-              <w:left w:val="single" w:color="BFC9D6" w:sz="4"/>
-              <w:bottom w:val="single" w:color="BFC9D6" w:sz="4"/>
-              <w:right w:val="single" w:color="BFC9D6" w:sz="4"/>
-            </w:tcBorders>
-            <w:tcMar>
-              <w:top w:type="dxa" w:w="50"/>
-              <w:left w:type="dxa" w:w="90"/>
-              <w:bottom w:type="dxa" w:w="50"/>
-              <w:right w:type="dxa" w:w="90"/>
-            </w:tcMar>
-            <w:vAlign w:val="top"/>
-          </w:tcPr>
-          <w:p>
-            <w:pPr>
-              <w:keepNext w:val="false"/>
-              <w:bidi/>
-              <w:spacing w:after="30" w:before="30" w:line="264"/>
-            </w:pPr>
-            <w:r>
-              <w:rPr>
-                <w:rFonts w:ascii="Arial" w:cs="Arial" w:eastAsia="Arial" w:hAnsi="Arial"/>
-                <w:b w:val="false"/>
-                <w:bCs w:val="false"/>
-                <w:sz w:val="18"/>
-                <w:szCs w:val="18"/>
-                <w:rtl/>
-              </w:rPr>
-              <w:t xml:space="preserve">اختبارات المشغّلات: 6 سطور PASS بالضبط</w:t>
-            </w:r>
-          </w:p>
-        </w:tc>
-        <w:tc>
-          <w:tcPr>
-            <w:tcW w:type="dxa" w:w="5402"/>
-            <w:tcBorders>
-              <w:top w:val="single" w:color="BFC9D6" w:sz="4"/>
-              <w:left w:val="single" w:color="BFC9D6" w:sz="4"/>
-              <w:bottom w:val="single" w:color="BFC9D6" w:sz="4"/>
-              <w:right w:val="single" w:color="BFC9D6" w:sz="4"/>
-            </w:tcBorders>
-            <w:tcMar>
-              <w:top w:type="dxa" w:w="50"/>
-              <w:left w:type="dxa" w:w="90"/>
-              <w:bottom w:type="dxa" w:w="50"/>
-              <w:right w:type="dxa" w:w="90"/>
-            </w:tcMar>
-            <w:vAlign w:val="top"/>
-          </w:tcPr>
-          <w:p>
-            <w:pPr>
-              <w:keepNext w:val="false"/>
-              <w:bidi/>
-              <w:spacing w:after="30" w:before="30" w:line="264"/>
-            </w:pPr>
-            <w:r>
-              <w:rPr>
-                <w:rFonts w:ascii="Arial" w:cs="Arial" w:eastAsia="Arial" w:hAnsi="Arial"/>
-                <w:b w:val="false"/>
-                <w:bCs w:val="false"/>
-                <w:sz w:val="18"/>
-                <w:szCs w:val="18"/>
-                <w:rtl/>
-              </w:rPr>
-              <w:t xml:space="preserve">tools/ci/db_ci.sh:59-74</w:t>
+            <w:tcW w:type="dxa" w:w="3181"/>
+            <w:tcBorders>
+              <w:top w:val="single" w:color="BFC9D6" w:sz="4"/>
+              <w:left w:val="single" w:color="BFC9D6" w:sz="4"/>
+              <w:bottom w:val="single" w:color="BFC9D6" w:sz="4"/>
+              <w:right w:val="single" w:color="BFC9D6" w:sz="4"/>
+            </w:tcBorders>
+            <w:tcMar>
+              <w:top w:type="dxa" w:w="50"/>
+              <w:left w:type="dxa" w:w="90"/>
+              <w:bottom w:type="dxa" w:w="50"/>
+              <w:right w:type="dxa" w:w="90"/>
+            </w:tcMar>
+            <w:vAlign w:val="top"/>
+          </w:tcPr>
+          <w:p>
+            <w:pPr>
+              <w:keepNext w:val="false"/>
+              <w:bidi/>
+              <w:spacing w:after="30" w:before="30" w:line="264"/>
+            </w:pPr>
+            <w:r>
+              <w:rPr>
+                <w:rFonts w:ascii="Arial" w:cs="Arial" w:eastAsia="Arial" w:hAnsi="Arial"/>
+                <w:b w:val="false"/>
+                <w:bCs w:val="false"/>
+                <w:sz w:val="18"/>
+                <w:szCs w:val="18"/>
+                <w:rtl/>
+              </w:rPr>
+              <w:t xml:space="preserve">اختبارات المشغّلات: 7 حالات PASS بالضبط (T1 إلى T6 وT2b)</w:t>
+            </w:r>
+          </w:p>
+        </w:tc>
+        <w:tc>
+          <w:tcPr>
+            <w:tcW w:type="dxa" w:w="5600"/>
+            <w:tcBorders>
+              <w:top w:val="single" w:color="BFC9D6" w:sz="4"/>
+              <w:left w:val="single" w:color="BFC9D6" w:sz="4"/>
+              <w:bottom w:val="single" w:color="BFC9D6" w:sz="4"/>
+              <w:right w:val="single" w:color="BFC9D6" w:sz="4"/>
+            </w:tcBorders>
+            <w:tcMar>
+              <w:top w:type="dxa" w:w="50"/>
+              <w:left w:type="dxa" w:w="90"/>
+              <w:bottom w:type="dxa" w:w="50"/>
+              <w:right w:type="dxa" w:w="90"/>
+            </w:tcMar>
+            <w:vAlign w:val="top"/>
+          </w:tcPr>
+          <w:p>
+            <w:pPr>
+              <w:keepNext w:val="false"/>
+              <w:bidi/>
+              <w:spacing w:after="30" w:before="30" w:line="264"/>
+            </w:pPr>
+            <w:r>
+              <w:rPr>
+                <w:rFonts w:ascii="Arial" w:cs="Arial" w:eastAsia="Arial" w:hAnsi="Arial"/>
+                <w:b w:val="false"/>
+                <w:bCs w:val="false"/>
+                <w:sz w:val="18"/>
+                <w:szCs w:val="18"/>
+                <w:rtl/>
+              </w:rPr>
+              <w:t xml:space="preserve">tools/ci/db_ci.sh</w:t>
             </w:r>
           </w:p>
         </w:tc>
@@ -2161,7 +2161,7 @@
         </w:trPr>
         <w:tc>
           <w:tcPr>
-            <w:tcW w:type="dxa" w:w="1409"/>
+            <w:tcW w:type="dxa" w:w="1083"/>
             <w:tcBorders>
               <w:top w:val="single" w:color="BFC9D6" w:sz="4"/>
               <w:left w:val="single" w:color="BFC9D6" w:sz="4"/>
@@ -2198,7 +2198,7 @@
         </w:tc>
         <w:tc>
           <w:tcPr>
-            <w:tcW w:type="dxa" w:w="3053"/>
+            <w:tcW w:type="dxa" w:w="3181"/>
             <w:tcBorders>
               <w:top w:val="single" w:color="BFC9D6" w:sz="4"/>
               <w:left w:val="single" w:color="BFC9D6" w:sz="4"/>
@@ -2229,13 +2229,13 @@
                 <w:szCs w:val="18"/>
                 <w:rtl/>
               </w:rPr>
-              <w:t xml:space="preserve">اختبارات العزل: 41 سطر PASS بالضبط</w:t>
-            </w:r>
-          </w:p>
-        </w:tc>
-        <w:tc>
-          <w:tcPr>
-            <w:tcW w:type="dxa" w:w="5402"/>
+              <w:t xml:space="preserve">اختبارات العزل: 48 حالة PASS بالضبط</w:t>
+            </w:r>
+          </w:p>
+        </w:tc>
+        <w:tc>
+          <w:tcPr>
+            <w:tcW w:type="dxa" w:w="5600"/>
             <w:tcBorders>
               <w:top w:val="single" w:color="BFC9D6" w:sz="4"/>
               <w:left w:val="single" w:color="BFC9D6" w:sz="4"/>
@@ -2266,7 +2266,465 @@
                 <w:szCs w:val="18"/>
                 <w:rtl/>
               </w:rPr>
-              <w:t xml:space="preserve">tools/ci/db_ci.sh:75-92</w:t>
+              <w:t xml:space="preserve">tools/ci/db_ci.sh</w:t>
+            </w:r>
+          </w:p>
+        </w:tc>
+      </w:tr>
+      <w:tr>
+        <w:trPr>
+          <w:cantSplit/>
+        </w:trPr>
+        <w:tc>
+          <w:tcPr>
+            <w:tcW w:type="dxa" w:w="1083"/>
+            <w:tcBorders>
+              <w:top w:val="single" w:color="BFC9D6" w:sz="4"/>
+              <w:left w:val="single" w:color="BFC9D6" w:sz="4"/>
+              <w:bottom w:val="single" w:color="BFC9D6" w:sz="4"/>
+              <w:right w:val="single" w:color="BFC9D6" w:sz="4"/>
+            </w:tcBorders>
+            <w:tcMar>
+              <w:top w:type="dxa" w:w="50"/>
+              <w:left w:type="dxa" w:w="90"/>
+              <w:bottom w:type="dxa" w:w="50"/>
+              <w:right w:type="dxa" w:w="90"/>
+            </w:tcMar>
+            <w:vAlign w:val="top"/>
+          </w:tcPr>
+          <w:p>
+            <w:pPr>
+              <w:keepNext w:val="false"/>
+              <w:bidi/>
+              <w:spacing w:after="30" w:before="30" w:line="264"/>
+            </w:pPr>
+            <w:r>
+              <w:rPr>
+                <w:rFonts w:ascii="Arial" w:cs="Arial" w:eastAsia="Arial" w:hAnsi="Arial"/>
+                <w:b w:val="false"/>
+                <w:bCs w:val="false"/>
+                <w:sz w:val="18"/>
+                <w:szCs w:val="18"/>
+                <w:rtl/>
+              </w:rPr>
+              <w:t xml:space="preserve">8 إلى 18</w:t>
+            </w:r>
+          </w:p>
+        </w:tc>
+        <w:tc>
+          <w:tcPr>
+            <w:tcW w:type="dxa" w:w="3181"/>
+            <w:tcBorders>
+              <w:top w:val="single" w:color="BFC9D6" w:sz="4"/>
+              <w:left w:val="single" w:color="BFC9D6" w:sz="4"/>
+              <w:bottom w:val="single" w:color="BFC9D6" w:sz="4"/>
+              <w:right w:val="single" w:color="BFC9D6" w:sz="4"/>
+            </w:tcBorders>
+            <w:tcMar>
+              <w:top w:type="dxa" w:w="50"/>
+              <w:left w:type="dxa" w:w="90"/>
+              <w:bottom w:type="dxa" w:w="50"/>
+              <w:right w:type="dxa" w:w="90"/>
+            </w:tcMar>
+            <w:vAlign w:val="top"/>
+          </w:tcPr>
+          <w:p>
+            <w:pPr>
+              <w:keepNext w:val="false"/>
+              <w:bidi/>
+              <w:spacing w:after="30" w:before="30" w:line="264"/>
+            </w:pPr>
+            <w:r>
+              <w:rPr>
+                <w:rFonts w:ascii="Arial" w:cs="Arial" w:eastAsia="Arial" w:hAnsi="Arial"/>
+                <w:b w:val="false"/>
+                <w:bCs w:val="false"/>
+                <w:sz w:val="18"/>
+                <w:szCs w:val="18"/>
+                <w:rtl/>
+              </w:rPr>
+              <w:t xml:space="preserve">أمن الحساب (20)، المشغّل والدعم (11)، ربط المهام (7، J1 إلى J7)، تهيئة المشترك (5)، الترقيم (8، ومع اتصالات متزامنة 2)، تاريخ KYC (4)، البيانات المرجعية (4)، التدقيق (7)، التصدير (7، X1 إلى X7)، دخولات الخدمة (6)</w:t>
+            </w:r>
+          </w:p>
+        </w:tc>
+        <w:tc>
+          <w:tcPr>
+            <w:tcW w:type="dxa" w:w="5600"/>
+            <w:tcBorders>
+              <w:top w:val="single" w:color="BFC9D6" w:sz="4"/>
+              <w:left w:val="single" w:color="BFC9D6" w:sz="4"/>
+              <w:bottom w:val="single" w:color="BFC9D6" w:sz="4"/>
+              <w:right w:val="single" w:color="BFC9D6" w:sz="4"/>
+            </w:tcBorders>
+            <w:tcMar>
+              <w:top w:type="dxa" w:w="50"/>
+              <w:left w:type="dxa" w:w="90"/>
+              <w:bottom w:type="dxa" w:w="50"/>
+              <w:right w:type="dxa" w:w="90"/>
+            </w:tcMar>
+            <w:vAlign w:val="top"/>
+          </w:tcPr>
+          <w:p>
+            <w:pPr>
+              <w:keepNext w:val="false"/>
+              <w:bidi/>
+              <w:spacing w:after="30" w:before="30" w:line="264"/>
+            </w:pPr>
+            <w:r>
+              <w:rPr>
+                <w:rFonts w:ascii="Arial" w:cs="Arial" w:eastAsia="Arial" w:hAnsi="Arial"/>
+                <w:b w:val="false"/>
+                <w:bCs w:val="false"/>
+                <w:sz w:val="18"/>
+                <w:szCs w:val="18"/>
+                <w:rtl/>
+              </w:rPr>
+              <w:t xml:space="preserve">tools/ci/db_ci.sh</w:t>
+            </w:r>
+          </w:p>
+        </w:tc>
+      </w:tr>
+      <w:tr>
+        <w:trPr>
+          <w:cantSplit/>
+        </w:trPr>
+        <w:tc>
+          <w:tcPr>
+            <w:tcW w:type="dxa" w:w="1083"/>
+            <w:tcBorders>
+              <w:top w:val="single" w:color="BFC9D6" w:sz="4"/>
+              <w:left w:val="single" w:color="BFC9D6" w:sz="4"/>
+              <w:bottom w:val="single" w:color="BFC9D6" w:sz="4"/>
+              <w:right w:val="single" w:color="BFC9D6" w:sz="4"/>
+            </w:tcBorders>
+            <w:shd w:fill="F5F8FC" w:color="auto" w:val="clear"/>
+            <w:tcMar>
+              <w:top w:type="dxa" w:w="50"/>
+              <w:left w:type="dxa" w:w="90"/>
+              <w:bottom w:type="dxa" w:w="50"/>
+              <w:right w:type="dxa" w:w="90"/>
+            </w:tcMar>
+            <w:vAlign w:val="top"/>
+          </w:tcPr>
+          <w:p>
+            <w:pPr>
+              <w:keepNext w:val="false"/>
+              <w:bidi/>
+              <w:spacing w:after="30" w:before="30" w:line="264"/>
+            </w:pPr>
+            <w:r>
+              <w:rPr>
+                <w:rFonts w:ascii="Arial" w:cs="Arial" w:eastAsia="Arial" w:hAnsi="Arial"/>
+                <w:b w:val="false"/>
+                <w:bCs w:val="false"/>
+                <w:sz w:val="18"/>
+                <w:szCs w:val="18"/>
+                <w:rtl/>
+              </w:rPr>
+              <w:t xml:space="preserve">19</w:t>
+            </w:r>
+          </w:p>
+        </w:tc>
+        <w:tc>
+          <w:tcPr>
+            <w:tcW w:type="dxa" w:w="3181"/>
+            <w:tcBorders>
+              <w:top w:val="single" w:color="BFC9D6" w:sz="4"/>
+              <w:left w:val="single" w:color="BFC9D6" w:sz="4"/>
+              <w:bottom w:val="single" w:color="BFC9D6" w:sz="4"/>
+              <w:right w:val="single" w:color="BFC9D6" w:sz="4"/>
+            </w:tcBorders>
+            <w:shd w:fill="F5F8FC" w:color="auto" w:val="clear"/>
+            <w:tcMar>
+              <w:top w:type="dxa" w:w="50"/>
+              <w:left w:type="dxa" w:w="90"/>
+              <w:bottom w:type="dxa" w:w="50"/>
+              <w:right w:type="dxa" w:w="90"/>
+            </w:tcMar>
+            <w:vAlign w:val="top"/>
+          </w:tcPr>
+          <w:p>
+            <w:pPr>
+              <w:keepNext w:val="false"/>
+              <w:bidi/>
+              <w:spacing w:after="30" w:before="30" w:line="264"/>
+            </w:pPr>
+            <w:r>
+              <w:rPr>
+                <w:rFonts w:ascii="Arial" w:cs="Arial" w:eastAsia="Arial" w:hAnsi="Arial"/>
+                <w:b w:val="false"/>
+                <w:bCs w:val="false"/>
+                <w:sz w:val="18"/>
+                <w:szCs w:val="18"/>
+                <w:rtl/>
+              </w:rPr>
+              <w:t xml:space="preserve">إصلاحات المراجعة: RF1 إلى RF34 وSR1 إلى SR9 (43)</w:t>
+            </w:r>
+          </w:p>
+        </w:tc>
+        <w:tc>
+          <w:tcPr>
+            <w:tcW w:type="dxa" w:w="5600"/>
+            <w:tcBorders>
+              <w:top w:val="single" w:color="BFC9D6" w:sz="4"/>
+              <w:left w:val="single" w:color="BFC9D6" w:sz="4"/>
+              <w:bottom w:val="single" w:color="BFC9D6" w:sz="4"/>
+              <w:right w:val="single" w:color="BFC9D6" w:sz="4"/>
+            </w:tcBorders>
+            <w:shd w:fill="F5F8FC" w:color="auto" w:val="clear"/>
+            <w:tcMar>
+              <w:top w:type="dxa" w:w="50"/>
+              <w:left w:type="dxa" w:w="90"/>
+              <w:bottom w:type="dxa" w:w="50"/>
+              <w:right w:type="dxa" w:w="90"/>
+            </w:tcMar>
+            <w:vAlign w:val="top"/>
+          </w:tcPr>
+          <w:p>
+            <w:pPr>
+              <w:keepNext w:val="false"/>
+              <w:bidi/>
+              <w:spacing w:after="30" w:before="30" w:line="264"/>
+            </w:pPr>
+            <w:r>
+              <w:rPr>
+                <w:rFonts w:ascii="Arial" w:cs="Arial" w:eastAsia="Arial" w:hAnsi="Arial"/>
+                <w:b w:val="false"/>
+                <w:bCs w:val="false"/>
+                <w:sz w:val="18"/>
+                <w:szCs w:val="18"/>
+                <w:rtl/>
+              </w:rPr>
+              <w:t xml:space="preserve">db/tests/review_fixes_tests.sql</w:t>
+            </w:r>
+          </w:p>
+        </w:tc>
+      </w:tr>
+      <w:tr>
+        <w:trPr>
+          <w:cantSplit/>
+        </w:trPr>
+        <w:tc>
+          <w:tcPr>
+            <w:tcW w:type="dxa" w:w="1083"/>
+            <w:tcBorders>
+              <w:top w:val="single" w:color="BFC9D6" w:sz="4"/>
+              <w:left w:val="single" w:color="BFC9D6" w:sz="4"/>
+              <w:bottom w:val="single" w:color="BFC9D6" w:sz="4"/>
+              <w:right w:val="single" w:color="BFC9D6" w:sz="4"/>
+            </w:tcBorders>
+            <w:tcMar>
+              <w:top w:type="dxa" w:w="50"/>
+              <w:left w:type="dxa" w:w="90"/>
+              <w:bottom w:type="dxa" w:w="50"/>
+              <w:right w:type="dxa" w:w="90"/>
+            </w:tcMar>
+            <w:vAlign w:val="top"/>
+          </w:tcPr>
+          <w:p>
+            <w:pPr>
+              <w:keepNext w:val="false"/>
+              <w:bidi/>
+              <w:spacing w:after="30" w:before="30" w:line="264"/>
+            </w:pPr>
+            <w:r>
+              <w:rPr>
+                <w:rFonts w:ascii="Arial" w:cs="Arial" w:eastAsia="Arial" w:hAnsi="Arial"/>
+                <w:b w:val="false"/>
+                <w:bCs w:val="false"/>
+                <w:sz w:val="18"/>
+                <w:szCs w:val="18"/>
+                <w:rtl/>
+              </w:rPr>
+              <w:t xml:space="preserve">20 إلى 22</w:t>
+            </w:r>
+          </w:p>
+        </w:tc>
+        <w:tc>
+          <w:tcPr>
+            <w:tcW w:type="dxa" w:w="3181"/>
+            <w:tcBorders>
+              <w:top w:val="single" w:color="BFC9D6" w:sz="4"/>
+              <w:left w:val="single" w:color="BFC9D6" w:sz="4"/>
+              <w:bottom w:val="single" w:color="BFC9D6" w:sz="4"/>
+              <w:right w:val="single" w:color="BFC9D6" w:sz="4"/>
+            </w:tcBorders>
+            <w:tcMar>
+              <w:top w:type="dxa" w:w="50"/>
+              <w:left w:type="dxa" w:w="90"/>
+              <w:bottom w:type="dxa" w:w="50"/>
+              <w:right w:type="dxa" w:w="90"/>
+            </w:tcMar>
+            <w:vAlign w:val="top"/>
+          </w:tcPr>
+          <w:p>
+            <w:pPr>
+              <w:keepNext w:val="false"/>
+              <w:bidi/>
+              <w:spacing w:after="30" w:before="30" w:line="264"/>
+            </w:pPr>
+            <w:r>
+              <w:rPr>
+                <w:rFonts w:ascii="Arial" w:cs="Arial" w:eastAsia="Arial" w:hAnsi="Arial"/>
+                <w:b w:val="false"/>
+                <w:bCs w:val="false"/>
+                <w:sz w:val="18"/>
+                <w:szCs w:val="18"/>
+                <w:rtl/>
+              </w:rPr>
+              <w:t xml:space="preserve">SQL Server Audit (SA1 إلى SA9)، دخول المراقبة (MN1 إلى MN6)، فحوص ما قبل النشر (PF1 إلى PF8)</w:t>
+            </w:r>
+          </w:p>
+        </w:tc>
+        <w:tc>
+          <w:tcPr>
+            <w:tcW w:type="dxa" w:w="5600"/>
+            <w:tcBorders>
+              <w:top w:val="single" w:color="BFC9D6" w:sz="4"/>
+              <w:left w:val="single" w:color="BFC9D6" w:sz="4"/>
+              <w:bottom w:val="single" w:color="BFC9D6" w:sz="4"/>
+              <w:right w:val="single" w:color="BFC9D6" w:sz="4"/>
+            </w:tcBorders>
+            <w:tcMar>
+              <w:top w:type="dxa" w:w="50"/>
+              <w:left w:type="dxa" w:w="90"/>
+              <w:bottom w:type="dxa" w:w="50"/>
+              <w:right w:type="dxa" w:w="90"/>
+            </w:tcMar>
+            <w:vAlign w:val="top"/>
+          </w:tcPr>
+          <w:p>
+            <w:pPr>
+              <w:keepNext w:val="false"/>
+              <w:bidi/>
+              <w:spacing w:after="30" w:before="30" w:line="264"/>
+            </w:pPr>
+            <w:r>
+              <w:rPr>
+                <w:rFonts w:ascii="Arial" w:cs="Arial" w:eastAsia="Arial" w:hAnsi="Arial"/>
+                <w:b w:val="false"/>
+                <w:bCs w:val="false"/>
+                <w:sz w:val="18"/>
+                <w:szCs w:val="18"/>
+                <w:rtl/>
+              </w:rPr>
+              <w:t xml:space="preserve">tools/ci/*_check.sh</w:t>
+            </w:r>
+          </w:p>
+        </w:tc>
+      </w:tr>
+      <w:tr>
+        <w:trPr>
+          <w:cantSplit/>
+        </w:trPr>
+        <w:tc>
+          <w:tcPr>
+            <w:tcW w:type="dxa" w:w="1083"/>
+            <w:tcBorders>
+              <w:top w:val="single" w:color="BFC9D6" w:sz="4"/>
+              <w:left w:val="single" w:color="BFC9D6" w:sz="4"/>
+              <w:bottom w:val="single" w:color="BFC9D6" w:sz="4"/>
+              <w:right w:val="single" w:color="BFC9D6" w:sz="4"/>
+            </w:tcBorders>
+            <w:shd w:fill="F5F8FC" w:color="auto" w:val="clear"/>
+            <w:tcMar>
+              <w:top w:type="dxa" w:w="50"/>
+              <w:left w:type="dxa" w:w="90"/>
+              <w:bottom w:type="dxa" w:w="50"/>
+              <w:right w:type="dxa" w:w="90"/>
+            </w:tcMar>
+            <w:vAlign w:val="top"/>
+          </w:tcPr>
+          <w:p>
+            <w:pPr>
+              <w:keepNext w:val="false"/>
+              <w:bidi/>
+              <w:spacing w:after="30" w:before="30" w:line="264"/>
+            </w:pPr>
+            <w:r>
+              <w:rPr>
+                <w:rFonts w:ascii="Arial" w:cs="Arial" w:eastAsia="Arial" w:hAnsi="Arial"/>
+                <w:b w:val="false"/>
+                <w:bCs w:val="false"/>
+                <w:sz w:val="18"/>
+                <w:szCs w:val="18"/>
+                <w:rtl/>
+              </w:rPr>
+              <w:t xml:space="preserve">23</w:t>
+            </w:r>
+          </w:p>
+        </w:tc>
+        <w:tc>
+          <w:tcPr>
+            <w:tcW w:type="dxa" w:w="3181"/>
+            <w:tcBorders>
+              <w:top w:val="single" w:color="BFC9D6" w:sz="4"/>
+              <w:left w:val="single" w:color="BFC9D6" w:sz="4"/>
+              <w:bottom w:val="single" w:color="BFC9D6" w:sz="4"/>
+              <w:right w:val="single" w:color="BFC9D6" w:sz="4"/>
+            </w:tcBorders>
+            <w:shd w:fill="F5F8FC" w:color="auto" w:val="clear"/>
+            <w:tcMar>
+              <w:top w:type="dxa" w:w="50"/>
+              <w:left w:type="dxa" w:w="90"/>
+              <w:bottom w:type="dxa" w:w="50"/>
+              <w:right w:type="dxa" w:w="90"/>
+            </w:tcMar>
+            <w:vAlign w:val="top"/>
+          </w:tcPr>
+          <w:p>
+            <w:pPr>
+              <w:keepNext w:val="false"/>
+              <w:bidi/>
+              <w:spacing w:after="30" w:before="30" w:line="264"/>
+            </w:pPr>
+            <w:r>
+              <w:rPr>
+                <w:rFonts w:ascii="Arial" w:cs="Arial" w:eastAsia="Arial" w:hAnsi="Arial"/>
+                <w:b w:val="false"/>
+                <w:bCs w:val="false"/>
+                <w:sz w:val="18"/>
+                <w:szCs w:val="18"/>
+                <w:rtl/>
+              </w:rPr>
+              <w:t xml:space="preserve">لا قيد غير موثوق ولا مشغّل معطّل ولا مرشح صفوف معطّل ولا مستخدم اختبار ولا مشترك متروك</w:t>
+            </w:r>
+          </w:p>
+        </w:tc>
+        <w:tc>
+          <w:tcPr>
+            <w:tcW w:type="dxa" w:w="5600"/>
+            <w:tcBorders>
+              <w:top w:val="single" w:color="BFC9D6" w:sz="4"/>
+              <w:left w:val="single" w:color="BFC9D6" w:sz="4"/>
+              <w:bottom w:val="single" w:color="BFC9D6" w:sz="4"/>
+              <w:right w:val="single" w:color="BFC9D6" w:sz="4"/>
+            </w:tcBorders>
+            <w:shd w:fill="F5F8FC" w:color="auto" w:val="clear"/>
+            <w:tcMar>
+              <w:top w:type="dxa" w:w="50"/>
+              <w:left w:type="dxa" w:w="90"/>
+              <w:bottom w:type="dxa" w:w="50"/>
+              <w:right w:type="dxa" w:w="90"/>
+            </w:tcMar>
+            <w:vAlign w:val="top"/>
+          </w:tcPr>
+          <w:p>
+            <w:pPr>
+              <w:keepNext w:val="false"/>
+              <w:bidi/>
+              <w:spacing w:after="30" w:before="30" w:line="264"/>
+            </w:pPr>
+            <w:r>
+              <w:rPr>
+                <w:rFonts w:ascii="Arial" w:cs="Arial" w:eastAsia="Arial" w:hAnsi="Arial"/>
+                <w:b w:val="false"/>
+                <w:bCs w:val="false"/>
+                <w:sz w:val="18"/>
+                <w:szCs w:val="18"/>
+                <w:rtl/>
+              </w:rPr>
+              <w:t xml:space="preserve">tools/ci/db_ci.sh</w:t>
             </w:r>
           </w:p>
         </w:tc>
@@ -2317,7 +2775,7 @@
           <w:szCs w:val="21"/>
           <w:rtl/>
         </w:rPr>
-        <w:t xml:space="preserve">db/tests/tenant_isolation_tests.sql: 41 حالة (T1 إلى T38 مع T8b وT16b وT16c، tools/ci/db_ci.sh:87-88). تُنفَّذ بصفة الدورين tp_app وtp_readonly عبر EXECUTE AS، والتشغيل كله معاملة واحدة تُلغى في النهاية (db/tests/tenant_isolation_tests.sql:2-11).</w:t>
+        <w:t xml:space="preserve">db/tests/tenant_isolation_tests.sql: 48 حالة (T1 إلى T38 مع T8b وT16b وT16c، وT40 إلى T46؛ لا T39). تُنفَّذ بصفة الدورين tp_app وtp_readonly عبر EXECUTE AS، والتشغيل كله معاملة واحدة تُلغى في النهاية (db/tests/tenant_isolation_tests.sql:2-11).</w:t>
       </w:r>
     </w:p>
     <w:p>
@@ -2339,7 +2797,7 @@
           <w:szCs w:val="21"/>
           <w:rtl/>
         </w:rPr>
-        <w:t xml:space="preserve">db/tests/fac_share_rule_tests.sql: 6 حالات لقاعدة حصص المقرضين V-FAC-02 (السطور 47 و70 و93 و113 و135 و150)، كل حالة في معاملتها (السطور 5-7).</w:t>
+        <w:t xml:space="preserve">db/tests/fac_share_rule_tests.sql: 7 حالات لقاعدة حصص المقرضين V-FAC-02، كل حالة في معاملتها: T1 إلى T6، وT2b للقاعدة نفسها والتجميد معطّل داخل المعاملة؛ فمنذ المراجعة الذاتية A1 يرفض تجميد المراجعة المعتمدة (50049، db/static/044_entry_guards.sql) إضافة مقرض إليها قبل القاعدة (T2).</w:t>
       </w:r>
     </w:p>
     <w:p>

</xml_diff>

<commit_message>
Internal review v6: merge of the three tracks, cross-checks, counts, docs/41 and Word files
- the platform digest also covers the facilities' revisions and the documents the inputs cite (ADR 0038 reads
  them as of the assessment date); 046 header wording (an internal scale, not an agency rating)
- tests: the CORRECTION case of CA7 approves as the approver (058); CR7 and CR8 without TRY wrappers; the
  first anchor run on a fresh database may anchor nothing (AA1); the window refusal without a recent backup
  (MG8); review_fixes_tests drops its users
- counts in docs/20, docs/33, DOC-B01, DOC-B11: 937 keys, 1,501 checks, 121 triggers, 61 modules, 34 steps;
  docs/41 completed with lens E; ADR list to 0039; Word files and the relationship diagrams rebuilt

Co-Authored-By: Claude Opus 5.5 <noreply@anthropic.com>
Claude-Session: https://claude.ai/code/session_012HHcRrzuvMBTL2FYxXtsyv
</commit_message>
<xml_diff>
--- a/treasury-platform/docs/30-readiness/word/DOC-B01-test-strategy-and-plan.docx
+++ b/treasury-platform/docs/30-readiness/word/DOC-B01-test-strategy-and-plan.docx
@@ -1201,7 +1201,7 @@
           <w:szCs w:val="21"/>
           <w:rtl/>
         </w:rPr>
-        <w:t xml:space="preserve">: أول تشغيل أخضر في 2026-10-12 (https://github.com/thawrasy/smartlines/actions/runs/38283663041) نفّذ الخطوات الثماني يومها، 6 حالات للمشغّلات و41 حالة عزل؛ والتشغيل الذي سبقه، قبل خطوة Pillow، فشل في الخطوة 3 (التشغيل 38267525934) (O-02، tools/dbgen/erd_open_items.py:22؛ docs/adr/0001-schema-work-on-linux.md:11). واليوم 25 خطوة (0 إلى 23 و4b، الجدول أدناه)، والسكربت tools/ci/db_ci.sh نفسه يمر كاملًا في حاوية التطوير أيضًا. وتُطابق كل خطوة سطور PASS وFAIL في أي موضع من السطر، وتعدّ كل حالة مرة واحدة (المراجعة الذاتية C9).</w:t>
+        <w:t xml:space="preserve">: أول تشغيل أخضر في 2026-10-12 (https://github.com/thawrasy/smartlines/actions/runs/38283663041) نفّذ الخطوات الثماني يومها، 6 حالات للمشغّلات و41 حالة عزل؛ والتشغيل الذي سبقه، قبل خطوة Pillow، فشل في الخطوة 3 (التشغيل 38267525934) (O-02، tools/dbgen/erd_open_items.py:22؛ docs/adr/0001-schema-work-on-linux.md:11). واليوم 34 خطوة (0 إلى 24 و4b و19b إلى 19d و22b إلى 22e، الجدول أدناه)، والسكربت tools/ci/db_ci.sh نفسه يمر كاملًا في حاوية التطوير أيضًا. وتُطابق كل خطوة سطور PASS وFAIL في أي موضع من السطر، وتعدّ كل حالة مرة واحدة (المراجعة الذاتية C9).</w:t>
       </w:r>
     </w:p>
     <w:tbl>
@@ -1218,9 +1218,9 @@
         </w:tblBorders>
       </w:tblPr>
       <w:tblGrid>
-        <w:gridCol w:w="1083"/>
-        <w:gridCol w:w="3181"/>
-        <w:gridCol w:w="5600"/>
+        <w:gridCol w:w="985"/>
+        <w:gridCol w:w="3241"/>
+        <w:gridCol w:w="5638"/>
       </w:tblGrid>
       <w:tr>
         <w:trPr>
@@ -1229,7 +1229,7 @@
         </w:trPr>
         <w:tc>
           <w:tcPr>
-            <w:tcW w:type="dxa" w:w="1083"/>
+            <w:tcW w:type="dxa" w:w="985"/>
             <w:tcBorders>
               <w:top w:val="single" w:color="BFC9D6" w:sz="4"/>
               <w:left w:val="single" w:color="BFC9D6" w:sz="4"/>
@@ -1267,7 +1267,7 @@
         </w:tc>
         <w:tc>
           <w:tcPr>
-            <w:tcW w:type="dxa" w:w="3181"/>
+            <w:tcW w:type="dxa" w:w="3241"/>
             <w:tcBorders>
               <w:top w:val="single" w:color="BFC9D6" w:sz="4"/>
               <w:left w:val="single" w:color="BFC9D6" w:sz="4"/>
@@ -1305,7 +1305,7 @@
         </w:tc>
         <w:tc>
           <w:tcPr>
-            <w:tcW w:type="dxa" w:w="5600"/>
+            <w:tcW w:type="dxa" w:w="5638"/>
             <w:tcBorders>
               <w:top w:val="single" w:color="BFC9D6" w:sz="4"/>
               <w:left w:val="single" w:color="BFC9D6" w:sz="4"/>
@@ -1348,7 +1348,7 @@
         </w:trPr>
         <w:tc>
           <w:tcPr>
-            <w:tcW w:type="dxa" w:w="1083"/>
+            <w:tcW w:type="dxa" w:w="985"/>
             <w:tcBorders>
               <w:top w:val="single" w:color="BFC9D6" w:sz="4"/>
               <w:left w:val="single" w:color="BFC9D6" w:sz="4"/>
@@ -1384,7 +1384,7 @@
         </w:tc>
         <w:tc>
           <w:tcPr>
-            <w:tcW w:type="dxa" w:w="3181"/>
+            <w:tcW w:type="dxa" w:w="3241"/>
             <w:tcBorders>
               <w:top w:val="single" w:color="BFC9D6" w:sz="4"/>
               <w:left w:val="single" w:color="BFC9D6" w:sz="4"/>
@@ -1420,37 +1420,37 @@
         </w:tc>
         <w:tc>
           <w:tcPr>
-            <w:tcW w:type="dxa" w:w="5600"/>
-            <w:tcBorders>
-              <w:top w:val="single" w:color="BFC9D6" w:sz="4"/>
-              <w:left w:val="single" w:color="BFC9D6" w:sz="4"/>
-              <w:bottom w:val="single" w:color="BFC9D6" w:sz="4"/>
-              <w:right w:val="single" w:color="BFC9D6" w:sz="4"/>
-            </w:tcBorders>
-            <w:tcMar>
-              <w:top w:type="dxa" w:w="50"/>
-              <w:left w:type="dxa" w:w="90"/>
-              <w:bottom w:type="dxa" w:w="50"/>
-              <w:right w:type="dxa" w:w="90"/>
-            </w:tcMar>
-            <w:vAlign w:val="top"/>
-          </w:tcPr>
-          <w:p>
-            <w:pPr>
-              <w:keepNext w:val="false"/>
-              <w:bidi/>
-              <w:spacing w:after="30" w:before="30" w:line="264"/>
-            </w:pPr>
-            <w:r>
-              <w:rPr>
-                <w:rFonts w:ascii="Arial" w:cs="Arial" w:eastAsia="Arial" w:hAnsi="Arial"/>
-                <w:b w:val="false"/>
-                <w:bCs w:val="false"/>
-                <w:sz w:val="18"/>
-                <w:szCs w:val="18"/>
-                <w:rtl/>
-              </w:rPr>
-              <w:t xml:space="preserve">tools/ci/db_ci.sh:23-34</w:t>
+            <w:tcW w:type="dxa" w:w="5638"/>
+            <w:tcBorders>
+              <w:top w:val="single" w:color="BFC9D6" w:sz="4"/>
+              <w:left w:val="single" w:color="BFC9D6" w:sz="4"/>
+              <w:bottom w:val="single" w:color="BFC9D6" w:sz="4"/>
+              <w:right w:val="single" w:color="BFC9D6" w:sz="4"/>
+            </w:tcBorders>
+            <w:tcMar>
+              <w:top w:type="dxa" w:w="50"/>
+              <w:left w:type="dxa" w:w="90"/>
+              <w:bottom w:type="dxa" w:w="50"/>
+              <w:right w:type="dxa" w:w="90"/>
+            </w:tcMar>
+            <w:vAlign w:val="top"/>
+          </w:tcPr>
+          <w:p>
+            <w:pPr>
+              <w:keepNext w:val="false"/>
+              <w:bidi/>
+              <w:spacing w:after="30" w:before="30" w:line="264"/>
+            </w:pPr>
+            <w:r>
+              <w:rPr>
+                <w:rFonts w:ascii="Arial" w:cs="Arial" w:eastAsia="Arial" w:hAnsi="Arial"/>
+                <w:b w:val="false"/>
+                <w:bCs w:val="false"/>
+                <w:sz w:val="18"/>
+                <w:szCs w:val="18"/>
+                <w:rtl/>
+              </w:rPr>
+              <w:t xml:space="preserve">tools/ci/db_ci.sh:45-56</w:t>
             </w:r>
           </w:p>
         </w:tc>
@@ -1461,7 +1461,7 @@
         </w:trPr>
         <w:tc>
           <w:tcPr>
-            <w:tcW w:type="dxa" w:w="1083"/>
+            <w:tcW w:type="dxa" w:w="985"/>
             <w:tcBorders>
               <w:top w:val="single" w:color="BFC9D6" w:sz="4"/>
               <w:left w:val="single" w:color="BFC9D6" w:sz="4"/>
@@ -1498,7 +1498,7 @@
         </w:tc>
         <w:tc>
           <w:tcPr>
-            <w:tcW w:type="dxa" w:w="3181"/>
+            <w:tcW w:type="dxa" w:w="3241"/>
             <w:tcBorders>
               <w:top w:val="single" w:color="BFC9D6" w:sz="4"/>
               <w:left w:val="single" w:color="BFC9D6" w:sz="4"/>
@@ -1548,7 +1548,7 @@
         </w:tc>
         <w:tc>
           <w:tcPr>
-            <w:tcW w:type="dxa" w:w="5600"/>
+            <w:tcW w:type="dxa" w:w="5638"/>
             <w:tcBorders>
               <w:top w:val="single" w:color="BFC9D6" w:sz="4"/>
               <w:left w:val="single" w:color="BFC9D6" w:sz="4"/>
@@ -1579,7 +1579,7 @@
                 <w:szCs w:val="18"/>
                 <w:rtl/>
               </w:rPr>
-              <w:t xml:space="preserve">tools/ci/db_ci.sh:36-37</w:t>
+              <w:t xml:space="preserve">tools/ci/db_ci.sh:58-59</w:t>
             </w:r>
           </w:p>
         </w:tc>
@@ -1590,7 +1590,7 @@
         </w:trPr>
         <w:tc>
           <w:tcPr>
-            <w:tcW w:type="dxa" w:w="1083"/>
+            <w:tcW w:type="dxa" w:w="985"/>
             <w:tcBorders>
               <w:top w:val="single" w:color="BFC9D6" w:sz="4"/>
               <w:left w:val="single" w:color="BFC9D6" w:sz="4"/>
@@ -1626,73 +1626,73 @@
         </w:tc>
         <w:tc>
           <w:tcPr>
-            <w:tcW w:type="dxa" w:w="3181"/>
-            <w:tcBorders>
-              <w:top w:val="single" w:color="BFC9D6" w:sz="4"/>
-              <w:left w:val="single" w:color="BFC9D6" w:sz="4"/>
-              <w:bottom w:val="single" w:color="BFC9D6" w:sz="4"/>
-              <w:right w:val="single" w:color="BFC9D6" w:sz="4"/>
-            </w:tcBorders>
-            <w:tcMar>
-              <w:top w:type="dxa" w:w="50"/>
-              <w:left w:type="dxa" w:w="90"/>
-              <w:bottom w:type="dxa" w:w="50"/>
-              <w:right w:type="dxa" w:w="90"/>
-            </w:tcMar>
-            <w:vAlign w:val="top"/>
-          </w:tcPr>
-          <w:p>
-            <w:pPr>
-              <w:keepNext w:val="false"/>
-              <w:bidi/>
-              <w:spacing w:after="30" w:before="30" w:line="264"/>
-            </w:pPr>
-            <w:r>
-              <w:rPr>
-                <w:rFonts w:ascii="Arial" w:cs="Arial" w:eastAsia="Arial" w:hAnsi="Arial"/>
-                <w:b w:val="false"/>
-                <w:bCs w:val="false"/>
-                <w:sz w:val="18"/>
-                <w:szCs w:val="18"/>
-                <w:rtl/>
-              </w:rPr>
-              <w:t xml:space="preserve">مطابقة DDL المولَّد للنموذج</w:t>
-            </w:r>
-          </w:p>
-        </w:tc>
-        <w:tc>
-          <w:tcPr>
-            <w:tcW w:type="dxa" w:w="5600"/>
-            <w:tcBorders>
-              <w:top w:val="single" w:color="BFC9D6" w:sz="4"/>
-              <w:left w:val="single" w:color="BFC9D6" w:sz="4"/>
-              <w:bottom w:val="single" w:color="BFC9D6" w:sz="4"/>
-              <w:right w:val="single" w:color="BFC9D6" w:sz="4"/>
-            </w:tcBorders>
-            <w:tcMar>
-              <w:top w:type="dxa" w:w="50"/>
-              <w:left w:type="dxa" w:w="90"/>
-              <w:bottom w:type="dxa" w:w="50"/>
-              <w:right w:type="dxa" w:w="90"/>
-            </w:tcMar>
-            <w:vAlign w:val="top"/>
-          </w:tcPr>
-          <w:p>
-            <w:pPr>
-              <w:keepNext w:val="false"/>
-              <w:bidi/>
-              <w:spacing w:after="30" w:before="30" w:line="264"/>
-            </w:pPr>
-            <w:r>
-              <w:rPr>
-                <w:rFonts w:ascii="Arial" w:cs="Arial" w:eastAsia="Arial" w:hAnsi="Arial"/>
-                <w:b w:val="false"/>
-                <w:bCs w:val="false"/>
-                <w:sz w:val="18"/>
-                <w:szCs w:val="18"/>
-                <w:rtl/>
-              </w:rPr>
-              <w:t xml:space="preserve">tools/ci/db_ci.sh:39-45</w:t>
+            <w:tcW w:type="dxa" w:w="3241"/>
+            <w:tcBorders>
+              <w:top w:val="single" w:color="BFC9D6" w:sz="4"/>
+              <w:left w:val="single" w:color="BFC9D6" w:sz="4"/>
+              <w:bottom w:val="single" w:color="BFC9D6" w:sz="4"/>
+              <w:right w:val="single" w:color="BFC9D6" w:sz="4"/>
+            </w:tcBorders>
+            <w:tcMar>
+              <w:top w:type="dxa" w:w="50"/>
+              <w:left w:type="dxa" w:w="90"/>
+              <w:bottom w:type="dxa" w:w="50"/>
+              <w:right w:type="dxa" w:w="90"/>
+            </w:tcMar>
+            <w:vAlign w:val="top"/>
+          </w:tcPr>
+          <w:p>
+            <w:pPr>
+              <w:keepNext w:val="false"/>
+              <w:bidi/>
+              <w:spacing w:after="30" w:before="30" w:line="264"/>
+            </w:pPr>
+            <w:r>
+              <w:rPr>
+                <w:rFonts w:ascii="Arial" w:cs="Arial" w:eastAsia="Arial" w:hAnsi="Arial"/>
+                <w:b w:val="false"/>
+                <w:bCs w:val="false"/>
+                <w:sz w:val="18"/>
+                <w:szCs w:val="18"/>
+                <w:rtl/>
+              </w:rPr>
+              <w:t xml:space="preserve">مطابقة DDL المولَّد للنموذج، وبذرة الصلاحيات، والحزمة CORE.ROLES و057، وبذرة المنهجية الائتمانية وجداول docs/35، وحالات محرك التقييم</w:t>
+            </w:r>
+          </w:p>
+        </w:tc>
+        <w:tc>
+          <w:tcPr>
+            <w:tcW w:type="dxa" w:w="5638"/>
+            <w:tcBorders>
+              <w:top w:val="single" w:color="BFC9D6" w:sz="4"/>
+              <w:left w:val="single" w:color="BFC9D6" w:sz="4"/>
+              <w:bottom w:val="single" w:color="BFC9D6" w:sz="4"/>
+              <w:right w:val="single" w:color="BFC9D6" w:sz="4"/>
+            </w:tcBorders>
+            <w:tcMar>
+              <w:top w:type="dxa" w:w="50"/>
+              <w:left w:type="dxa" w:w="90"/>
+              <w:bottom w:type="dxa" w:w="50"/>
+              <w:right w:type="dxa" w:w="90"/>
+            </w:tcMar>
+            <w:vAlign w:val="top"/>
+          </w:tcPr>
+          <w:p>
+            <w:pPr>
+              <w:keepNext w:val="false"/>
+              <w:bidi/>
+              <w:spacing w:after="30" w:before="30" w:line="264"/>
+            </w:pPr>
+            <w:r>
+              <w:rPr>
+                <w:rFonts w:ascii="Arial" w:cs="Arial" w:eastAsia="Arial" w:hAnsi="Arial"/>
+                <w:b w:val="false"/>
+                <w:bCs w:val="false"/>
+                <w:sz w:val="18"/>
+                <w:szCs w:val="18"/>
+                <w:rtl/>
+              </w:rPr>
+              <w:t xml:space="preserve">tools/ci/db_ci.sh:61-100</w:t>
             </w:r>
           </w:p>
         </w:tc>
@@ -1703,7 +1703,7 @@
         </w:trPr>
         <w:tc>
           <w:tcPr>
-            <w:tcW w:type="dxa" w:w="1083"/>
+            <w:tcW w:type="dxa" w:w="985"/>
             <w:tcBorders>
               <w:top w:val="single" w:color="BFC9D6" w:sz="4"/>
               <w:left w:val="single" w:color="BFC9D6" w:sz="4"/>
@@ -1740,7 +1740,7 @@
         </w:tc>
         <w:tc>
           <w:tcPr>
-            <w:tcW w:type="dxa" w:w="3181"/>
+            <w:tcW w:type="dxa" w:w="3241"/>
             <w:tcBorders>
               <w:top w:val="single" w:color="BFC9D6" w:sz="4"/>
               <w:left w:val="single" w:color="BFC9D6" w:sz="4"/>
@@ -1771,13 +1771,37 @@
                 <w:szCs w:val="18"/>
                 <w:rtl/>
               </w:rPr>
-              <w:t xml:space="preserve">كل مفتاح أجنبي مفهرس أو موسوم noidx، وقواعد المنح R1-R10</w:t>
-            </w:r>
-          </w:p>
-        </w:tc>
-        <w:tc>
-          <w:tcPr>
-            <w:tcW w:type="dxa" w:w="5600"/>
+              <w:t xml:space="preserve">كل مفتاح أجنبي مفهرس أو موسوم noidx، وقواعد المنح R1-R11، و</w:t>
+            </w:r>
+            <w:r>
+              <w:rPr>
+                <w:rFonts w:ascii="Courier New" w:cs="Courier New" w:eastAsia="Courier New" w:hAnsi="Courier New"/>
+                <w:b w:val="false"/>
+                <w:bCs w:val="false"/>
+                <w:color w:val="1F2937"/>
+                <w:sz w:val="16"/>
+                <w:szCs w:val="16"/>
+                <w:shd w:fill="F1F3F5" w:color="auto" w:val="clear"/>
+                <w:rtl/>
+              </w:rPr>
+              <w:t xml:space="preserve">‎check_review_fixes.py‎</w:t>
+            </w:r>
+            <w:r>
+              <w:rPr>
+                <w:rFonts w:ascii="Arial" w:cs="Arial" w:eastAsia="Arial" w:hAnsi="Arial"/>
+                <w:b w:val="false"/>
+                <w:bCs w:val="false"/>
+                <w:sz w:val="18"/>
+                <w:szCs w:val="18"/>
+                <w:rtl/>
+              </w:rPr>
+              <w:t xml:space="preserve">، والحزمة NTF.BASE، وحالات الضغط الائتماني، ولا ثقة بالشهادة افتراضيًا ولا أوامر sqlcmd خطرة، وصورة CI مقابل versions.json</w:t>
+            </w:r>
+          </w:p>
+        </w:tc>
+        <w:tc>
+          <w:tcPr>
+            <w:tcW w:type="dxa" w:w="5638"/>
             <w:tcBorders>
               <w:top w:val="single" w:color="BFC9D6" w:sz="4"/>
               <w:left w:val="single" w:color="BFC9D6" w:sz="4"/>
@@ -1808,7 +1832,7 @@
                 <w:szCs w:val="18"/>
                 <w:rtl/>
               </w:rPr>
-              <w:t xml:space="preserve">tools/ci/db_ci.sh:47-49</w:t>
+              <w:t xml:space="preserve">tools/ci/db_ci.sh:102-147</w:t>
             </w:r>
           </w:p>
         </w:tc>
@@ -1819,7 +1843,7 @@
         </w:trPr>
         <w:tc>
           <w:tcPr>
-            <w:tcW w:type="dxa" w:w="1083"/>
+            <w:tcW w:type="dxa" w:w="985"/>
             <w:tcBorders>
               <w:top w:val="single" w:color="BFC9D6" w:sz="4"/>
               <w:left w:val="single" w:color="BFC9D6" w:sz="4"/>
@@ -1855,73 +1879,73 @@
         </w:tc>
         <w:tc>
           <w:tcPr>
-            <w:tcW w:type="dxa" w:w="3181"/>
-            <w:tcBorders>
-              <w:top w:val="single" w:color="BFC9D6" w:sz="4"/>
-              <w:left w:val="single" w:color="BFC9D6" w:sz="4"/>
-              <w:bottom w:val="single" w:color="BFC9D6" w:sz="4"/>
-              <w:right w:val="single" w:color="BFC9D6" w:sz="4"/>
-            </w:tcBorders>
-            <w:tcMar>
-              <w:top w:type="dxa" w:w="50"/>
-              <w:left w:type="dxa" w:w="90"/>
-              <w:bottom w:type="dxa" w:w="50"/>
-              <w:right w:type="dxa" w:w="90"/>
-            </w:tcMar>
-            <w:vAlign w:val="top"/>
-          </w:tcPr>
-          <w:p>
-            <w:pPr>
-              <w:keepNext w:val="false"/>
-              <w:bidi/>
-              <w:spacing w:after="30" w:before="30" w:line="264"/>
-            </w:pPr>
-            <w:r>
-              <w:rPr>
-                <w:rFonts w:ascii="Arial" w:cs="Arial" w:eastAsia="Arial" w:hAnsi="Arial"/>
-                <w:b w:val="false"/>
-                <w:bCs w:val="false"/>
-                <w:sz w:val="18"/>
-                <w:szCs w:val="18"/>
-                <w:rtl/>
-              </w:rPr>
-              <w:t xml:space="preserve">نشر db/deploy.sql على قاعدة جديدة عبر deploy.sh</w:t>
-            </w:r>
-          </w:p>
-        </w:tc>
-        <w:tc>
-          <w:tcPr>
-            <w:tcW w:type="dxa" w:w="5600"/>
-            <w:tcBorders>
-              <w:top w:val="single" w:color="BFC9D6" w:sz="4"/>
-              <w:left w:val="single" w:color="BFC9D6" w:sz="4"/>
-              <w:bottom w:val="single" w:color="BFC9D6" w:sz="4"/>
-              <w:right w:val="single" w:color="BFC9D6" w:sz="4"/>
-            </w:tcBorders>
-            <w:tcMar>
-              <w:top w:type="dxa" w:w="50"/>
-              <w:left w:type="dxa" w:w="90"/>
-              <w:bottom w:type="dxa" w:w="50"/>
-              <w:right w:type="dxa" w:w="90"/>
-            </w:tcMar>
-            <w:vAlign w:val="top"/>
-          </w:tcPr>
-          <w:p>
-            <w:pPr>
-              <w:keepNext w:val="false"/>
-              <w:bidi/>
-              <w:spacing w:after="30" w:before="30" w:line="264"/>
-            </w:pPr>
-            <w:r>
-              <w:rPr>
-                <w:rFonts w:ascii="Arial" w:cs="Arial" w:eastAsia="Arial" w:hAnsi="Arial"/>
-                <w:b w:val="false"/>
-                <w:bCs w:val="false"/>
-                <w:sz w:val="18"/>
-                <w:szCs w:val="18"/>
-                <w:rtl/>
-              </w:rPr>
-              <w:t xml:space="preserve">tools/ci/db_ci.sh:51-54</w:t>
+            <w:tcW w:type="dxa" w:w="3241"/>
+            <w:tcBorders>
+              <w:top w:val="single" w:color="BFC9D6" w:sz="4"/>
+              <w:left w:val="single" w:color="BFC9D6" w:sz="4"/>
+              <w:bottom w:val="single" w:color="BFC9D6" w:sz="4"/>
+              <w:right w:val="single" w:color="BFC9D6" w:sz="4"/>
+            </w:tcBorders>
+            <w:tcMar>
+              <w:top w:type="dxa" w:w="50"/>
+              <w:left w:type="dxa" w:w="90"/>
+              <w:bottom w:type="dxa" w:w="50"/>
+              <w:right w:type="dxa" w:w="90"/>
+            </w:tcMar>
+            <w:vAlign w:val="top"/>
+          </w:tcPr>
+          <w:p>
+            <w:pPr>
+              <w:keepNext w:val="false"/>
+              <w:bidi/>
+              <w:spacing w:after="30" w:before="30" w:line="264"/>
+            </w:pPr>
+            <w:r>
+              <w:rPr>
+                <w:rFonts w:ascii="Arial" w:cs="Arial" w:eastAsia="Arial" w:hAnsi="Arial"/>
+                <w:b w:val="false"/>
+                <w:bCs w:val="false"/>
+                <w:sz w:val="18"/>
+                <w:szCs w:val="18"/>
+                <w:rtl/>
+              </w:rPr>
+              <w:t xml:space="preserve">نشر db/deploy.sql على قاعدة جديدة عبر deploy.sh بحساب bankfas_migrator</w:t>
+            </w:r>
+          </w:p>
+        </w:tc>
+        <w:tc>
+          <w:tcPr>
+            <w:tcW w:type="dxa" w:w="5638"/>
+            <w:tcBorders>
+              <w:top w:val="single" w:color="BFC9D6" w:sz="4"/>
+              <w:left w:val="single" w:color="BFC9D6" w:sz="4"/>
+              <w:bottom w:val="single" w:color="BFC9D6" w:sz="4"/>
+              <w:right w:val="single" w:color="BFC9D6" w:sz="4"/>
+            </w:tcBorders>
+            <w:tcMar>
+              <w:top w:type="dxa" w:w="50"/>
+              <w:left w:type="dxa" w:w="90"/>
+              <w:bottom w:type="dxa" w:w="50"/>
+              <w:right w:type="dxa" w:w="90"/>
+            </w:tcMar>
+            <w:vAlign w:val="top"/>
+          </w:tcPr>
+          <w:p>
+            <w:pPr>
+              <w:keepNext w:val="false"/>
+              <w:bidi/>
+              <w:spacing w:after="30" w:before="30" w:line="264"/>
+            </w:pPr>
+            <w:r>
+              <w:rPr>
+                <w:rFonts w:ascii="Arial" w:cs="Arial" w:eastAsia="Arial" w:hAnsi="Arial"/>
+                <w:b w:val="false"/>
+                <w:bCs w:val="false"/>
+                <w:sz w:val="18"/>
+                <w:szCs w:val="18"/>
+                <w:rtl/>
+              </w:rPr>
+              <w:t xml:space="preserve">tools/ci/db_ci.sh:149-189</w:t>
             </w:r>
           </w:p>
         </w:tc>
@@ -1932,7 +1956,7 @@
         </w:trPr>
         <w:tc>
           <w:tcPr>
-            <w:tcW w:type="dxa" w:w="1083"/>
+            <w:tcW w:type="dxa" w:w="985"/>
             <w:tcBorders>
               <w:top w:val="single" w:color="BFC9D6" w:sz="4"/>
               <w:left w:val="single" w:color="BFC9D6" w:sz="4"/>
@@ -1963,13 +1987,13 @@
                 <w:szCs w:val="18"/>
                 <w:rtl/>
               </w:rPr>
-              <w:t xml:space="preserve">5</w:t>
-            </w:r>
-          </w:p>
-        </w:tc>
-        <w:tc>
-          <w:tcPr>
-            <w:tcW w:type="dxa" w:w="3181"/>
+              <w:t xml:space="preserve">4b</w:t>
+            </w:r>
+          </w:p>
+        </w:tc>
+        <w:tc>
+          <w:tcPr>
+            <w:tcW w:type="dxa" w:w="3241"/>
             <w:tcBorders>
               <w:top w:val="single" w:color="BFC9D6" w:sz="4"/>
               <w:left w:val="single" w:color="BFC9D6" w:sz="4"/>
@@ -2000,13 +2024,13 @@
                 <w:szCs w:val="18"/>
                 <w:rtl/>
               </w:rPr>
-              <w:t xml:space="preserve">مطابقة الكائنات المنشورة مع DDL المولَّد</w:t>
-            </w:r>
-          </w:p>
-        </w:tc>
-        <w:tc>
-          <w:tcPr>
-            <w:tcW w:type="dxa" w:w="5600"/>
+              <w:t xml:space="preserve">البذر العالمي كامل ويُعاد بلا تغيير، والنص العربي كما كُتب</w:t>
+            </w:r>
+          </w:p>
+        </w:tc>
+        <w:tc>
+          <w:tcPr>
+            <w:tcW w:type="dxa" w:w="5638"/>
             <w:tcBorders>
               <w:top w:val="single" w:color="BFC9D6" w:sz="4"/>
               <w:left w:val="single" w:color="BFC9D6" w:sz="4"/>
@@ -2037,7 +2061,7 @@
                 <w:szCs w:val="18"/>
                 <w:rtl/>
               </w:rPr>
-              <w:t xml:space="preserve">tools/ci/db_ci.sh:56-57</w:t>
+              <w:t xml:space="preserve">tools/ci/db_ci.sh:191-223</w:t>
             </w:r>
           </w:p>
         </w:tc>
@@ -2048,109 +2072,109 @@
         </w:trPr>
         <w:tc>
           <w:tcPr>
-            <w:tcW w:type="dxa" w:w="1083"/>
-            <w:tcBorders>
-              <w:top w:val="single" w:color="BFC9D6" w:sz="4"/>
-              <w:left w:val="single" w:color="BFC9D6" w:sz="4"/>
-              <w:bottom w:val="single" w:color="BFC9D6" w:sz="4"/>
-              <w:right w:val="single" w:color="BFC9D6" w:sz="4"/>
-            </w:tcBorders>
-            <w:tcMar>
-              <w:top w:type="dxa" w:w="50"/>
-              <w:left w:type="dxa" w:w="90"/>
-              <w:bottom w:type="dxa" w:w="50"/>
-              <w:right w:type="dxa" w:w="90"/>
-            </w:tcMar>
-            <w:vAlign w:val="top"/>
-          </w:tcPr>
-          <w:p>
-            <w:pPr>
-              <w:keepNext w:val="false"/>
-              <w:bidi/>
-              <w:spacing w:after="30" w:before="30" w:line="264"/>
-            </w:pPr>
-            <w:r>
-              <w:rPr>
-                <w:rFonts w:ascii="Arial" w:cs="Arial" w:eastAsia="Arial" w:hAnsi="Arial"/>
-                <w:b w:val="false"/>
-                <w:bCs w:val="false"/>
-                <w:sz w:val="18"/>
-                <w:szCs w:val="18"/>
-                <w:rtl/>
-              </w:rPr>
-              <w:t xml:space="preserve">6</w:t>
-            </w:r>
-          </w:p>
-        </w:tc>
-        <w:tc>
-          <w:tcPr>
-            <w:tcW w:type="dxa" w:w="3181"/>
-            <w:tcBorders>
-              <w:top w:val="single" w:color="BFC9D6" w:sz="4"/>
-              <w:left w:val="single" w:color="BFC9D6" w:sz="4"/>
-              <w:bottom w:val="single" w:color="BFC9D6" w:sz="4"/>
-              <w:right w:val="single" w:color="BFC9D6" w:sz="4"/>
-            </w:tcBorders>
-            <w:tcMar>
-              <w:top w:type="dxa" w:w="50"/>
-              <w:left w:type="dxa" w:w="90"/>
-              <w:bottom w:type="dxa" w:w="50"/>
-              <w:right w:type="dxa" w:w="90"/>
-            </w:tcMar>
-            <w:vAlign w:val="top"/>
-          </w:tcPr>
-          <w:p>
-            <w:pPr>
-              <w:keepNext w:val="false"/>
-              <w:bidi/>
-              <w:spacing w:after="30" w:before="30" w:line="264"/>
-            </w:pPr>
-            <w:r>
-              <w:rPr>
-                <w:rFonts w:ascii="Arial" w:cs="Arial" w:eastAsia="Arial" w:hAnsi="Arial"/>
-                <w:b w:val="false"/>
-                <w:bCs w:val="false"/>
-                <w:sz w:val="18"/>
-                <w:szCs w:val="18"/>
-                <w:rtl/>
-              </w:rPr>
-              <w:t xml:space="preserve">اختبارات المشغّلات: 7 حالات PASS بالضبط (T1 إلى T6 وT2b)</w:t>
-            </w:r>
-          </w:p>
-        </w:tc>
-        <w:tc>
-          <w:tcPr>
-            <w:tcW w:type="dxa" w:w="5600"/>
-            <w:tcBorders>
-              <w:top w:val="single" w:color="BFC9D6" w:sz="4"/>
-              <w:left w:val="single" w:color="BFC9D6" w:sz="4"/>
-              <w:bottom w:val="single" w:color="BFC9D6" w:sz="4"/>
-              <w:right w:val="single" w:color="BFC9D6" w:sz="4"/>
-            </w:tcBorders>
-            <w:tcMar>
-              <w:top w:type="dxa" w:w="50"/>
-              <w:left w:type="dxa" w:w="90"/>
-              <w:bottom w:type="dxa" w:w="50"/>
-              <w:right w:type="dxa" w:w="90"/>
-            </w:tcMar>
-            <w:vAlign w:val="top"/>
-          </w:tcPr>
-          <w:p>
-            <w:pPr>
-              <w:keepNext w:val="false"/>
-              <w:bidi/>
-              <w:spacing w:after="30" w:before="30" w:line="264"/>
-            </w:pPr>
-            <w:r>
-              <w:rPr>
-                <w:rFonts w:ascii="Arial" w:cs="Arial" w:eastAsia="Arial" w:hAnsi="Arial"/>
-                <w:b w:val="false"/>
-                <w:bCs w:val="false"/>
-                <w:sz w:val="18"/>
-                <w:szCs w:val="18"/>
-                <w:rtl/>
-              </w:rPr>
-              <w:t xml:space="preserve">tools/ci/db_ci.sh</w:t>
+            <w:tcW w:type="dxa" w:w="985"/>
+            <w:tcBorders>
+              <w:top w:val="single" w:color="BFC9D6" w:sz="4"/>
+              <w:left w:val="single" w:color="BFC9D6" w:sz="4"/>
+              <w:bottom w:val="single" w:color="BFC9D6" w:sz="4"/>
+              <w:right w:val="single" w:color="BFC9D6" w:sz="4"/>
+            </w:tcBorders>
+            <w:tcMar>
+              <w:top w:type="dxa" w:w="50"/>
+              <w:left w:type="dxa" w:w="90"/>
+              <w:bottom w:type="dxa" w:w="50"/>
+              <w:right w:type="dxa" w:w="90"/>
+            </w:tcMar>
+            <w:vAlign w:val="top"/>
+          </w:tcPr>
+          <w:p>
+            <w:pPr>
+              <w:keepNext w:val="false"/>
+              <w:bidi/>
+              <w:spacing w:after="30" w:before="30" w:line="264"/>
+            </w:pPr>
+            <w:r>
+              <w:rPr>
+                <w:rFonts w:ascii="Arial" w:cs="Arial" w:eastAsia="Arial" w:hAnsi="Arial"/>
+                <w:b w:val="false"/>
+                <w:bCs w:val="false"/>
+                <w:sz w:val="18"/>
+                <w:szCs w:val="18"/>
+                <w:rtl/>
+              </w:rPr>
+              <w:t xml:space="preserve">5</w:t>
+            </w:r>
+          </w:p>
+        </w:tc>
+        <w:tc>
+          <w:tcPr>
+            <w:tcW w:type="dxa" w:w="3241"/>
+            <w:tcBorders>
+              <w:top w:val="single" w:color="BFC9D6" w:sz="4"/>
+              <w:left w:val="single" w:color="BFC9D6" w:sz="4"/>
+              <w:bottom w:val="single" w:color="BFC9D6" w:sz="4"/>
+              <w:right w:val="single" w:color="BFC9D6" w:sz="4"/>
+            </w:tcBorders>
+            <w:tcMar>
+              <w:top w:type="dxa" w:w="50"/>
+              <w:left w:type="dxa" w:w="90"/>
+              <w:bottom w:type="dxa" w:w="50"/>
+              <w:right w:type="dxa" w:w="90"/>
+            </w:tcMar>
+            <w:vAlign w:val="top"/>
+          </w:tcPr>
+          <w:p>
+            <w:pPr>
+              <w:keepNext w:val="false"/>
+              <w:bidi/>
+              <w:spacing w:after="30" w:before="30" w:line="264"/>
+            </w:pPr>
+            <w:r>
+              <w:rPr>
+                <w:rFonts w:ascii="Arial" w:cs="Arial" w:eastAsia="Arial" w:hAnsi="Arial"/>
+                <w:b w:val="false"/>
+                <w:bCs w:val="false"/>
+                <w:sz w:val="18"/>
+                <w:szCs w:val="18"/>
+                <w:rtl/>
+              </w:rPr>
+              <w:t xml:space="preserve">مطابقة الكائنات المنشورة مع DDL المولَّد والسكربتات الثابتة بحساب المراقبة</w:t>
+            </w:r>
+          </w:p>
+        </w:tc>
+        <w:tc>
+          <w:tcPr>
+            <w:tcW w:type="dxa" w:w="5638"/>
+            <w:tcBorders>
+              <w:top w:val="single" w:color="BFC9D6" w:sz="4"/>
+              <w:left w:val="single" w:color="BFC9D6" w:sz="4"/>
+              <w:bottom w:val="single" w:color="BFC9D6" w:sz="4"/>
+              <w:right w:val="single" w:color="BFC9D6" w:sz="4"/>
+            </w:tcBorders>
+            <w:tcMar>
+              <w:top w:type="dxa" w:w="50"/>
+              <w:left w:type="dxa" w:w="90"/>
+              <w:bottom w:type="dxa" w:w="50"/>
+              <w:right w:type="dxa" w:w="90"/>
+            </w:tcMar>
+            <w:vAlign w:val="top"/>
+          </w:tcPr>
+          <w:p>
+            <w:pPr>
+              <w:keepNext w:val="false"/>
+              <w:bidi/>
+              <w:spacing w:after="30" w:before="30" w:line="264"/>
+            </w:pPr>
+            <w:r>
+              <w:rPr>
+                <w:rFonts w:ascii="Arial" w:cs="Arial" w:eastAsia="Arial" w:hAnsi="Arial"/>
+                <w:b w:val="false"/>
+                <w:bCs w:val="false"/>
+                <w:sz w:val="18"/>
+                <w:szCs w:val="18"/>
+                <w:rtl/>
+              </w:rPr>
+              <w:t xml:space="preserve">tools/ci/db_ci.sh:225-227</w:t>
             </w:r>
           </w:p>
         </w:tc>
@@ -2161,7 +2185,7 @@
         </w:trPr>
         <w:tc>
           <w:tcPr>
-            <w:tcW w:type="dxa" w:w="1083"/>
+            <w:tcW w:type="dxa" w:w="985"/>
             <w:tcBorders>
               <w:top w:val="single" w:color="BFC9D6" w:sz="4"/>
               <w:left w:val="single" w:color="BFC9D6" w:sz="4"/>
@@ -2192,13 +2216,13 @@
                 <w:szCs w:val="18"/>
                 <w:rtl/>
               </w:rPr>
-              <w:t xml:space="preserve">7</w:t>
-            </w:r>
-          </w:p>
-        </w:tc>
-        <w:tc>
-          <w:tcPr>
-            <w:tcW w:type="dxa" w:w="3181"/>
+              <w:t xml:space="preserve">6</w:t>
+            </w:r>
+          </w:p>
+        </w:tc>
+        <w:tc>
+          <w:tcPr>
+            <w:tcW w:type="dxa" w:w="3241"/>
             <w:tcBorders>
               <w:top w:val="single" w:color="BFC9D6" w:sz="4"/>
               <w:left w:val="single" w:color="BFC9D6" w:sz="4"/>
@@ -2229,13 +2253,13 @@
                 <w:szCs w:val="18"/>
                 <w:rtl/>
               </w:rPr>
-              <w:t xml:space="preserve">اختبارات العزل: 48 حالة PASS بالضبط</w:t>
-            </w:r>
-          </w:p>
-        </w:tc>
-        <w:tc>
-          <w:tcPr>
-            <w:tcW w:type="dxa" w:w="5600"/>
+              <w:t xml:space="preserve">اختبارات المشغّلات: 7 حالات PASS بالضبط (T1 إلى T6 وT2b)</w:t>
+            </w:r>
+          </w:p>
+        </w:tc>
+        <w:tc>
+          <w:tcPr>
+            <w:tcW w:type="dxa" w:w="5638"/>
             <w:tcBorders>
               <w:top w:val="single" w:color="BFC9D6" w:sz="4"/>
               <w:left w:val="single" w:color="BFC9D6" w:sz="4"/>
@@ -2266,7 +2290,7 @@
                 <w:szCs w:val="18"/>
                 <w:rtl/>
               </w:rPr>
-              <w:t xml:space="preserve">tools/ci/db_ci.sh</w:t>
+              <w:t xml:space="preserve">tools/ci/db_ci.sh:229-245</w:t>
             </w:r>
           </w:p>
         </w:tc>
@@ -2277,109 +2301,109 @@
         </w:trPr>
         <w:tc>
           <w:tcPr>
-            <w:tcW w:type="dxa" w:w="1083"/>
-            <w:tcBorders>
-              <w:top w:val="single" w:color="BFC9D6" w:sz="4"/>
-              <w:left w:val="single" w:color="BFC9D6" w:sz="4"/>
-              <w:bottom w:val="single" w:color="BFC9D6" w:sz="4"/>
-              <w:right w:val="single" w:color="BFC9D6" w:sz="4"/>
-            </w:tcBorders>
-            <w:tcMar>
-              <w:top w:type="dxa" w:w="50"/>
-              <w:left w:type="dxa" w:w="90"/>
-              <w:bottom w:type="dxa" w:w="50"/>
-              <w:right w:type="dxa" w:w="90"/>
-            </w:tcMar>
-            <w:vAlign w:val="top"/>
-          </w:tcPr>
-          <w:p>
-            <w:pPr>
-              <w:keepNext w:val="false"/>
-              <w:bidi/>
-              <w:spacing w:after="30" w:before="30" w:line="264"/>
-            </w:pPr>
-            <w:r>
-              <w:rPr>
-                <w:rFonts w:ascii="Arial" w:cs="Arial" w:eastAsia="Arial" w:hAnsi="Arial"/>
-                <w:b w:val="false"/>
-                <w:bCs w:val="false"/>
-                <w:sz w:val="18"/>
-                <w:szCs w:val="18"/>
-                <w:rtl/>
-              </w:rPr>
-              <w:t xml:space="preserve">8 إلى 18</w:t>
-            </w:r>
-          </w:p>
-        </w:tc>
-        <w:tc>
-          <w:tcPr>
-            <w:tcW w:type="dxa" w:w="3181"/>
-            <w:tcBorders>
-              <w:top w:val="single" w:color="BFC9D6" w:sz="4"/>
-              <w:left w:val="single" w:color="BFC9D6" w:sz="4"/>
-              <w:bottom w:val="single" w:color="BFC9D6" w:sz="4"/>
-              <w:right w:val="single" w:color="BFC9D6" w:sz="4"/>
-            </w:tcBorders>
-            <w:tcMar>
-              <w:top w:type="dxa" w:w="50"/>
-              <w:left w:type="dxa" w:w="90"/>
-              <w:bottom w:type="dxa" w:w="50"/>
-              <w:right w:type="dxa" w:w="90"/>
-            </w:tcMar>
-            <w:vAlign w:val="top"/>
-          </w:tcPr>
-          <w:p>
-            <w:pPr>
-              <w:keepNext w:val="false"/>
-              <w:bidi/>
-              <w:spacing w:after="30" w:before="30" w:line="264"/>
-            </w:pPr>
-            <w:r>
-              <w:rPr>
-                <w:rFonts w:ascii="Arial" w:cs="Arial" w:eastAsia="Arial" w:hAnsi="Arial"/>
-                <w:b w:val="false"/>
-                <w:bCs w:val="false"/>
-                <w:sz w:val="18"/>
-                <w:szCs w:val="18"/>
-                <w:rtl/>
-              </w:rPr>
-              <w:t xml:space="preserve">أمن الحساب (20)، المشغّل والدعم (11)، ربط المهام (7، J1 إلى J7)، تهيئة المشترك (5)، الترقيم (8، ومع اتصالات متزامنة 2)، تاريخ KYC (4)، البيانات المرجعية (4)، التدقيق (7)، التصدير (7، X1 إلى X7)، دخولات الخدمة (6)</w:t>
-            </w:r>
-          </w:p>
-        </w:tc>
-        <w:tc>
-          <w:tcPr>
-            <w:tcW w:type="dxa" w:w="5600"/>
-            <w:tcBorders>
-              <w:top w:val="single" w:color="BFC9D6" w:sz="4"/>
-              <w:left w:val="single" w:color="BFC9D6" w:sz="4"/>
-              <w:bottom w:val="single" w:color="BFC9D6" w:sz="4"/>
-              <w:right w:val="single" w:color="BFC9D6" w:sz="4"/>
-            </w:tcBorders>
-            <w:tcMar>
-              <w:top w:type="dxa" w:w="50"/>
-              <w:left w:type="dxa" w:w="90"/>
-              <w:bottom w:type="dxa" w:w="50"/>
-              <w:right w:type="dxa" w:w="90"/>
-            </w:tcMar>
-            <w:vAlign w:val="top"/>
-          </w:tcPr>
-          <w:p>
-            <w:pPr>
-              <w:keepNext w:val="false"/>
-              <w:bidi/>
-              <w:spacing w:after="30" w:before="30" w:line="264"/>
-            </w:pPr>
-            <w:r>
-              <w:rPr>
-                <w:rFonts w:ascii="Arial" w:cs="Arial" w:eastAsia="Arial" w:hAnsi="Arial"/>
-                <w:b w:val="false"/>
-                <w:bCs w:val="false"/>
-                <w:sz w:val="18"/>
-                <w:szCs w:val="18"/>
-                <w:rtl/>
-              </w:rPr>
-              <w:t xml:space="preserve">tools/ci/db_ci.sh</w:t>
+            <w:tcW w:type="dxa" w:w="985"/>
+            <w:tcBorders>
+              <w:top w:val="single" w:color="BFC9D6" w:sz="4"/>
+              <w:left w:val="single" w:color="BFC9D6" w:sz="4"/>
+              <w:bottom w:val="single" w:color="BFC9D6" w:sz="4"/>
+              <w:right w:val="single" w:color="BFC9D6" w:sz="4"/>
+            </w:tcBorders>
+            <w:tcMar>
+              <w:top w:type="dxa" w:w="50"/>
+              <w:left w:type="dxa" w:w="90"/>
+              <w:bottom w:type="dxa" w:w="50"/>
+              <w:right w:type="dxa" w:w="90"/>
+            </w:tcMar>
+            <w:vAlign w:val="top"/>
+          </w:tcPr>
+          <w:p>
+            <w:pPr>
+              <w:keepNext w:val="false"/>
+              <w:bidi/>
+              <w:spacing w:after="30" w:before="30" w:line="264"/>
+            </w:pPr>
+            <w:r>
+              <w:rPr>
+                <w:rFonts w:ascii="Arial" w:cs="Arial" w:eastAsia="Arial" w:hAnsi="Arial"/>
+                <w:b w:val="false"/>
+                <w:bCs w:val="false"/>
+                <w:sz w:val="18"/>
+                <w:szCs w:val="18"/>
+                <w:rtl/>
+              </w:rPr>
+              <w:t xml:space="preserve">7</w:t>
+            </w:r>
+          </w:p>
+        </w:tc>
+        <w:tc>
+          <w:tcPr>
+            <w:tcW w:type="dxa" w:w="3241"/>
+            <w:tcBorders>
+              <w:top w:val="single" w:color="BFC9D6" w:sz="4"/>
+              <w:left w:val="single" w:color="BFC9D6" w:sz="4"/>
+              <w:bottom w:val="single" w:color="BFC9D6" w:sz="4"/>
+              <w:right w:val="single" w:color="BFC9D6" w:sz="4"/>
+            </w:tcBorders>
+            <w:tcMar>
+              <w:top w:type="dxa" w:w="50"/>
+              <w:left w:type="dxa" w:w="90"/>
+              <w:bottom w:type="dxa" w:w="50"/>
+              <w:right w:type="dxa" w:w="90"/>
+            </w:tcMar>
+            <w:vAlign w:val="top"/>
+          </w:tcPr>
+          <w:p>
+            <w:pPr>
+              <w:keepNext w:val="false"/>
+              <w:bidi/>
+              <w:spacing w:after="30" w:before="30" w:line="264"/>
+            </w:pPr>
+            <w:r>
+              <w:rPr>
+                <w:rFonts w:ascii="Arial" w:cs="Arial" w:eastAsia="Arial" w:hAnsi="Arial"/>
+                <w:b w:val="false"/>
+                <w:bCs w:val="false"/>
+                <w:sz w:val="18"/>
+                <w:szCs w:val="18"/>
+                <w:rtl/>
+              </w:rPr>
+              <w:t xml:space="preserve">اختبارات العزل: 48 حالة PASS بالضبط</w:t>
+            </w:r>
+          </w:p>
+        </w:tc>
+        <w:tc>
+          <w:tcPr>
+            <w:tcW w:type="dxa" w:w="5638"/>
+            <w:tcBorders>
+              <w:top w:val="single" w:color="BFC9D6" w:sz="4"/>
+              <w:left w:val="single" w:color="BFC9D6" w:sz="4"/>
+              <w:bottom w:val="single" w:color="BFC9D6" w:sz="4"/>
+              <w:right w:val="single" w:color="BFC9D6" w:sz="4"/>
+            </w:tcBorders>
+            <w:tcMar>
+              <w:top w:type="dxa" w:w="50"/>
+              <w:left w:type="dxa" w:w="90"/>
+              <w:bottom w:type="dxa" w:w="50"/>
+              <w:right w:type="dxa" w:w="90"/>
+            </w:tcMar>
+            <w:vAlign w:val="top"/>
+          </w:tcPr>
+          <w:p>
+            <w:pPr>
+              <w:keepNext w:val="false"/>
+              <w:bidi/>
+              <w:spacing w:after="30" w:before="30" w:line="264"/>
+            </w:pPr>
+            <w:r>
+              <w:rPr>
+                <w:rFonts w:ascii="Arial" w:cs="Arial" w:eastAsia="Arial" w:hAnsi="Arial"/>
+                <w:b w:val="false"/>
+                <w:bCs w:val="false"/>
+                <w:sz w:val="18"/>
+                <w:szCs w:val="18"/>
+                <w:rtl/>
+              </w:rPr>
+              <w:t xml:space="preserve">tools/ci/db_ci.sh:246-264</w:t>
             </w:r>
           </w:p>
         </w:tc>
@@ -2390,7 +2414,7 @@
         </w:trPr>
         <w:tc>
           <w:tcPr>
-            <w:tcW w:type="dxa" w:w="1083"/>
+            <w:tcW w:type="dxa" w:w="985"/>
             <w:tcBorders>
               <w:top w:val="single" w:color="BFC9D6" w:sz="4"/>
               <w:left w:val="single" w:color="BFC9D6" w:sz="4"/>
@@ -2421,13 +2445,13 @@
                 <w:szCs w:val="18"/>
                 <w:rtl/>
               </w:rPr>
-              <w:t xml:space="preserve">19</w:t>
-            </w:r>
-          </w:p>
-        </w:tc>
-        <w:tc>
-          <w:tcPr>
-            <w:tcW w:type="dxa" w:w="3181"/>
+              <w:t xml:space="preserve">8 إلى 18</w:t>
+            </w:r>
+          </w:p>
+        </w:tc>
+        <w:tc>
+          <w:tcPr>
+            <w:tcW w:type="dxa" w:w="3241"/>
             <w:tcBorders>
               <w:top w:val="single" w:color="BFC9D6" w:sz="4"/>
               <w:left w:val="single" w:color="BFC9D6" w:sz="4"/>
@@ -2458,13 +2482,13 @@
                 <w:szCs w:val="18"/>
                 <w:rtl/>
               </w:rPr>
-              <w:t xml:space="preserve">إصلاحات المراجعة: RF1 إلى RF34 وSR1 إلى SR9 (43)</w:t>
-            </w:r>
-          </w:p>
-        </w:tc>
-        <w:tc>
-          <w:tcPr>
-            <w:tcW w:type="dxa" w:w="5600"/>
+              <w:t xml:space="preserve">أمن الحساب (20)، المشغّل والدعم (11)، ربط المهام (7، J1 إلى J7)، تهيئة المشترك (5)، الترقيم (8، ومع اتصالات متزامنة 2)، تاريخ KYC (4)، البيانات المرجعية (4)، التدقيق (7)، التصدير (7، X1 إلى X7)، دخولات الخدمة (6)</w:t>
+            </w:r>
+          </w:p>
+        </w:tc>
+        <w:tc>
+          <w:tcPr>
+            <w:tcW w:type="dxa" w:w="5638"/>
             <w:tcBorders>
               <w:top w:val="single" w:color="BFC9D6" w:sz="4"/>
               <w:left w:val="single" w:color="BFC9D6" w:sz="4"/>
@@ -2495,7 +2519,7 @@
                 <w:szCs w:val="18"/>
                 <w:rtl/>
               </w:rPr>
-              <w:t xml:space="preserve">db/tests/review_fixes_tests.sql</w:t>
+              <w:t xml:space="preserve">tools/ci/db_ci.sh:265-467</w:t>
             </w:r>
           </w:p>
         </w:tc>
@@ -2506,109 +2530,109 @@
         </w:trPr>
         <w:tc>
           <w:tcPr>
-            <w:tcW w:type="dxa" w:w="1083"/>
-            <w:tcBorders>
-              <w:top w:val="single" w:color="BFC9D6" w:sz="4"/>
-              <w:left w:val="single" w:color="BFC9D6" w:sz="4"/>
-              <w:bottom w:val="single" w:color="BFC9D6" w:sz="4"/>
-              <w:right w:val="single" w:color="BFC9D6" w:sz="4"/>
-            </w:tcBorders>
-            <w:tcMar>
-              <w:top w:type="dxa" w:w="50"/>
-              <w:left w:type="dxa" w:w="90"/>
-              <w:bottom w:type="dxa" w:w="50"/>
-              <w:right w:type="dxa" w:w="90"/>
-            </w:tcMar>
-            <w:vAlign w:val="top"/>
-          </w:tcPr>
-          <w:p>
-            <w:pPr>
-              <w:keepNext w:val="false"/>
-              <w:bidi/>
-              <w:spacing w:after="30" w:before="30" w:line="264"/>
-            </w:pPr>
-            <w:r>
-              <w:rPr>
-                <w:rFonts w:ascii="Arial" w:cs="Arial" w:eastAsia="Arial" w:hAnsi="Arial"/>
-                <w:b w:val="false"/>
-                <w:bCs w:val="false"/>
-                <w:sz w:val="18"/>
-                <w:szCs w:val="18"/>
-                <w:rtl/>
-              </w:rPr>
-              <w:t xml:space="preserve">20 إلى 22</w:t>
-            </w:r>
-          </w:p>
-        </w:tc>
-        <w:tc>
-          <w:tcPr>
-            <w:tcW w:type="dxa" w:w="3181"/>
-            <w:tcBorders>
-              <w:top w:val="single" w:color="BFC9D6" w:sz="4"/>
-              <w:left w:val="single" w:color="BFC9D6" w:sz="4"/>
-              <w:bottom w:val="single" w:color="BFC9D6" w:sz="4"/>
-              <w:right w:val="single" w:color="BFC9D6" w:sz="4"/>
-            </w:tcBorders>
-            <w:tcMar>
-              <w:top w:type="dxa" w:w="50"/>
-              <w:left w:type="dxa" w:w="90"/>
-              <w:bottom w:type="dxa" w:w="50"/>
-              <w:right w:type="dxa" w:w="90"/>
-            </w:tcMar>
-            <w:vAlign w:val="top"/>
-          </w:tcPr>
-          <w:p>
-            <w:pPr>
-              <w:keepNext w:val="false"/>
-              <w:bidi/>
-              <w:spacing w:after="30" w:before="30" w:line="264"/>
-            </w:pPr>
-            <w:r>
-              <w:rPr>
-                <w:rFonts w:ascii="Arial" w:cs="Arial" w:eastAsia="Arial" w:hAnsi="Arial"/>
-                <w:b w:val="false"/>
-                <w:bCs w:val="false"/>
-                <w:sz w:val="18"/>
-                <w:szCs w:val="18"/>
-                <w:rtl/>
-              </w:rPr>
-              <w:t xml:space="preserve">SQL Server Audit (SA1 إلى SA9)، دخول المراقبة (MN1 إلى MN6)، فحوص ما قبل النشر (PF1 إلى PF8)</w:t>
-            </w:r>
-          </w:p>
-        </w:tc>
-        <w:tc>
-          <w:tcPr>
-            <w:tcW w:type="dxa" w:w="5600"/>
-            <w:tcBorders>
-              <w:top w:val="single" w:color="BFC9D6" w:sz="4"/>
-              <w:left w:val="single" w:color="BFC9D6" w:sz="4"/>
-              <w:bottom w:val="single" w:color="BFC9D6" w:sz="4"/>
-              <w:right w:val="single" w:color="BFC9D6" w:sz="4"/>
-            </w:tcBorders>
-            <w:tcMar>
-              <w:top w:type="dxa" w:w="50"/>
-              <w:left w:type="dxa" w:w="90"/>
-              <w:bottom w:type="dxa" w:w="50"/>
-              <w:right w:type="dxa" w:w="90"/>
-            </w:tcMar>
-            <w:vAlign w:val="top"/>
-          </w:tcPr>
-          <w:p>
-            <w:pPr>
-              <w:keepNext w:val="false"/>
-              <w:bidi/>
-              <w:spacing w:after="30" w:before="30" w:line="264"/>
-            </w:pPr>
-            <w:r>
-              <w:rPr>
-                <w:rFonts w:ascii="Arial" w:cs="Arial" w:eastAsia="Arial" w:hAnsi="Arial"/>
-                <w:b w:val="false"/>
-                <w:bCs w:val="false"/>
-                <w:sz w:val="18"/>
-                <w:szCs w:val="18"/>
-                <w:rtl/>
-              </w:rPr>
-              <w:t xml:space="preserve">tools/ci/*_check.sh</w:t>
+            <w:tcW w:type="dxa" w:w="985"/>
+            <w:tcBorders>
+              <w:top w:val="single" w:color="BFC9D6" w:sz="4"/>
+              <w:left w:val="single" w:color="BFC9D6" w:sz="4"/>
+              <w:bottom w:val="single" w:color="BFC9D6" w:sz="4"/>
+              <w:right w:val="single" w:color="BFC9D6" w:sz="4"/>
+            </w:tcBorders>
+            <w:tcMar>
+              <w:top w:type="dxa" w:w="50"/>
+              <w:left w:type="dxa" w:w="90"/>
+              <w:bottom w:type="dxa" w:w="50"/>
+              <w:right w:type="dxa" w:w="90"/>
+            </w:tcMar>
+            <w:vAlign w:val="top"/>
+          </w:tcPr>
+          <w:p>
+            <w:pPr>
+              <w:keepNext w:val="false"/>
+              <w:bidi/>
+              <w:spacing w:after="30" w:before="30" w:line="264"/>
+            </w:pPr>
+            <w:r>
+              <w:rPr>
+                <w:rFonts w:ascii="Arial" w:cs="Arial" w:eastAsia="Arial" w:hAnsi="Arial"/>
+                <w:b w:val="false"/>
+                <w:bCs w:val="false"/>
+                <w:sz w:val="18"/>
+                <w:szCs w:val="18"/>
+                <w:rtl/>
+              </w:rPr>
+              <w:t xml:space="preserve">19</w:t>
+            </w:r>
+          </w:p>
+        </w:tc>
+        <w:tc>
+          <w:tcPr>
+            <w:tcW w:type="dxa" w:w="3241"/>
+            <w:tcBorders>
+              <w:top w:val="single" w:color="BFC9D6" w:sz="4"/>
+              <w:left w:val="single" w:color="BFC9D6" w:sz="4"/>
+              <w:bottom w:val="single" w:color="BFC9D6" w:sz="4"/>
+              <w:right w:val="single" w:color="BFC9D6" w:sz="4"/>
+            </w:tcBorders>
+            <w:tcMar>
+              <w:top w:type="dxa" w:w="50"/>
+              <w:left w:type="dxa" w:w="90"/>
+              <w:bottom w:type="dxa" w:w="50"/>
+              <w:right w:type="dxa" w:w="90"/>
+            </w:tcMar>
+            <w:vAlign w:val="top"/>
+          </w:tcPr>
+          <w:p>
+            <w:pPr>
+              <w:keepNext w:val="false"/>
+              <w:bidi/>
+              <w:spacing w:after="30" w:before="30" w:line="264"/>
+            </w:pPr>
+            <w:r>
+              <w:rPr>
+                <w:rFonts w:ascii="Arial" w:cs="Arial" w:eastAsia="Arial" w:hAnsi="Arial"/>
+                <w:b w:val="false"/>
+                <w:bCs w:val="false"/>
+                <w:sz w:val="18"/>
+                <w:szCs w:val="18"/>
+                <w:rtl/>
+              </w:rPr>
+              <w:t xml:space="preserve">إصلاحات المراجعة: RF1 إلى RF34 وSR1 إلى SR9 (43)</w:t>
+            </w:r>
+          </w:p>
+        </w:tc>
+        <w:tc>
+          <w:tcPr>
+            <w:tcW w:type="dxa" w:w="5638"/>
+            <w:tcBorders>
+              <w:top w:val="single" w:color="BFC9D6" w:sz="4"/>
+              <w:left w:val="single" w:color="BFC9D6" w:sz="4"/>
+              <w:bottom w:val="single" w:color="BFC9D6" w:sz="4"/>
+              <w:right w:val="single" w:color="BFC9D6" w:sz="4"/>
+            </w:tcBorders>
+            <w:tcMar>
+              <w:top w:type="dxa" w:w="50"/>
+              <w:left w:type="dxa" w:w="90"/>
+              <w:bottom w:type="dxa" w:w="50"/>
+              <w:right w:type="dxa" w:w="90"/>
+            </w:tcMar>
+            <w:vAlign w:val="top"/>
+          </w:tcPr>
+          <w:p>
+            <w:pPr>
+              <w:keepNext w:val="false"/>
+              <w:bidi/>
+              <w:spacing w:after="30" w:before="30" w:line="264"/>
+            </w:pPr>
+            <w:r>
+              <w:rPr>
+                <w:rFonts w:ascii="Arial" w:cs="Arial" w:eastAsia="Arial" w:hAnsi="Arial"/>
+                <w:b w:val="false"/>
+                <w:bCs w:val="false"/>
+                <w:sz w:val="18"/>
+                <w:szCs w:val="18"/>
+                <w:rtl/>
+              </w:rPr>
+              <w:t xml:space="preserve">db/tests/review_fixes_tests.sql؛ tools/ci/db_ci.sh:468-491</w:t>
             </w:r>
           </w:p>
         </w:tc>
@@ -2619,7 +2643,7 @@
         </w:trPr>
         <w:tc>
           <w:tcPr>
-            <w:tcW w:type="dxa" w:w="1083"/>
+            <w:tcW w:type="dxa" w:w="985"/>
             <w:tcBorders>
               <w:top w:val="single" w:color="BFC9D6" w:sz="4"/>
               <w:left w:val="single" w:color="BFC9D6" w:sz="4"/>
@@ -2650,13 +2674,1121 @@
                 <w:szCs w:val="18"/>
                 <w:rtl/>
               </w:rPr>
+              <w:t xml:space="preserve">19b</w:t>
+            </w:r>
+          </w:p>
+        </w:tc>
+        <w:tc>
+          <w:tcPr>
+            <w:tcW w:type="dxa" w:w="3241"/>
+            <w:tcBorders>
+              <w:top w:val="single" w:color="BFC9D6" w:sz="4"/>
+              <w:left w:val="single" w:color="BFC9D6" w:sz="4"/>
+              <w:bottom w:val="single" w:color="BFC9D6" w:sz="4"/>
+              <w:right w:val="single" w:color="BFC9D6" w:sz="4"/>
+            </w:tcBorders>
+            <w:shd w:fill="F5F8FC" w:color="auto" w:val="clear"/>
+            <w:tcMar>
+              <w:top w:type="dxa" w:w="50"/>
+              <w:left w:type="dxa" w:w="90"/>
+              <w:bottom w:type="dxa" w:w="50"/>
+              <w:right w:type="dxa" w:w="90"/>
+            </w:tcMar>
+            <w:vAlign w:val="top"/>
+          </w:tcPr>
+          <w:p>
+            <w:pPr>
+              <w:keepNext w:val="false"/>
+              <w:bidi/>
+              <w:spacing w:after="30" w:before="30" w:line="264"/>
+            </w:pPr>
+            <w:r>
+              <w:rPr>
+                <w:rFonts w:ascii="Arial" w:cs="Arial" w:eastAsia="Arial" w:hAnsi="Arial"/>
+                <w:b w:val="false"/>
+                <w:bCs w:val="false"/>
+                <w:sz w:val="18"/>
+                <w:szCs w:val="18"/>
+                <w:rtl/>
+              </w:rPr>
+              <w:t xml:space="preserve">القوائم المالية: FS1 إلى FS11 (11)</w:t>
+            </w:r>
+          </w:p>
+        </w:tc>
+        <w:tc>
+          <w:tcPr>
+            <w:tcW w:type="dxa" w:w="5638"/>
+            <w:tcBorders>
+              <w:top w:val="single" w:color="BFC9D6" w:sz="4"/>
+              <w:left w:val="single" w:color="BFC9D6" w:sz="4"/>
+              <w:bottom w:val="single" w:color="BFC9D6" w:sz="4"/>
+              <w:right w:val="single" w:color="BFC9D6" w:sz="4"/>
+            </w:tcBorders>
+            <w:shd w:fill="F5F8FC" w:color="auto" w:val="clear"/>
+            <w:tcMar>
+              <w:top w:type="dxa" w:w="50"/>
+              <w:left w:type="dxa" w:w="90"/>
+              <w:bottom w:type="dxa" w:w="50"/>
+              <w:right w:type="dxa" w:w="90"/>
+            </w:tcMar>
+            <w:vAlign w:val="top"/>
+          </w:tcPr>
+          <w:p>
+            <w:pPr>
+              <w:keepNext w:val="false"/>
+              <w:bidi/>
+              <w:spacing w:after="30" w:before="30" w:line="264"/>
+            </w:pPr>
+            <w:r>
+              <w:rPr>
+                <w:rFonts w:ascii="Arial" w:cs="Arial" w:eastAsia="Arial" w:hAnsi="Arial"/>
+                <w:b w:val="false"/>
+                <w:bCs w:val="false"/>
+                <w:sz w:val="18"/>
+                <w:szCs w:val="18"/>
+                <w:rtl/>
+              </w:rPr>
+              <w:t xml:space="preserve">db/tests/financial_statements_tests.sql؛ tools/ci/db_ci.sh:492-511</w:t>
+            </w:r>
+          </w:p>
+        </w:tc>
+      </w:tr>
+      <w:tr>
+        <w:trPr>
+          <w:cantSplit/>
+        </w:trPr>
+        <w:tc>
+          <w:tcPr>
+            <w:tcW w:type="dxa" w:w="985"/>
+            <w:tcBorders>
+              <w:top w:val="single" w:color="BFC9D6" w:sz="4"/>
+              <w:left w:val="single" w:color="BFC9D6" w:sz="4"/>
+              <w:bottom w:val="single" w:color="BFC9D6" w:sz="4"/>
+              <w:right w:val="single" w:color="BFC9D6" w:sz="4"/>
+            </w:tcBorders>
+            <w:tcMar>
+              <w:top w:type="dxa" w:w="50"/>
+              <w:left w:type="dxa" w:w="90"/>
+              <w:bottom w:type="dxa" w:w="50"/>
+              <w:right w:type="dxa" w:w="90"/>
+            </w:tcMar>
+            <w:vAlign w:val="top"/>
+          </w:tcPr>
+          <w:p>
+            <w:pPr>
+              <w:keepNext w:val="false"/>
+              <w:bidi/>
+              <w:spacing w:after="30" w:before="30" w:line="264"/>
+            </w:pPr>
+            <w:r>
+              <w:rPr>
+                <w:rFonts w:ascii="Arial" w:cs="Arial" w:eastAsia="Arial" w:hAnsi="Arial"/>
+                <w:b w:val="false"/>
+                <w:bCs w:val="false"/>
+                <w:sz w:val="18"/>
+                <w:szCs w:val="18"/>
+                <w:rtl/>
+              </w:rPr>
+              <w:t xml:space="preserve">19c</w:t>
+            </w:r>
+          </w:p>
+        </w:tc>
+        <w:tc>
+          <w:tcPr>
+            <w:tcW w:type="dxa" w:w="3241"/>
+            <w:tcBorders>
+              <w:top w:val="single" w:color="BFC9D6" w:sz="4"/>
+              <w:left w:val="single" w:color="BFC9D6" w:sz="4"/>
+              <w:bottom w:val="single" w:color="BFC9D6" w:sz="4"/>
+              <w:right w:val="single" w:color="BFC9D6" w:sz="4"/>
+            </w:tcBorders>
+            <w:tcMar>
+              <w:top w:type="dxa" w:w="50"/>
+              <w:left w:type="dxa" w:w="90"/>
+              <w:bottom w:type="dxa" w:w="50"/>
+              <w:right w:type="dxa" w:w="90"/>
+            </w:tcMar>
+            <w:vAlign w:val="top"/>
+          </w:tcPr>
+          <w:p>
+            <w:pPr>
+              <w:keepNext w:val="false"/>
+              <w:bidi/>
+              <w:spacing w:after="30" w:before="30" w:line="264"/>
+            </w:pPr>
+            <w:r>
+              <w:rPr>
+                <w:rFonts w:ascii="Arial" w:cs="Arial" w:eastAsia="Arial" w:hAnsi="Arial"/>
+                <w:b w:val="false"/>
+                <w:bCs w:val="false"/>
+                <w:sz w:val="18"/>
+                <w:szCs w:val="18"/>
+                <w:rtl/>
+              </w:rPr>
+              <w:t xml:space="preserve">التقييم الائتماني: CA1 إلى CA31 (31)</w:t>
+            </w:r>
+          </w:p>
+        </w:tc>
+        <w:tc>
+          <w:tcPr>
+            <w:tcW w:type="dxa" w:w="5638"/>
+            <w:tcBorders>
+              <w:top w:val="single" w:color="BFC9D6" w:sz="4"/>
+              <w:left w:val="single" w:color="BFC9D6" w:sz="4"/>
+              <w:bottom w:val="single" w:color="BFC9D6" w:sz="4"/>
+              <w:right w:val="single" w:color="BFC9D6" w:sz="4"/>
+            </w:tcBorders>
+            <w:tcMar>
+              <w:top w:type="dxa" w:w="50"/>
+              <w:left w:type="dxa" w:w="90"/>
+              <w:bottom w:type="dxa" w:w="50"/>
+              <w:right w:type="dxa" w:w="90"/>
+            </w:tcMar>
+            <w:vAlign w:val="top"/>
+          </w:tcPr>
+          <w:p>
+            <w:pPr>
+              <w:keepNext w:val="false"/>
+              <w:bidi/>
+              <w:spacing w:after="30" w:before="30" w:line="264"/>
+            </w:pPr>
+            <w:r>
+              <w:rPr>
+                <w:rFonts w:ascii="Arial" w:cs="Arial" w:eastAsia="Arial" w:hAnsi="Arial"/>
+                <w:b w:val="false"/>
+                <w:bCs w:val="false"/>
+                <w:sz w:val="18"/>
+                <w:szCs w:val="18"/>
+                <w:rtl/>
+              </w:rPr>
+              <w:t xml:space="preserve">db/tests/credit_assessment_tests.sql؛ tools/ci/db_ci.sh:512-541</w:t>
+            </w:r>
+          </w:p>
+        </w:tc>
+      </w:tr>
+      <w:tr>
+        <w:trPr>
+          <w:cantSplit/>
+        </w:trPr>
+        <w:tc>
+          <w:tcPr>
+            <w:tcW w:type="dxa" w:w="985"/>
+            <w:tcBorders>
+              <w:top w:val="single" w:color="BFC9D6" w:sz="4"/>
+              <w:left w:val="single" w:color="BFC9D6" w:sz="4"/>
+              <w:bottom w:val="single" w:color="BFC9D6" w:sz="4"/>
+              <w:right w:val="single" w:color="BFC9D6" w:sz="4"/>
+            </w:tcBorders>
+            <w:shd w:fill="F5F8FC" w:color="auto" w:val="clear"/>
+            <w:tcMar>
+              <w:top w:type="dxa" w:w="50"/>
+              <w:left w:type="dxa" w:w="90"/>
+              <w:bottom w:type="dxa" w:w="50"/>
+              <w:right w:type="dxa" w:w="90"/>
+            </w:tcMar>
+            <w:vAlign w:val="top"/>
+          </w:tcPr>
+          <w:p>
+            <w:pPr>
+              <w:keepNext w:val="false"/>
+              <w:bidi/>
+              <w:spacing w:after="30" w:before="30" w:line="264"/>
+            </w:pPr>
+            <w:r>
+              <w:rPr>
+                <w:rFonts w:ascii="Arial" w:cs="Arial" w:eastAsia="Arial" w:hAnsi="Arial"/>
+                <w:b w:val="false"/>
+                <w:bCs w:val="false"/>
+                <w:sz w:val="18"/>
+                <w:szCs w:val="18"/>
+                <w:rtl/>
+              </w:rPr>
+              <w:t xml:space="preserve">19d</w:t>
+            </w:r>
+          </w:p>
+        </w:tc>
+        <w:tc>
+          <w:tcPr>
+            <w:tcW w:type="dxa" w:w="3241"/>
+            <w:tcBorders>
+              <w:top w:val="single" w:color="BFC9D6" w:sz="4"/>
+              <w:left w:val="single" w:color="BFC9D6" w:sz="4"/>
+              <w:bottom w:val="single" w:color="BFC9D6" w:sz="4"/>
+              <w:right w:val="single" w:color="BFC9D6" w:sz="4"/>
+            </w:tcBorders>
+            <w:shd w:fill="F5F8FC" w:color="auto" w:val="clear"/>
+            <w:tcMar>
+              <w:top w:type="dxa" w:w="50"/>
+              <w:left w:type="dxa" w:w="90"/>
+              <w:bottom w:type="dxa" w:w="50"/>
+              <w:right w:type="dxa" w:w="90"/>
+            </w:tcMar>
+            <w:vAlign w:val="top"/>
+          </w:tcPr>
+          <w:p>
+            <w:pPr>
+              <w:keepNext w:val="false"/>
+              <w:bidi/>
+              <w:spacing w:after="30" w:before="30" w:line="264"/>
+            </w:pPr>
+            <w:r>
+              <w:rPr>
+                <w:rFonts w:ascii="Arial" w:cs="Arial" w:eastAsia="Arial" w:hAnsi="Arial"/>
+                <w:b w:val="false"/>
+                <w:bCs w:val="false"/>
+                <w:sz w:val="18"/>
+                <w:szCs w:val="18"/>
+                <w:rtl/>
+              </w:rPr>
+              <w:t xml:space="preserve">محرك T-SQL يطابق مرجع Python: CE وCV (148)</w:t>
+            </w:r>
+          </w:p>
+        </w:tc>
+        <w:tc>
+          <w:tcPr>
+            <w:tcW w:type="dxa" w:w="5638"/>
+            <w:tcBorders>
+              <w:top w:val="single" w:color="BFC9D6" w:sz="4"/>
+              <w:left w:val="single" w:color="BFC9D6" w:sz="4"/>
+              <w:bottom w:val="single" w:color="BFC9D6" w:sz="4"/>
+              <w:right w:val="single" w:color="BFC9D6" w:sz="4"/>
+            </w:tcBorders>
+            <w:shd w:fill="F5F8FC" w:color="auto" w:val="clear"/>
+            <w:tcMar>
+              <w:top w:type="dxa" w:w="50"/>
+              <w:left w:type="dxa" w:w="90"/>
+              <w:bottom w:type="dxa" w:w="50"/>
+              <w:right w:type="dxa" w:w="90"/>
+            </w:tcMar>
+            <w:vAlign w:val="top"/>
+          </w:tcPr>
+          <w:p>
+            <w:pPr>
+              <w:keepNext w:val="false"/>
+              <w:bidi/>
+              <w:spacing w:after="30" w:before="30" w:line="264"/>
+            </w:pPr>
+            <w:r>
+              <w:rPr>
+                <w:rFonts w:ascii="Arial" w:cs="Arial" w:eastAsia="Arial" w:hAnsi="Arial"/>
+                <w:b w:val="false"/>
+                <w:bCs w:val="false"/>
+                <w:sz w:val="18"/>
+                <w:szCs w:val="18"/>
+                <w:rtl/>
+              </w:rPr>
+              <w:t xml:space="preserve">db/tests/credit_engine_cases.sql؛ tools/ci/db_ci.sh:542-556</w:t>
+            </w:r>
+          </w:p>
+        </w:tc>
+      </w:tr>
+      <w:tr>
+        <w:trPr>
+          <w:cantSplit/>
+        </w:trPr>
+        <w:tc>
+          <w:tcPr>
+            <w:tcW w:type="dxa" w:w="985"/>
+            <w:tcBorders>
+              <w:top w:val="single" w:color="BFC9D6" w:sz="4"/>
+              <w:left w:val="single" w:color="BFC9D6" w:sz="4"/>
+              <w:bottom w:val="single" w:color="BFC9D6" w:sz="4"/>
+              <w:right w:val="single" w:color="BFC9D6" w:sz="4"/>
+            </w:tcBorders>
+            <w:tcMar>
+              <w:top w:type="dxa" w:w="50"/>
+              <w:left w:type="dxa" w:w="90"/>
+              <w:bottom w:type="dxa" w:w="50"/>
+              <w:right w:type="dxa" w:w="90"/>
+            </w:tcMar>
+            <w:vAlign w:val="top"/>
+          </w:tcPr>
+          <w:p>
+            <w:pPr>
+              <w:keepNext w:val="false"/>
+              <w:bidi/>
+              <w:spacing w:after="30" w:before="30" w:line="264"/>
+            </w:pPr>
+            <w:r>
+              <w:rPr>
+                <w:rFonts w:ascii="Arial" w:cs="Arial" w:eastAsia="Arial" w:hAnsi="Arial"/>
+                <w:b w:val="false"/>
+                <w:bCs w:val="false"/>
+                <w:sz w:val="18"/>
+                <w:szCs w:val="18"/>
+                <w:rtl/>
+              </w:rPr>
+              <w:t xml:space="preserve">20 إلى 22</w:t>
+            </w:r>
+          </w:p>
+        </w:tc>
+        <w:tc>
+          <w:tcPr>
+            <w:tcW w:type="dxa" w:w="3241"/>
+            <w:tcBorders>
+              <w:top w:val="single" w:color="BFC9D6" w:sz="4"/>
+              <w:left w:val="single" w:color="BFC9D6" w:sz="4"/>
+              <w:bottom w:val="single" w:color="BFC9D6" w:sz="4"/>
+              <w:right w:val="single" w:color="BFC9D6" w:sz="4"/>
+            </w:tcBorders>
+            <w:tcMar>
+              <w:top w:type="dxa" w:w="50"/>
+              <w:left w:type="dxa" w:w="90"/>
+              <w:bottom w:type="dxa" w:w="50"/>
+              <w:right w:type="dxa" w:w="90"/>
+            </w:tcMar>
+            <w:vAlign w:val="top"/>
+          </w:tcPr>
+          <w:p>
+            <w:pPr>
+              <w:keepNext w:val="false"/>
+              <w:bidi/>
+              <w:spacing w:after="30" w:before="30" w:line="264"/>
+            </w:pPr>
+            <w:r>
+              <w:rPr>
+                <w:rFonts w:ascii="Arial" w:cs="Arial" w:eastAsia="Arial" w:hAnsi="Arial"/>
+                <w:b w:val="false"/>
+                <w:bCs w:val="false"/>
+                <w:sz w:val="18"/>
+                <w:szCs w:val="18"/>
+                <w:rtl/>
+              </w:rPr>
+              <w:t xml:space="preserve">SQL Server Audit (SA1 إلى SA9)، دخول المراقبة (MN1 إلى MN6)، فحوص ما قبل النشر (PF1 إلى PF8)</w:t>
+            </w:r>
+          </w:p>
+        </w:tc>
+        <w:tc>
+          <w:tcPr>
+            <w:tcW w:type="dxa" w:w="5638"/>
+            <w:tcBorders>
+              <w:top w:val="single" w:color="BFC9D6" w:sz="4"/>
+              <w:left w:val="single" w:color="BFC9D6" w:sz="4"/>
+              <w:bottom w:val="single" w:color="BFC9D6" w:sz="4"/>
+              <w:right w:val="single" w:color="BFC9D6" w:sz="4"/>
+            </w:tcBorders>
+            <w:tcMar>
+              <w:top w:type="dxa" w:w="50"/>
+              <w:left w:type="dxa" w:w="90"/>
+              <w:bottom w:type="dxa" w:w="50"/>
+              <w:right w:type="dxa" w:w="90"/>
+            </w:tcMar>
+            <w:vAlign w:val="top"/>
+          </w:tcPr>
+          <w:p>
+            <w:pPr>
+              <w:keepNext w:val="false"/>
+              <w:bidi/>
+              <w:spacing w:after="30" w:before="30" w:line="264"/>
+            </w:pPr>
+            <w:r>
+              <w:rPr>
+                <w:rFonts w:ascii="Arial" w:cs="Arial" w:eastAsia="Arial" w:hAnsi="Arial"/>
+                <w:b w:val="false"/>
+                <w:bCs w:val="false"/>
+                <w:sz w:val="18"/>
+                <w:szCs w:val="18"/>
+                <w:rtl/>
+              </w:rPr>
+              <w:t xml:space="preserve">tools/ci/*_check.sh؛ tools/ci/db_ci.sh:557-619</w:t>
+            </w:r>
+          </w:p>
+        </w:tc>
+      </w:tr>
+      <w:tr>
+        <w:trPr>
+          <w:cantSplit/>
+        </w:trPr>
+        <w:tc>
+          <w:tcPr>
+            <w:tcW w:type="dxa" w:w="985"/>
+            <w:tcBorders>
+              <w:top w:val="single" w:color="BFC9D6" w:sz="4"/>
+              <w:left w:val="single" w:color="BFC9D6" w:sz="4"/>
+              <w:bottom w:val="single" w:color="BFC9D6" w:sz="4"/>
+              <w:right w:val="single" w:color="BFC9D6" w:sz="4"/>
+            </w:tcBorders>
+            <w:shd w:fill="F5F8FC" w:color="auto" w:val="clear"/>
+            <w:tcMar>
+              <w:top w:type="dxa" w:w="50"/>
+              <w:left w:type="dxa" w:w="90"/>
+              <w:bottom w:type="dxa" w:w="50"/>
+              <w:right w:type="dxa" w:w="90"/>
+            </w:tcMar>
+            <w:vAlign w:val="top"/>
+          </w:tcPr>
+          <w:p>
+            <w:pPr>
+              <w:keepNext w:val="false"/>
+              <w:bidi/>
+              <w:spacing w:after="30" w:before="30" w:line="264"/>
+            </w:pPr>
+            <w:r>
+              <w:rPr>
+                <w:rFonts w:ascii="Arial" w:cs="Arial" w:eastAsia="Arial" w:hAnsi="Arial"/>
+                <w:b w:val="false"/>
+                <w:bCs w:val="false"/>
+                <w:sz w:val="18"/>
+                <w:szCs w:val="18"/>
+                <w:rtl/>
+              </w:rPr>
+              <w:t xml:space="preserve">22b</w:t>
+            </w:r>
+          </w:p>
+        </w:tc>
+        <w:tc>
+          <w:tcPr>
+            <w:tcW w:type="dxa" w:w="3241"/>
+            <w:tcBorders>
+              <w:top w:val="single" w:color="BFC9D6" w:sz="4"/>
+              <w:left w:val="single" w:color="BFC9D6" w:sz="4"/>
+              <w:bottom w:val="single" w:color="BFC9D6" w:sz="4"/>
+              <w:right w:val="single" w:color="BFC9D6" w:sz="4"/>
+            </w:tcBorders>
+            <w:shd w:fill="F5F8FC" w:color="auto" w:val="clear"/>
+            <w:tcMar>
+              <w:top w:type="dxa" w:w="50"/>
+              <w:left w:type="dxa" w:w="90"/>
+              <w:bottom w:type="dxa" w:w="50"/>
+              <w:right w:type="dxa" w:w="90"/>
+            </w:tcMar>
+            <w:vAlign w:val="top"/>
+          </w:tcPr>
+          <w:p>
+            <w:pPr>
+              <w:keepNext w:val="false"/>
+              <w:bidi/>
+              <w:spacing w:after="30" w:before="30" w:line="264"/>
+            </w:pPr>
+            <w:r>
+              <w:rPr>
+                <w:rFonts w:ascii="Arial" w:cs="Arial" w:eastAsia="Arial" w:hAnsi="Arial"/>
+                <w:b w:val="false"/>
+                <w:bCs w:val="false"/>
+                <w:sz w:val="18"/>
+                <w:szCs w:val="18"/>
+                <w:rtl/>
+              </w:rPr>
+              <w:t xml:space="preserve">حارس المفاتيح وسلسلة التدقيق: KG1 إلى KG7 وAC1 إلى AC10 (17)</w:t>
+            </w:r>
+          </w:p>
+        </w:tc>
+        <w:tc>
+          <w:tcPr>
+            <w:tcW w:type="dxa" w:w="5638"/>
+            <w:tcBorders>
+              <w:top w:val="single" w:color="BFC9D6" w:sz="4"/>
+              <w:left w:val="single" w:color="BFC9D6" w:sz="4"/>
+              <w:bottom w:val="single" w:color="BFC9D6" w:sz="4"/>
+              <w:right w:val="single" w:color="BFC9D6" w:sz="4"/>
+            </w:tcBorders>
+            <w:shd w:fill="F5F8FC" w:color="auto" w:val="clear"/>
+            <w:tcMar>
+              <w:top w:type="dxa" w:w="50"/>
+              <w:left w:type="dxa" w:w="90"/>
+              <w:bottom w:type="dxa" w:w="50"/>
+              <w:right w:type="dxa" w:w="90"/>
+            </w:tcMar>
+            <w:vAlign w:val="top"/>
+          </w:tcPr>
+          <w:p>
+            <w:pPr>
+              <w:keepNext w:val="false"/>
+              <w:bidi/>
+              <w:spacing w:after="30" w:before="30" w:line="264"/>
+            </w:pPr>
+            <w:r>
+              <w:rPr>
+                <w:rFonts w:ascii="Arial" w:cs="Arial" w:eastAsia="Arial" w:hAnsi="Arial"/>
+                <w:b w:val="false"/>
+                <w:bCs w:val="false"/>
+                <w:sz w:val="18"/>
+                <w:szCs w:val="18"/>
+                <w:rtl/>
+              </w:rPr>
+              <w:t xml:space="preserve">db/tests/integrity_tests.sql؛ tools/ci/db_ci.sh:622-642</w:t>
+            </w:r>
+          </w:p>
+        </w:tc>
+      </w:tr>
+      <w:tr>
+        <w:trPr>
+          <w:cantSplit/>
+        </w:trPr>
+        <w:tc>
+          <w:tcPr>
+            <w:tcW w:type="dxa" w:w="985"/>
+            <w:tcBorders>
+              <w:top w:val="single" w:color="BFC9D6" w:sz="4"/>
+              <w:left w:val="single" w:color="BFC9D6" w:sz="4"/>
+              <w:bottom w:val="single" w:color="BFC9D6" w:sz="4"/>
+              <w:right w:val="single" w:color="BFC9D6" w:sz="4"/>
+            </w:tcBorders>
+            <w:tcMar>
+              <w:top w:type="dxa" w:w="50"/>
+              <w:left w:type="dxa" w:w="90"/>
+              <w:bottom w:type="dxa" w:w="50"/>
+              <w:right w:type="dxa" w:w="90"/>
+            </w:tcMar>
+            <w:vAlign w:val="top"/>
+          </w:tcPr>
+          <w:p>
+            <w:pPr>
+              <w:keepNext w:val="false"/>
+              <w:bidi/>
+              <w:spacing w:after="30" w:before="30" w:line="264"/>
+            </w:pPr>
+            <w:r>
+              <w:rPr>
+                <w:rFonts w:ascii="Arial" w:cs="Arial" w:eastAsia="Arial" w:hAnsi="Arial"/>
+                <w:b w:val="false"/>
+                <w:bCs w:val="false"/>
+                <w:sz w:val="18"/>
+                <w:szCs w:val="18"/>
+                <w:rtl/>
+              </w:rPr>
+              <w:t xml:space="preserve">22c</w:t>
+            </w:r>
+          </w:p>
+        </w:tc>
+        <w:tc>
+          <w:tcPr>
+            <w:tcW w:type="dxa" w:w="3241"/>
+            <w:tcBorders>
+              <w:top w:val="single" w:color="BFC9D6" w:sz="4"/>
+              <w:left w:val="single" w:color="BFC9D6" w:sz="4"/>
+              <w:bottom w:val="single" w:color="BFC9D6" w:sz="4"/>
+              <w:right w:val="single" w:color="BFC9D6" w:sz="4"/>
+            </w:tcBorders>
+            <w:tcMar>
+              <w:top w:type="dxa" w:w="50"/>
+              <w:left w:type="dxa" w:w="90"/>
+              <w:bottom w:type="dxa" w:w="50"/>
+              <w:right w:type="dxa" w:w="90"/>
+            </w:tcMar>
+            <w:vAlign w:val="top"/>
+          </w:tcPr>
+          <w:p>
+            <w:pPr>
+              <w:keepNext w:val="false"/>
+              <w:bidi/>
+              <w:spacing w:after="30" w:before="30" w:line="264"/>
+            </w:pPr>
+            <w:r>
+              <w:rPr>
+                <w:rFonts w:ascii="Arial" w:cs="Arial" w:eastAsia="Arial" w:hAnsi="Arial"/>
+                <w:b w:val="false"/>
+                <w:bCs w:val="false"/>
+                <w:sz w:val="18"/>
+                <w:szCs w:val="18"/>
+                <w:rtl/>
+              </w:rPr>
+              <w:t xml:space="preserve">مراسي سلسلة التدقيق خارج القاعدة، والمخزن هو الحَكَم: AA1 إلى AA7</w:t>
+            </w:r>
+          </w:p>
+        </w:tc>
+        <w:tc>
+          <w:tcPr>
+            <w:tcW w:type="dxa" w:w="5638"/>
+            <w:tcBorders>
+              <w:top w:val="single" w:color="BFC9D6" w:sz="4"/>
+              <w:left w:val="single" w:color="BFC9D6" w:sz="4"/>
+              <w:bottom w:val="single" w:color="BFC9D6" w:sz="4"/>
+              <w:right w:val="single" w:color="BFC9D6" w:sz="4"/>
+            </w:tcBorders>
+            <w:tcMar>
+              <w:top w:type="dxa" w:w="50"/>
+              <w:left w:type="dxa" w:w="90"/>
+              <w:bottom w:type="dxa" w:w="50"/>
+              <w:right w:type="dxa" w:w="90"/>
+            </w:tcMar>
+            <w:vAlign w:val="top"/>
+          </w:tcPr>
+          <w:p>
+            <w:pPr>
+              <w:keepNext w:val="false"/>
+              <w:bidi/>
+              <w:spacing w:after="30" w:before="30" w:line="264"/>
+            </w:pPr>
+            <w:r>
+              <w:rPr>
+                <w:rFonts w:ascii="Arial" w:cs="Arial" w:eastAsia="Arial" w:hAnsi="Arial"/>
+                <w:b w:val="false"/>
+                <w:bCs w:val="false"/>
+                <w:sz w:val="18"/>
+                <w:szCs w:val="18"/>
+                <w:rtl/>
+              </w:rPr>
+              <w:t xml:space="preserve">tools/ci/audit_anchor_check.sh؛ tools/ci/db_ci.sh:643-662</w:t>
+            </w:r>
+          </w:p>
+        </w:tc>
+      </w:tr>
+      <w:tr>
+        <w:trPr>
+          <w:cantSplit/>
+        </w:trPr>
+        <w:tc>
+          <w:tcPr>
+            <w:tcW w:type="dxa" w:w="985"/>
+            <w:tcBorders>
+              <w:top w:val="single" w:color="BFC9D6" w:sz="4"/>
+              <w:left w:val="single" w:color="BFC9D6" w:sz="4"/>
+              <w:bottom w:val="single" w:color="BFC9D6" w:sz="4"/>
+              <w:right w:val="single" w:color="BFC9D6" w:sz="4"/>
+            </w:tcBorders>
+            <w:shd w:fill="F5F8FC" w:color="auto" w:val="clear"/>
+            <w:tcMar>
+              <w:top w:type="dxa" w:w="50"/>
+              <w:left w:type="dxa" w:w="90"/>
+              <w:bottom w:type="dxa" w:w="50"/>
+              <w:right w:type="dxa" w:w="90"/>
+            </w:tcMar>
+            <w:vAlign w:val="top"/>
+          </w:tcPr>
+          <w:p>
+            <w:pPr>
+              <w:keepNext w:val="false"/>
+              <w:bidi/>
+              <w:spacing w:after="30" w:before="30" w:line="264"/>
+            </w:pPr>
+            <w:r>
+              <w:rPr>
+                <w:rFonts w:ascii="Arial" w:cs="Arial" w:eastAsia="Arial" w:hAnsi="Arial"/>
+                <w:b w:val="false"/>
+                <w:bCs w:val="false"/>
+                <w:sz w:val="18"/>
+                <w:szCs w:val="18"/>
+                <w:rtl/>
+              </w:rPr>
+              <w:t xml:space="preserve">22d</w:t>
+            </w:r>
+          </w:p>
+        </w:tc>
+        <w:tc>
+          <w:tcPr>
+            <w:tcW w:type="dxa" w:w="3241"/>
+            <w:tcBorders>
+              <w:top w:val="single" w:color="BFC9D6" w:sz="4"/>
+              <w:left w:val="single" w:color="BFC9D6" w:sz="4"/>
+              <w:bottom w:val="single" w:color="BFC9D6" w:sz="4"/>
+              <w:right w:val="single" w:color="BFC9D6" w:sz="4"/>
+            </w:tcBorders>
+            <w:shd w:fill="F5F8FC" w:color="auto" w:val="clear"/>
+            <w:tcMar>
+              <w:top w:type="dxa" w:w="50"/>
+              <w:left w:type="dxa" w:w="90"/>
+              <w:bottom w:type="dxa" w:w="50"/>
+              <w:right w:type="dxa" w:w="90"/>
+            </w:tcMar>
+            <w:vAlign w:val="top"/>
+          </w:tcPr>
+          <w:p>
+            <w:pPr>
+              <w:keepNext w:val="false"/>
+              <w:bidi/>
+              <w:spacing w:after="30" w:before="30" w:line="264"/>
+            </w:pPr>
+            <w:r>
+              <w:rPr>
+                <w:rFonts w:ascii="Arial" w:cs="Arial" w:eastAsia="Arial" w:hAnsi="Arial"/>
+                <w:b w:val="false"/>
+                <w:bCs w:val="false"/>
+                <w:sz w:val="18"/>
+                <w:szCs w:val="18"/>
+                <w:rtl/>
+              </w:rPr>
+              <w:t xml:space="preserve">الترحيلات المتزايدة بحساب النشر داخل نافذة: MG1 إلى MG12</w:t>
+            </w:r>
+          </w:p>
+        </w:tc>
+        <w:tc>
+          <w:tcPr>
+            <w:tcW w:type="dxa" w:w="5638"/>
+            <w:tcBorders>
+              <w:top w:val="single" w:color="BFC9D6" w:sz="4"/>
+              <w:left w:val="single" w:color="BFC9D6" w:sz="4"/>
+              <w:bottom w:val="single" w:color="BFC9D6" w:sz="4"/>
+              <w:right w:val="single" w:color="BFC9D6" w:sz="4"/>
+            </w:tcBorders>
+            <w:shd w:fill="F5F8FC" w:color="auto" w:val="clear"/>
+            <w:tcMar>
+              <w:top w:type="dxa" w:w="50"/>
+              <w:left w:type="dxa" w:w="90"/>
+              <w:bottom w:type="dxa" w:w="50"/>
+              <w:right w:type="dxa" w:w="90"/>
+            </w:tcMar>
+            <w:vAlign w:val="top"/>
+          </w:tcPr>
+          <w:p>
+            <w:pPr>
+              <w:keepNext w:val="false"/>
+              <w:bidi/>
+              <w:spacing w:after="30" w:before="30" w:line="264"/>
+            </w:pPr>
+            <w:r>
+              <w:rPr>
+                <w:rFonts w:ascii="Arial" w:cs="Arial" w:eastAsia="Arial" w:hAnsi="Arial"/>
+                <w:b w:val="false"/>
+                <w:bCs w:val="false"/>
+                <w:sz w:val="18"/>
+                <w:szCs w:val="18"/>
+                <w:rtl/>
+              </w:rPr>
+              <w:t xml:space="preserve">tools/ci/migration_check.sh؛ tools/ci/db_ci.sh:663-685</w:t>
+            </w:r>
+          </w:p>
+        </w:tc>
+      </w:tr>
+      <w:tr>
+        <w:trPr>
+          <w:cantSplit/>
+        </w:trPr>
+        <w:tc>
+          <w:tcPr>
+            <w:tcW w:type="dxa" w:w="985"/>
+            <w:tcBorders>
+              <w:top w:val="single" w:color="BFC9D6" w:sz="4"/>
+              <w:left w:val="single" w:color="BFC9D6" w:sz="4"/>
+              <w:bottom w:val="single" w:color="BFC9D6" w:sz="4"/>
+              <w:right w:val="single" w:color="BFC9D6" w:sz="4"/>
+            </w:tcBorders>
+            <w:tcMar>
+              <w:top w:type="dxa" w:w="50"/>
+              <w:left w:type="dxa" w:w="90"/>
+              <w:bottom w:type="dxa" w:w="50"/>
+              <w:right w:type="dxa" w:w="90"/>
+            </w:tcMar>
+            <w:vAlign w:val="top"/>
+          </w:tcPr>
+          <w:p>
+            <w:pPr>
+              <w:keepNext w:val="false"/>
+              <w:bidi/>
+              <w:spacing w:after="30" w:before="30" w:line="264"/>
+            </w:pPr>
+            <w:r>
+              <w:rPr>
+                <w:rFonts w:ascii="Arial" w:cs="Arial" w:eastAsia="Arial" w:hAnsi="Arial"/>
+                <w:b w:val="false"/>
+                <w:bCs w:val="false"/>
+                <w:sz w:val="18"/>
+                <w:szCs w:val="18"/>
+                <w:rtl/>
+              </w:rPr>
+              <w:t xml:space="preserve">22e</w:t>
+            </w:r>
+          </w:p>
+        </w:tc>
+        <w:tc>
+          <w:tcPr>
+            <w:tcW w:type="dxa" w:w="3241"/>
+            <w:tcBorders>
+              <w:top w:val="single" w:color="BFC9D6" w:sz="4"/>
+              <w:left w:val="single" w:color="BFC9D6" w:sz="4"/>
+              <w:bottom w:val="single" w:color="BFC9D6" w:sz="4"/>
+              <w:right w:val="single" w:color="BFC9D6" w:sz="4"/>
+            </w:tcBorders>
+            <w:tcMar>
+              <w:top w:type="dxa" w:w="50"/>
+              <w:left w:type="dxa" w:w="90"/>
+              <w:bottom w:type="dxa" w:w="50"/>
+              <w:right w:type="dxa" w:w="90"/>
+            </w:tcMar>
+            <w:vAlign w:val="top"/>
+          </w:tcPr>
+          <w:p>
+            <w:pPr>
+              <w:keepNext w:val="false"/>
+              <w:bidi/>
+              <w:spacing w:after="30" w:before="30" w:line="264"/>
+            </w:pPr>
+            <w:r>
+              <w:rPr>
+                <w:rFonts w:ascii="Arial" w:cs="Arial" w:eastAsia="Arial" w:hAnsi="Arial"/>
+                <w:b w:val="false"/>
+                <w:bCs w:val="false"/>
+                <w:sz w:val="18"/>
+                <w:szCs w:val="18"/>
+                <w:rtl/>
+              </w:rPr>
+              <w:t xml:space="preserve">أدوار الحزمة CORE.ROLES: CR1 إلى CR9</w:t>
+            </w:r>
+          </w:p>
+        </w:tc>
+        <w:tc>
+          <w:tcPr>
+            <w:tcW w:type="dxa" w:w="5638"/>
+            <w:tcBorders>
+              <w:top w:val="single" w:color="BFC9D6" w:sz="4"/>
+              <w:left w:val="single" w:color="BFC9D6" w:sz="4"/>
+              <w:bottom w:val="single" w:color="BFC9D6" w:sz="4"/>
+              <w:right w:val="single" w:color="BFC9D6" w:sz="4"/>
+            </w:tcBorders>
+            <w:tcMar>
+              <w:top w:type="dxa" w:w="50"/>
+              <w:left w:type="dxa" w:w="90"/>
+              <w:bottom w:type="dxa" w:w="50"/>
+              <w:right w:type="dxa" w:w="90"/>
+            </w:tcMar>
+            <w:vAlign w:val="top"/>
+          </w:tcPr>
+          <w:p>
+            <w:pPr>
+              <w:keepNext w:val="false"/>
+              <w:bidi/>
+              <w:spacing w:after="30" w:before="30" w:line="264"/>
+            </w:pPr>
+            <w:r>
+              <w:rPr>
+                <w:rFonts w:ascii="Arial" w:cs="Arial" w:eastAsia="Arial" w:hAnsi="Arial"/>
+                <w:b w:val="false"/>
+                <w:bCs w:val="false"/>
+                <w:sz w:val="18"/>
+                <w:szCs w:val="18"/>
+                <w:rtl/>
+              </w:rPr>
+              <w:t xml:space="preserve">db/tests/core_roles_tests.sql؛ tools/ci/db_ci.sh:686-705</w:t>
+            </w:r>
+          </w:p>
+        </w:tc>
+      </w:tr>
+      <w:tr>
+        <w:trPr>
+          <w:cantSplit/>
+        </w:trPr>
+        <w:tc>
+          <w:tcPr>
+            <w:tcW w:type="dxa" w:w="985"/>
+            <w:tcBorders>
+              <w:top w:val="single" w:color="BFC9D6" w:sz="4"/>
+              <w:left w:val="single" w:color="BFC9D6" w:sz="4"/>
+              <w:bottom w:val="single" w:color="BFC9D6" w:sz="4"/>
+              <w:right w:val="single" w:color="BFC9D6" w:sz="4"/>
+            </w:tcBorders>
+            <w:shd w:fill="F5F8FC" w:color="auto" w:val="clear"/>
+            <w:tcMar>
+              <w:top w:type="dxa" w:w="50"/>
+              <w:left w:type="dxa" w:w="90"/>
+              <w:bottom w:type="dxa" w:w="50"/>
+              <w:right w:type="dxa" w:w="90"/>
+            </w:tcMar>
+            <w:vAlign w:val="top"/>
+          </w:tcPr>
+          <w:p>
+            <w:pPr>
+              <w:keepNext w:val="false"/>
+              <w:bidi/>
+              <w:spacing w:after="30" w:before="30" w:line="264"/>
+            </w:pPr>
+            <w:r>
+              <w:rPr>
+                <w:rFonts w:ascii="Arial" w:cs="Arial" w:eastAsia="Arial" w:hAnsi="Arial"/>
+                <w:b w:val="false"/>
+                <w:bCs w:val="false"/>
+                <w:sz w:val="18"/>
+                <w:szCs w:val="18"/>
+                <w:rtl/>
+              </w:rPr>
+              <w:t xml:space="preserve">22f</w:t>
+            </w:r>
+          </w:p>
+        </w:tc>
+        <w:tc>
+          <w:tcPr>
+            <w:tcW w:type="dxa" w:w="3241"/>
+            <w:tcBorders>
+              <w:top w:val="single" w:color="BFC9D6" w:sz="4"/>
+              <w:left w:val="single" w:color="BFC9D6" w:sz="4"/>
+              <w:bottom w:val="single" w:color="BFC9D6" w:sz="4"/>
+              <w:right w:val="single" w:color="BFC9D6" w:sz="4"/>
+            </w:tcBorders>
+            <w:shd w:fill="F5F8FC" w:color="auto" w:val="clear"/>
+            <w:tcMar>
+              <w:top w:type="dxa" w:w="50"/>
+              <w:left w:type="dxa" w:w="90"/>
+              <w:bottom w:type="dxa" w:w="50"/>
+              <w:right w:type="dxa" w:w="90"/>
+            </w:tcMar>
+            <w:vAlign w:val="top"/>
+          </w:tcPr>
+          <w:p>
+            <w:pPr>
+              <w:keepNext w:val="false"/>
+              <w:bidi/>
+              <w:spacing w:after="30" w:before="30" w:line="264"/>
+            </w:pPr>
+            <w:r>
+              <w:rPr>
+                <w:rFonts w:ascii="Arial" w:cs="Arial" w:eastAsia="Arial" w:hAnsi="Arial"/>
+                <w:b w:val="false"/>
+                <w:bCs w:val="false"/>
+                <w:sz w:val="18"/>
+                <w:szCs w:val="18"/>
+                <w:rtl/>
+              </w:rPr>
+              <w:t xml:space="preserve">الفاعلون في السجلات المالية وما تجمّده الفترة المغلقة: FC1 إلى FC14</w:t>
+            </w:r>
+          </w:p>
+        </w:tc>
+        <w:tc>
+          <w:tcPr>
+            <w:tcW w:type="dxa" w:w="5638"/>
+            <w:tcBorders>
+              <w:top w:val="single" w:color="BFC9D6" w:sz="4"/>
+              <w:left w:val="single" w:color="BFC9D6" w:sz="4"/>
+              <w:bottom w:val="single" w:color="BFC9D6" w:sz="4"/>
+              <w:right w:val="single" w:color="BFC9D6" w:sz="4"/>
+            </w:tcBorders>
+            <w:shd w:fill="F5F8FC" w:color="auto" w:val="clear"/>
+            <w:tcMar>
+              <w:top w:type="dxa" w:w="50"/>
+              <w:left w:type="dxa" w:w="90"/>
+              <w:bottom w:type="dxa" w:w="50"/>
+              <w:right w:type="dxa" w:w="90"/>
+            </w:tcMar>
+            <w:vAlign w:val="top"/>
+          </w:tcPr>
+          <w:p>
+            <w:pPr>
+              <w:keepNext w:val="false"/>
+              <w:bidi/>
+              <w:spacing w:after="30" w:before="30" w:line="264"/>
+            </w:pPr>
+            <w:r>
+              <w:rPr>
+                <w:rFonts w:ascii="Arial" w:cs="Arial" w:eastAsia="Arial" w:hAnsi="Arial"/>
+                <w:b w:val="false"/>
+                <w:bCs w:val="false"/>
+                <w:sz w:val="18"/>
+                <w:szCs w:val="18"/>
+                <w:rtl/>
+              </w:rPr>
+              <w:t xml:space="preserve">db/tests/finance_controls_tests.sql؛ tools/ci/db_ci.sh:706-726</w:t>
+            </w:r>
+          </w:p>
+        </w:tc>
+      </w:tr>
+      <w:tr>
+        <w:trPr>
+          <w:cantSplit/>
+        </w:trPr>
+        <w:tc>
+          <w:tcPr>
+            <w:tcW w:type="dxa" w:w="985"/>
+            <w:tcBorders>
+              <w:top w:val="single" w:color="BFC9D6" w:sz="4"/>
+              <w:left w:val="single" w:color="BFC9D6" w:sz="4"/>
+              <w:bottom w:val="single" w:color="BFC9D6" w:sz="4"/>
+              <w:right w:val="single" w:color="BFC9D6" w:sz="4"/>
+            </w:tcBorders>
+            <w:tcMar>
+              <w:top w:type="dxa" w:w="50"/>
+              <w:left w:type="dxa" w:w="90"/>
+              <w:bottom w:type="dxa" w:w="50"/>
+              <w:right w:type="dxa" w:w="90"/>
+            </w:tcMar>
+            <w:vAlign w:val="top"/>
+          </w:tcPr>
+          <w:p>
+            <w:pPr>
+              <w:keepNext w:val="false"/>
+              <w:bidi/>
+              <w:spacing w:after="30" w:before="30" w:line="264"/>
+            </w:pPr>
+            <w:r>
+              <w:rPr>
+                <w:rFonts w:ascii="Arial" w:cs="Arial" w:eastAsia="Arial" w:hAnsi="Arial"/>
+                <w:b w:val="false"/>
+                <w:bCs w:val="false"/>
+                <w:sz w:val="18"/>
+                <w:szCs w:val="18"/>
+                <w:rtl/>
+              </w:rPr>
               <w:t xml:space="preserve">23</w:t>
             </w:r>
           </w:p>
         </w:tc>
         <w:tc>
           <w:tcPr>
-            <w:tcW w:type="dxa" w:w="3181"/>
+            <w:tcW w:type="dxa" w:w="3241"/>
+            <w:tcBorders>
+              <w:top w:val="single" w:color="BFC9D6" w:sz="4"/>
+              <w:left w:val="single" w:color="BFC9D6" w:sz="4"/>
+              <w:bottom w:val="single" w:color="BFC9D6" w:sz="4"/>
+              <w:right w:val="single" w:color="BFC9D6" w:sz="4"/>
+            </w:tcBorders>
+            <w:tcMar>
+              <w:top w:type="dxa" w:w="50"/>
+              <w:left w:type="dxa" w:w="90"/>
+              <w:bottom w:type="dxa" w:w="50"/>
+              <w:right w:type="dxa" w:w="90"/>
+            </w:tcMar>
+            <w:vAlign w:val="top"/>
+          </w:tcPr>
+          <w:p>
+            <w:pPr>
+              <w:keepNext w:val="false"/>
+              <w:bidi/>
+              <w:spacing w:after="30" w:before="30" w:line="264"/>
+            </w:pPr>
+            <w:r>
+              <w:rPr>
+                <w:rFonts w:ascii="Arial" w:cs="Arial" w:eastAsia="Arial" w:hAnsi="Arial"/>
+                <w:b w:val="false"/>
+                <w:bCs w:val="false"/>
+                <w:sz w:val="18"/>
+                <w:szCs w:val="18"/>
+                <w:rtl/>
+              </w:rPr>
+              <w:t xml:space="preserve">لا مستخدم اختبار متروك (يُعدّ قبل الحذف)، ولا قيد غير موثوق ولا مشغّل معطّل ولا مرشح صفوف معطّل ولا مشترك متروك</w:t>
+            </w:r>
+          </w:p>
+        </w:tc>
+        <w:tc>
+          <w:tcPr>
+            <w:tcW w:type="dxa" w:w="5638"/>
+            <w:tcBorders>
+              <w:top w:val="single" w:color="BFC9D6" w:sz="4"/>
+              <w:left w:val="single" w:color="BFC9D6" w:sz="4"/>
+              <w:bottom w:val="single" w:color="BFC9D6" w:sz="4"/>
+              <w:right w:val="single" w:color="BFC9D6" w:sz="4"/>
+            </w:tcBorders>
+            <w:tcMar>
+              <w:top w:type="dxa" w:w="50"/>
+              <w:left w:type="dxa" w:w="90"/>
+              <w:bottom w:type="dxa" w:w="50"/>
+              <w:right w:type="dxa" w:w="90"/>
+            </w:tcMar>
+            <w:vAlign w:val="top"/>
+          </w:tcPr>
+          <w:p>
+            <w:pPr>
+              <w:keepNext w:val="false"/>
+              <w:bidi/>
+              <w:spacing w:after="30" w:before="30" w:line="264"/>
+            </w:pPr>
+            <w:r>
+              <w:rPr>
+                <w:rFonts w:ascii="Arial" w:cs="Arial" w:eastAsia="Arial" w:hAnsi="Arial"/>
+                <w:b w:val="false"/>
+                <w:bCs w:val="false"/>
+                <w:sz w:val="18"/>
+                <w:szCs w:val="18"/>
+                <w:rtl/>
+              </w:rPr>
+              <w:t xml:space="preserve">tools/ci/db_ci.sh:727-742</w:t>
+            </w:r>
+          </w:p>
+        </w:tc>
+      </w:tr>
+      <w:tr>
+        <w:trPr>
+          <w:cantSplit/>
+        </w:trPr>
+        <w:tc>
+          <w:tcPr>
+            <w:tcW w:type="dxa" w:w="985"/>
             <w:tcBorders>
               <w:top w:val="single" w:color="BFC9D6" w:sz="4"/>
               <w:left w:val="single" w:color="BFC9D6" w:sz="4"/>
@@ -2687,13 +3819,13 @@
                 <w:szCs w:val="18"/>
                 <w:rtl/>
               </w:rPr>
-              <w:t xml:space="preserve">لا قيد غير موثوق ولا مشغّل معطّل ولا مرشح صفوف معطّل ولا مستخدم اختبار ولا مشترك متروك</w:t>
-            </w:r>
-          </w:p>
-        </w:tc>
-        <w:tc>
-          <w:tcPr>
-            <w:tcW w:type="dxa" w:w="5600"/>
+              <w:t xml:space="preserve">24</w:t>
+            </w:r>
+          </w:p>
+        </w:tc>
+        <w:tc>
+          <w:tcPr>
+            <w:tcW w:type="dxa" w:w="3241"/>
             <w:tcBorders>
               <w:top w:val="single" w:color="BFC9D6" w:sz="4"/>
               <w:left w:val="single" w:color="BFC9D6" w:sz="4"/>
@@ -2724,7 +3856,44 @@
                 <w:szCs w:val="18"/>
                 <w:rtl/>
               </w:rPr>
-              <w:t xml:space="preserve">tools/ci/db_ci.sh</w:t>
+              <w:t xml:space="preserve">سكربتات القياس بأحجام صغيرة: 18 نتيجة، والسلسلة سليمة بعد الكتّاب المتزامنين (ADR 0036)</w:t>
+            </w:r>
+          </w:p>
+        </w:tc>
+        <w:tc>
+          <w:tcPr>
+            <w:tcW w:type="dxa" w:w="5638"/>
+            <w:tcBorders>
+              <w:top w:val="single" w:color="BFC9D6" w:sz="4"/>
+              <w:left w:val="single" w:color="BFC9D6" w:sz="4"/>
+              <w:bottom w:val="single" w:color="BFC9D6" w:sz="4"/>
+              <w:right w:val="single" w:color="BFC9D6" w:sz="4"/>
+            </w:tcBorders>
+            <w:shd w:fill="F5F8FC" w:color="auto" w:val="clear"/>
+            <w:tcMar>
+              <w:top w:type="dxa" w:w="50"/>
+              <w:left w:type="dxa" w:w="90"/>
+              <w:bottom w:type="dxa" w:w="50"/>
+              <w:right w:type="dxa" w:w="90"/>
+            </w:tcMar>
+            <w:vAlign w:val="top"/>
+          </w:tcPr>
+          <w:p>
+            <w:pPr>
+              <w:keepNext w:val="false"/>
+              <w:bidi/>
+              <w:spacing w:after="30" w:before="30" w:line="264"/>
+            </w:pPr>
+            <w:r>
+              <w:rPr>
+                <w:rFonts w:ascii="Arial" w:cs="Arial" w:eastAsia="Arial" w:hAnsi="Arial"/>
+                <w:b w:val="false"/>
+                <w:bCs w:val="false"/>
+                <w:sz w:val="18"/>
+                <w:szCs w:val="18"/>
+                <w:rtl/>
+              </w:rPr>
+              <w:t xml:space="preserve">tools/perf/run_perf.sh؛ tools/ci/db_ci.sh:701-718</w:t>
             </w:r>
           </w:p>
         </w:tc>
@@ -3901,9 +5070,9 @@
         </w:tblBorders>
       </w:tblPr>
       <w:tblGrid>
-        <w:gridCol w:w="5009"/>
-        <w:gridCol w:w="1517"/>
-        <w:gridCol w:w="3338"/>
+        <w:gridCol w:w="4933"/>
+        <w:gridCol w:w="1494"/>
+        <w:gridCol w:w="3437"/>
       </w:tblGrid>
       <w:tr>
         <w:trPr>
@@ -3912,7 +5081,7 @@
         </w:trPr>
         <w:tc>
           <w:tcPr>
-            <w:tcW w:type="dxa" w:w="5009"/>
+            <w:tcW w:type="dxa" w:w="4933"/>
             <w:tcBorders>
               <w:top w:val="single" w:color="BFC9D6" w:sz="4"/>
               <w:left w:val="single" w:color="BFC9D6" w:sz="4"/>
@@ -3950,7 +5119,7 @@
         </w:tc>
         <w:tc>
           <w:tcPr>
-            <w:tcW w:type="dxa" w:w="1517"/>
+            <w:tcW w:type="dxa" w:w="1494"/>
             <w:tcBorders>
               <w:top w:val="single" w:color="BFC9D6" w:sz="4"/>
               <w:left w:val="single" w:color="BFC9D6" w:sz="4"/>
@@ -3988,7 +5157,7 @@
         </w:tc>
         <w:tc>
           <w:tcPr>
-            <w:tcW w:type="dxa" w:w="3338"/>
+            <w:tcW w:type="dxa" w:w="3437"/>
             <w:tcBorders>
               <w:top w:val="single" w:color="BFC9D6" w:sz="4"/>
               <w:left w:val="single" w:color="BFC9D6" w:sz="4"/>
@@ -4031,7 +5200,7 @@
         </w:trPr>
         <w:tc>
           <w:tcPr>
-            <w:tcW w:type="dxa" w:w="5009"/>
+            <w:tcW w:type="dxa" w:w="4933"/>
             <w:tcBorders>
               <w:top w:val="single" w:color="BFC9D6" w:sz="4"/>
               <w:left w:val="single" w:color="BFC9D6" w:sz="4"/>
@@ -4067,7 +5236,7 @@
         </w:tc>
         <w:tc>
           <w:tcPr>
-            <w:tcW w:type="dxa" w:w="1517"/>
+            <w:tcW w:type="dxa" w:w="1494"/>
             <w:tcBorders>
               <w:top w:val="single" w:color="BFC9D6" w:sz="4"/>
               <w:left w:val="single" w:color="BFC9D6" w:sz="4"/>
@@ -4103,7 +5272,7 @@
         </w:tc>
         <w:tc>
           <w:tcPr>
-            <w:tcW w:type="dxa" w:w="3338"/>
+            <w:tcW w:type="dxa" w:w="3437"/>
             <w:tcBorders>
               <w:top w:val="single" w:color="BFC9D6" w:sz="4"/>
               <w:left w:val="single" w:color="BFC9D6" w:sz="4"/>
@@ -4144,7 +5313,7 @@
         </w:trPr>
         <w:tc>
           <w:tcPr>
-            <w:tcW w:type="dxa" w:w="5009"/>
+            <w:tcW w:type="dxa" w:w="4933"/>
             <w:tcBorders>
               <w:top w:val="single" w:color="BFC9D6" w:sz="4"/>
               <w:left w:val="single" w:color="BFC9D6" w:sz="4"/>
@@ -4181,7 +5350,7 @@
         </w:tc>
         <w:tc>
           <w:tcPr>
-            <w:tcW w:type="dxa" w:w="1517"/>
+            <w:tcW w:type="dxa" w:w="1494"/>
             <w:tcBorders>
               <w:top w:val="single" w:color="BFC9D6" w:sz="4"/>
               <w:left w:val="single" w:color="BFC9D6" w:sz="4"/>
@@ -4218,7 +5387,7 @@
         </w:tc>
         <w:tc>
           <w:tcPr>
-            <w:tcW w:type="dxa" w:w="3338"/>
+            <w:tcW w:type="dxa" w:w="3437"/>
             <w:tcBorders>
               <w:top w:val="single" w:color="BFC9D6" w:sz="4"/>
               <w:left w:val="single" w:color="BFC9D6" w:sz="4"/>
@@ -4260,7 +5429,7 @@
         </w:trPr>
         <w:tc>
           <w:tcPr>
-            <w:tcW w:type="dxa" w:w="5009"/>
+            <w:tcW w:type="dxa" w:w="4933"/>
             <w:tcBorders>
               <w:top w:val="single" w:color="BFC9D6" w:sz="4"/>
               <w:left w:val="single" w:color="BFC9D6" w:sz="4"/>
@@ -4296,7 +5465,7 @@
         </w:tc>
         <w:tc>
           <w:tcPr>
-            <w:tcW w:type="dxa" w:w="1517"/>
+            <w:tcW w:type="dxa" w:w="1494"/>
             <w:tcBorders>
               <w:top w:val="single" w:color="BFC9D6" w:sz="4"/>
               <w:left w:val="single" w:color="BFC9D6" w:sz="4"/>
@@ -4332,7 +5501,7 @@
         </w:tc>
         <w:tc>
           <w:tcPr>
-            <w:tcW w:type="dxa" w:w="3338"/>
+            <w:tcW w:type="dxa" w:w="3437"/>
             <w:tcBorders>
               <w:top w:val="single" w:color="BFC9D6" w:sz="4"/>
               <w:left w:val="single" w:color="BFC9D6" w:sz="4"/>
@@ -4373,7 +5542,7 @@
         </w:trPr>
         <w:tc>
           <w:tcPr>
-            <w:tcW w:type="dxa" w:w="5009"/>
+            <w:tcW w:type="dxa" w:w="4933"/>
             <w:tcBorders>
               <w:top w:val="single" w:color="BFC9D6" w:sz="4"/>
               <w:left w:val="single" w:color="BFC9D6" w:sz="4"/>
@@ -4410,7 +5579,7 @@
         </w:tc>
         <w:tc>
           <w:tcPr>
-            <w:tcW w:type="dxa" w:w="1517"/>
+            <w:tcW w:type="dxa" w:w="1494"/>
             <w:tcBorders>
               <w:top w:val="single" w:color="BFC9D6" w:sz="4"/>
               <w:left w:val="single" w:color="BFC9D6" w:sz="4"/>
@@ -4441,13 +5610,13 @@
                 <w:szCs w:val="18"/>
                 <w:rtl/>
               </w:rPr>
-              <w:t xml:space="preserve">القواعد R1-R10 للمنح والتشفير (السطور 4-16)</w:t>
-            </w:r>
-          </w:p>
-        </w:tc>
-        <w:tc>
-          <w:tcPr>
-            <w:tcW w:type="dxa" w:w="3338"/>
+              <w:t xml:space="preserve">القواعد R1-R11 للمنح والتشفير (السطور 4-16)</w:t>
+            </w:r>
+          </w:p>
+        </w:tc>
+        <w:tc>
+          <w:tcPr>
+            <w:tcW w:type="dxa" w:w="3437"/>
             <w:tcBorders>
               <w:top w:val="single" w:color="BFC9D6" w:sz="4"/>
               <w:left w:val="single" w:color="BFC9D6" w:sz="4"/>
@@ -4478,7 +5647,7 @@
                 <w:szCs w:val="18"/>
                 <w:rtl/>
               </w:rPr>
-              <w:t xml:space="preserve">نعم، الخطوة 3 (tools/ci/db_ci.sh:49)</w:t>
+              <w:t xml:space="preserve">نعم، الخطوة 3 (tools/ci/db_ci.sh:104)</w:t>
             </w:r>
           </w:p>
         </w:tc>
@@ -4489,7 +5658,7 @@
         </w:trPr>
         <w:tc>
           <w:tcPr>
-            <w:tcW w:type="dxa" w:w="5009"/>
+            <w:tcW w:type="dxa" w:w="4933"/>
             <w:tcBorders>
               <w:top w:val="single" w:color="BFC9D6" w:sz="4"/>
               <w:left w:val="single" w:color="BFC9D6" w:sz="4"/>
@@ -4525,7 +5694,7 @@
         </w:tc>
         <w:tc>
           <w:tcPr>
-            <w:tcW w:type="dxa" w:w="1517"/>
+            <w:tcW w:type="dxa" w:w="1494"/>
             <w:tcBorders>
               <w:top w:val="single" w:color="BFC9D6" w:sz="4"/>
               <w:left w:val="single" w:color="BFC9D6" w:sz="4"/>
@@ -4561,37 +5730,37 @@
         </w:tc>
         <w:tc>
           <w:tcPr>
-            <w:tcW w:type="dxa" w:w="3338"/>
-            <w:tcBorders>
-              <w:top w:val="single" w:color="BFC9D6" w:sz="4"/>
-              <w:left w:val="single" w:color="BFC9D6" w:sz="4"/>
-              <w:bottom w:val="single" w:color="BFC9D6" w:sz="4"/>
-              <w:right w:val="single" w:color="BFC9D6" w:sz="4"/>
-            </w:tcBorders>
-            <w:tcMar>
-              <w:top w:type="dxa" w:w="50"/>
-              <w:left w:type="dxa" w:w="90"/>
-              <w:bottom w:type="dxa" w:w="50"/>
-              <w:right w:type="dxa" w:w="90"/>
-            </w:tcMar>
-            <w:vAlign w:val="top"/>
-          </w:tcPr>
-          <w:p>
-            <w:pPr>
-              <w:keepNext w:val="false"/>
-              <w:bidi/>
-              <w:spacing w:after="30" w:before="30" w:line="264"/>
-            </w:pPr>
-            <w:r>
-              <w:rPr>
-                <w:rFonts w:ascii="Arial" w:cs="Arial" w:eastAsia="Arial" w:hAnsi="Arial"/>
-                <w:b w:val="false"/>
-                <w:bCs w:val="false"/>
-                <w:sz w:val="18"/>
-                <w:szCs w:val="18"/>
-                <w:rtl/>
-              </w:rPr>
-              <w:t xml:space="preserve">لا</w:t>
+            <w:tcW w:type="dxa" w:w="3437"/>
+            <w:tcBorders>
+              <w:top w:val="single" w:color="BFC9D6" w:sz="4"/>
+              <w:left w:val="single" w:color="BFC9D6" w:sz="4"/>
+              <w:bottom w:val="single" w:color="BFC9D6" w:sz="4"/>
+              <w:right w:val="single" w:color="BFC9D6" w:sz="4"/>
+            </w:tcBorders>
+            <w:tcMar>
+              <w:top w:type="dxa" w:w="50"/>
+              <w:left w:type="dxa" w:w="90"/>
+              <w:bottom w:type="dxa" w:w="50"/>
+              <w:right w:type="dxa" w:w="90"/>
+            </w:tcMar>
+            <w:vAlign w:val="top"/>
+          </w:tcPr>
+          <w:p>
+            <w:pPr>
+              <w:keepNext w:val="false"/>
+              <w:bidi/>
+              <w:spacing w:after="30" w:before="30" w:line="264"/>
+            </w:pPr>
+            <w:r>
+              <w:rPr>
+                <w:rFonts w:ascii="Arial" w:cs="Arial" w:eastAsia="Arial" w:hAnsi="Arial"/>
+                <w:b w:val="false"/>
+                <w:bCs w:val="false"/>
+                <w:sz w:val="18"/>
+                <w:szCs w:val="18"/>
+                <w:rtl/>
+              </w:rPr>
+              <w:t xml:space="preserve">نعم، الخطوة 3 (tools/ci/db_ci.sh:105)</w:t>
             </w:r>
           </w:p>
         </w:tc>
@@ -4602,7 +5771,7 @@
         </w:trPr>
         <w:tc>
           <w:tcPr>
-            <w:tcW w:type="dxa" w:w="5009"/>
+            <w:tcW w:type="dxa" w:w="4933"/>
             <w:tcBorders>
               <w:top w:val="single" w:color="BFC9D6" w:sz="4"/>
               <w:left w:val="single" w:color="BFC9D6" w:sz="4"/>
@@ -4639,7 +5808,7 @@
         </w:tc>
         <w:tc>
           <w:tcPr>
-            <w:tcW w:type="dxa" w:w="1517"/>
+            <w:tcW w:type="dxa" w:w="1494"/>
             <w:tcBorders>
               <w:top w:val="single" w:color="BFC9D6" w:sz="4"/>
               <w:left w:val="single" w:color="BFC9D6" w:sz="4"/>
@@ -4676,7 +5845,7 @@
         </w:tc>
         <w:tc>
           <w:tcPr>
-            <w:tcW w:type="dxa" w:w="3338"/>
+            <w:tcW w:type="dxa" w:w="3437"/>
             <w:tcBorders>
               <w:top w:val="single" w:color="BFC9D6" w:sz="4"/>
               <w:left w:val="single" w:color="BFC9D6" w:sz="4"/>
@@ -4780,7 +5949,27 @@
           <w:szCs w:val="21"/>
           <w:rtl/>
         </w:rPr>
-        <w:t xml:space="preserve">check_review_fixes.py لا يعمل في CI، مع أن docs/20-database-design.md:489 يعدّه دليل تحقق من الإصلاحات الحرجة.</w:t>
+        <w:t xml:space="preserve">check_review_fixes.py لا يعمل في CI </w:t>
+      </w:r>
+      <w:r>
+        <w:rPr>
+          <w:rFonts w:ascii="Segoe UI Emoji" w:cs="Segoe UI Emoji" w:eastAsia="Segoe UI Emoji" w:hAnsi="Segoe UI Emoji"/>
+          <w:sz w:val="21"/>
+          <w:szCs w:val="21"/>
+          <w:rtl/>
+        </w:rPr>
+        <w:t xml:space="preserve">✅</w:t>
+      </w:r>
+      <w:r>
+        <w:rPr>
+          <w:rFonts w:ascii="Arial" w:cs="Arial" w:eastAsia="Arial" w:hAnsi="Arial"/>
+          <w:b w:val="false"/>
+          <w:bCs w:val="false"/>
+          <w:sz w:val="21"/>
+          <w:szCs w:val="21"/>
+          <w:rtl/>
+        </w:rPr>
+        <w:t xml:space="preserve"> مسدودة: يعمل في الخطوة 3 (tools/ci/db_ci.sh:105، DQ-B01-3).</w:t>
       </w:r>
     </w:p>
     <w:p>

</xml_diff>

<commit_message>
Word files: docs/46, docs/31 and the readiness documents and volumes
Co-Authored-By: Claude Opus 5.5 <noreply@anthropic.com>
Claude-Session: https://claude.ai/code/session_012HHcRrzuvMBTL2FYxXtsyv
</commit_message>
<xml_diff>
--- a/treasury-platform/docs/30-readiness/word/DOC-B01-test-strategy-and-plan.docx
+++ b/treasury-platform/docs/30-readiness/word/DOC-B01-test-strategy-and-plan.docx
@@ -807,7 +807,7 @@
         <w:spacing w:after="50" w:before="0"/>
         <w:ind w:left="0"/>
       </w:pPr>
-      <w:hyperlink w:history="1" w:anchor="_sec13">
+      <w:hyperlink w:history="1" w:anchor="_sec14">
         <w:r>
           <w:rPr>
             <w:rFonts w:ascii="Arial" w:cs="Arial" w:eastAsia="Arial" w:hAnsi="Arial"/>
@@ -828,7 +828,7 @@
         <w:spacing w:after="50" w:before="0"/>
         <w:ind w:left="0"/>
       </w:pPr>
-      <w:hyperlink w:history="1" w:anchor="_sec14">
+      <w:hyperlink w:history="1" w:anchor="_sec15">
         <w:r>
           <w:rPr>
             <w:rFonts w:ascii="Arial" w:cs="Arial" w:eastAsia="Arial" w:hAnsi="Arial"/>
@@ -849,7 +849,7 @@
         <w:spacing w:after="50" w:before="0"/>
         <w:ind w:left="0"/>
       </w:pPr>
-      <w:hyperlink w:history="1" w:anchor="_sec15">
+      <w:hyperlink w:history="1" w:anchor="_sec16">
         <w:r>
           <w:rPr>
             <w:rFonts w:ascii="Arial" w:cs="Arial" w:eastAsia="Arial" w:hAnsi="Arial"/>
@@ -870,7 +870,7 @@
         <w:spacing w:after="50" w:before="0"/>
         <w:ind w:left="0"/>
       </w:pPr>
-      <w:hyperlink w:history="1" w:anchor="_sec16">
+      <w:hyperlink w:history="1" w:anchor="_sec17">
         <w:r>
           <w:rPr>
             <w:rFonts w:ascii="Arial" w:cs="Arial" w:eastAsia="Arial" w:hAnsi="Arial"/>
@@ -891,7 +891,7 @@
         <w:spacing w:after="50" w:before="0"/>
         <w:ind w:left="0"/>
       </w:pPr>
-      <w:hyperlink w:history="1" w:anchor="_sec17">
+      <w:hyperlink w:history="1" w:anchor="_sec18">
         <w:r>
           <w:rPr>
             <w:rFonts w:ascii="Arial" w:cs="Arial" w:eastAsia="Arial" w:hAnsi="Arial"/>
@@ -912,7 +912,7 @@
         <w:spacing w:after="50" w:before="0"/>
         <w:ind w:left="0"/>
       </w:pPr>
-      <w:hyperlink w:history="1" w:anchor="_sec18">
+      <w:hyperlink w:history="1" w:anchor="_sec19">
         <w:r>
           <w:rPr>
             <w:rFonts w:ascii="Arial" w:cs="Arial" w:eastAsia="Arial" w:hAnsi="Arial"/>
@@ -933,7 +933,7 @@
         <w:spacing w:after="50" w:before="0"/>
         <w:ind w:left="0"/>
       </w:pPr>
-      <w:hyperlink w:history="1" w:anchor="_sec19">
+      <w:hyperlink w:history="1" w:anchor="_sec20">
         <w:r>
           <w:rPr>
             <w:rFonts w:ascii="Arial" w:cs="Arial" w:eastAsia="Arial" w:hAnsi="Arial"/>
@@ -954,7 +954,7 @@
         <w:spacing w:after="50" w:before="0"/>
         <w:ind w:left="0"/>
       </w:pPr>
-      <w:hyperlink w:history="1" w:anchor="_sec20">
+      <w:hyperlink w:history="1" w:anchor="_sec21">
         <w:r>
           <w:rPr>
             <w:rFonts w:ascii="Arial" w:cs="Arial" w:eastAsia="Arial" w:hAnsi="Arial"/>
@@ -11271,10 +11271,590 @@
     </w:p>
     <w:p>
       <w:pPr>
+        <w:pStyle w:val="Heading2"/>
+        <w:bidi/>
+      </w:pPr>
+      <w:bookmarkStart w:name="_sec13" w:id="13"/>
+      <w:r>
+        <w:rPr>
+          <w:rFonts w:ascii="Arial" w:cs="Arial" w:eastAsia="Arial" w:hAnsi="Arial"/>
+          <w:b/>
+          <w:bCs/>
+          <w:color w:val="2B5C8A"/>
+          <w:sz w:val="26"/>
+          <w:szCs w:val="26"/>
+          <w:rtl/>
+        </w:rPr>
+        <w:t xml:space="preserve">5.4 الشريحة S2-ب</w:t>
+      </w:r>
+      <w:bookmarkEnd w:id="13"/>
+    </w:p>
+    <w:p>
+      <w:pPr>
+        <w:bidi/>
+        <w:spacing w:after="110" w:before="0" w:line="312"/>
+      </w:pPr>
+      <w:r>
+        <w:rPr>
+          <w:rFonts w:ascii="Arial" w:cs="Arial" w:eastAsia="Arial" w:hAnsi="Arial"/>
+          <w:b w:val="false"/>
+          <w:bCs w:val="false"/>
+          <w:sz w:val="21"/>
+          <w:szCs w:val="21"/>
+          <w:rtl/>
+        </w:rPr>
+        <w:t xml:space="preserve">أُضيف مع بناء S2-ب (2026-10-23، </w:t>
+      </w:r>
+      <w:r>
+        <w:rPr>
+          <w:rFonts w:ascii="Courier New" w:cs="Courier New" w:eastAsia="Courier New" w:hAnsi="Courier New"/>
+          <w:b w:val="false"/>
+          <w:bCs w:val="false"/>
+          <w:color w:val="1F2937"/>
+          <w:sz w:val="18"/>
+          <w:szCs w:val="18"/>
+          <w:shd w:fill="F1F3F5" w:color="auto" w:val="clear"/>
+          <w:rtl/>
+        </w:rPr>
+        <w:t xml:space="preserve">‎docs/46‎</w:t>
+      </w:r>
+      <w:r>
+        <w:rPr>
+          <w:rFonts w:ascii="Arial" w:cs="Arial" w:eastAsia="Arial" w:hAnsi="Arial"/>
+          <w:b w:val="false"/>
+          <w:bCs w:val="false"/>
+          <w:sz w:val="21"/>
+          <w:szCs w:val="21"/>
+          <w:rtl/>
+        </w:rPr>
+        <w:t xml:space="preserve">).</w:t>
+      </w:r>
+    </w:p>
+    <w:tbl>
+      <w:tblPr>
+        <w:bidiVisual/>
+        <w:tblW w:type="dxa" w:w="9864"/>
+        <w:tblBorders>
+          <w:top w:val="single" w:color="auto" w:sz="4"/>
+          <w:left w:val="single" w:color="auto" w:sz="4"/>
+          <w:bottom w:val="single" w:color="auto" w:sz="4"/>
+          <w:right w:val="single" w:color="auto" w:sz="4"/>
+          <w:insideH w:val="single" w:color="auto" w:sz="4"/>
+          <w:insideV w:val="single" w:color="auto" w:sz="4"/>
+        </w:tblBorders>
+      </w:tblPr>
+      <w:tblGrid>
+        <w:gridCol w:w="976"/>
+        <w:gridCol w:w="8888"/>
+      </w:tblGrid>
+      <w:tr>
+        <w:trPr>
+          <w:cantSplit/>
+          <w:tblHeader/>
+        </w:trPr>
+        <w:tc>
+          <w:tcPr>
+            <w:tcW w:type="dxa" w:w="976"/>
+            <w:tcBorders>
+              <w:top w:val="single" w:color="BFC9D6" w:sz="4"/>
+              <w:left w:val="single" w:color="BFC9D6" w:sz="4"/>
+              <w:bottom w:val="single" w:color="BFC9D6" w:sz="4"/>
+              <w:right w:val="single" w:color="BFC9D6" w:sz="4"/>
+            </w:tcBorders>
+            <w:shd w:fill="1F3A5F" w:color="auto" w:val="clear"/>
+            <w:tcMar>
+              <w:top w:type="dxa" w:w="50"/>
+              <w:left w:type="dxa" w:w="90"/>
+              <w:bottom w:type="dxa" w:w="50"/>
+              <w:right w:type="dxa" w:w="90"/>
+            </w:tcMar>
+            <w:vAlign w:val="center"/>
+          </w:tcPr>
+          <w:p>
+            <w:pPr>
+              <w:keepNext w:val="false"/>
+              <w:bidi/>
+              <w:spacing w:after="30" w:before="30" w:line="264"/>
+            </w:pPr>
+            <w:r>
+              <w:rPr>
+                <w:rFonts w:ascii="Arial" w:cs="Arial" w:eastAsia="Arial" w:hAnsi="Arial"/>
+                <w:b/>
+                <w:bCs/>
+                <w:color w:val="FFFFFF"/>
+                <w:sz w:val="18"/>
+                <w:szCs w:val="18"/>
+                <w:rtl/>
+              </w:rPr>
+              <w:t xml:space="preserve">النوع</w:t>
+            </w:r>
+          </w:p>
+        </w:tc>
+        <w:tc>
+          <w:tcPr>
+            <w:tcW w:type="dxa" w:w="8888"/>
+            <w:tcBorders>
+              <w:top w:val="single" w:color="BFC9D6" w:sz="4"/>
+              <w:left w:val="single" w:color="BFC9D6" w:sz="4"/>
+              <w:bottom w:val="single" w:color="BFC9D6" w:sz="4"/>
+              <w:right w:val="single" w:color="BFC9D6" w:sz="4"/>
+            </w:tcBorders>
+            <w:shd w:fill="1F3A5F" w:color="auto" w:val="clear"/>
+            <w:tcMar>
+              <w:top w:type="dxa" w:w="50"/>
+              <w:left w:type="dxa" w:w="90"/>
+              <w:bottom w:type="dxa" w:w="50"/>
+              <w:right w:type="dxa" w:w="90"/>
+            </w:tcMar>
+            <w:vAlign w:val="center"/>
+          </w:tcPr>
+          <w:p>
+            <w:pPr>
+              <w:keepNext w:val="false"/>
+              <w:bidi/>
+              <w:spacing w:after="30" w:before="30" w:line="264"/>
+            </w:pPr>
+            <w:r>
+              <w:rPr>
+                <w:rFonts w:ascii="Arial" w:cs="Arial" w:eastAsia="Arial" w:hAnsi="Arial"/>
+                <w:b/>
+                <w:bCs/>
+                <w:color w:val="FFFFFF"/>
+                <w:sz w:val="18"/>
+                <w:szCs w:val="18"/>
+                <w:rtl/>
+              </w:rPr>
+              <w:t xml:space="preserve">المعيار</w:t>
+            </w:r>
+          </w:p>
+        </w:tc>
+      </w:tr>
+      <w:tr>
+        <w:trPr>
+          <w:cantSplit/>
+        </w:trPr>
+        <w:tc>
+          <w:tcPr>
+            <w:tcW w:type="dxa" w:w="976"/>
+            <w:tcBorders>
+              <w:top w:val="single" w:color="BFC9D6" w:sz="4"/>
+              <w:left w:val="single" w:color="BFC9D6" w:sz="4"/>
+              <w:bottom w:val="single" w:color="BFC9D6" w:sz="4"/>
+              <w:right w:val="single" w:color="BFC9D6" w:sz="4"/>
+            </w:tcBorders>
+            <w:tcMar>
+              <w:top w:type="dxa" w:w="50"/>
+              <w:left w:type="dxa" w:w="90"/>
+              <w:bottom w:type="dxa" w:w="50"/>
+              <w:right w:type="dxa" w:w="90"/>
+            </w:tcMar>
+            <w:vAlign w:val="top"/>
+          </w:tcPr>
+          <w:p>
+            <w:pPr>
+              <w:keepNext w:val="false"/>
+              <w:bidi/>
+              <w:spacing w:after="30" w:before="30" w:line="264"/>
+            </w:pPr>
+            <w:r>
+              <w:rPr>
+                <w:rFonts w:ascii="Arial" w:cs="Arial" w:eastAsia="Arial" w:hAnsi="Arial"/>
+                <w:b w:val="false"/>
+                <w:bCs w:val="false"/>
+                <w:sz w:val="18"/>
+                <w:szCs w:val="18"/>
+                <w:rtl/>
+              </w:rPr>
+              <w:t xml:space="preserve">دخول</w:t>
+            </w:r>
+          </w:p>
+        </w:tc>
+        <w:tc>
+          <w:tcPr>
+            <w:tcW w:type="dxa" w:w="8888"/>
+            <w:tcBorders>
+              <w:top w:val="single" w:color="BFC9D6" w:sz="4"/>
+              <w:left w:val="single" w:color="BFC9D6" w:sz="4"/>
+              <w:bottom w:val="single" w:color="BFC9D6" w:sz="4"/>
+              <w:right w:val="single" w:color="BFC9D6" w:sz="4"/>
+            </w:tcBorders>
+            <w:tcMar>
+              <w:top w:type="dxa" w:w="50"/>
+              <w:left w:type="dxa" w:w="90"/>
+              <w:bottom w:type="dxa" w:w="50"/>
+              <w:right w:type="dxa" w:w="90"/>
+            </w:tcMar>
+            <w:vAlign w:val="top"/>
+          </w:tcPr>
+          <w:p>
+            <w:pPr>
+              <w:keepNext w:val="false"/>
+              <w:bidi/>
+              <w:spacing w:after="30" w:before="30" w:line="264"/>
+            </w:pPr>
+            <w:r>
+              <w:rPr>
+                <w:rFonts w:ascii="Arial" w:cs="Arial" w:eastAsia="Arial" w:hAnsi="Arial"/>
+                <w:b w:val="false"/>
+                <w:bCs w:val="false"/>
+                <w:sz w:val="18"/>
+                <w:szCs w:val="18"/>
+                <w:rtl/>
+              </w:rPr>
+              <w:t xml:space="preserve">اعتماد افتراضات موجز S2-ب OQ-1 إلى 17 (</w:t>
+            </w:r>
+            <w:r>
+              <w:rPr>
+                <w:rFonts w:ascii="Courier New" w:cs="Courier New" w:eastAsia="Courier New" w:hAnsi="Courier New"/>
+                <w:b w:val="false"/>
+                <w:bCs w:val="false"/>
+                <w:color w:val="1F2937"/>
+                <w:sz w:val="16"/>
+                <w:szCs w:val="16"/>
+                <w:shd w:fill="F1F3F5" w:color="auto" w:val="clear"/>
+                <w:rtl/>
+              </w:rPr>
+              <w:t xml:space="preserve">‎docs/31‎</w:t>
+            </w:r>
+            <w:r>
+              <w:rPr>
+                <w:rFonts w:ascii="Arial" w:cs="Arial" w:eastAsia="Arial" w:hAnsi="Arial"/>
+                <w:b w:val="false"/>
+                <w:bCs w:val="false"/>
+                <w:sz w:val="18"/>
+                <w:szCs w:val="18"/>
+                <w:rtl/>
+              </w:rPr>
+              <w:t xml:space="preserve"> الصف 41)</w:t>
+            </w:r>
+          </w:p>
+        </w:tc>
+      </w:tr>
+      <w:tr>
+        <w:trPr>
+          <w:cantSplit/>
+        </w:trPr>
+        <w:tc>
+          <w:tcPr>
+            <w:tcW w:type="dxa" w:w="976"/>
+            <w:tcBorders>
+              <w:top w:val="single" w:color="BFC9D6" w:sz="4"/>
+              <w:left w:val="single" w:color="BFC9D6" w:sz="4"/>
+              <w:bottom w:val="single" w:color="BFC9D6" w:sz="4"/>
+              <w:right w:val="single" w:color="BFC9D6" w:sz="4"/>
+            </w:tcBorders>
+            <w:shd w:fill="F5F8FC" w:color="auto" w:val="clear"/>
+            <w:tcMar>
+              <w:top w:type="dxa" w:w="50"/>
+              <w:left w:type="dxa" w:w="90"/>
+              <w:bottom w:type="dxa" w:w="50"/>
+              <w:right w:type="dxa" w:w="90"/>
+            </w:tcMar>
+            <w:vAlign w:val="top"/>
+          </w:tcPr>
+          <w:p>
+            <w:pPr>
+              <w:keepNext w:val="false"/>
+              <w:bidi/>
+              <w:spacing w:after="30" w:before="30" w:line="264"/>
+            </w:pPr>
+            <w:r>
+              <w:rPr>
+                <w:rFonts w:ascii="Arial" w:cs="Arial" w:eastAsia="Arial" w:hAnsi="Arial"/>
+                <w:b w:val="false"/>
+                <w:bCs w:val="false"/>
+                <w:sz w:val="18"/>
+                <w:szCs w:val="18"/>
+                <w:rtl/>
+              </w:rPr>
+              <w:t xml:space="preserve">دخول</w:t>
+            </w:r>
+          </w:p>
+        </w:tc>
+        <w:tc>
+          <w:tcPr>
+            <w:tcW w:type="dxa" w:w="8888"/>
+            <w:tcBorders>
+              <w:top w:val="single" w:color="BFC9D6" w:sz="4"/>
+              <w:left w:val="single" w:color="BFC9D6" w:sz="4"/>
+              <w:bottom w:val="single" w:color="BFC9D6" w:sz="4"/>
+              <w:right w:val="single" w:color="BFC9D6" w:sz="4"/>
+            </w:tcBorders>
+            <w:shd w:fill="F5F8FC" w:color="auto" w:val="clear"/>
+            <w:tcMar>
+              <w:top w:type="dxa" w:w="50"/>
+              <w:left w:type="dxa" w:w="90"/>
+              <w:bottom w:type="dxa" w:w="50"/>
+              <w:right w:type="dxa" w:w="90"/>
+            </w:tcMar>
+            <w:vAlign w:val="top"/>
+          </w:tcPr>
+          <w:p>
+            <w:pPr>
+              <w:keepNext w:val="false"/>
+              <w:bidi/>
+              <w:spacing w:after="30" w:before="30" w:line="264"/>
+            </w:pPr>
+            <w:r>
+              <w:rPr>
+                <w:rFonts w:ascii="Arial" w:cs="Arial" w:eastAsia="Arial" w:hAnsi="Arial"/>
+                <w:b w:val="false"/>
+                <w:bCs w:val="false"/>
+                <w:sz w:val="18"/>
+                <w:szCs w:val="18"/>
+                <w:rtl/>
+              </w:rPr>
+              <w:t xml:space="preserve">حزمة DS-FIN-C الاصطناعية مع DS-AGR C في بيئة الاختبار</w:t>
+            </w:r>
+          </w:p>
+        </w:tc>
+      </w:tr>
+      <w:tr>
+        <w:trPr>
+          <w:cantSplit/>
+        </w:trPr>
+        <w:tc>
+          <w:tcPr>
+            <w:tcW w:type="dxa" w:w="976"/>
+            <w:tcBorders>
+              <w:top w:val="single" w:color="BFC9D6" w:sz="4"/>
+              <w:left w:val="single" w:color="BFC9D6" w:sz="4"/>
+              <w:bottom w:val="single" w:color="BFC9D6" w:sz="4"/>
+              <w:right w:val="single" w:color="BFC9D6" w:sz="4"/>
+            </w:tcBorders>
+            <w:tcMar>
+              <w:top w:type="dxa" w:w="50"/>
+              <w:left w:type="dxa" w:w="90"/>
+              <w:bottom w:type="dxa" w:w="50"/>
+              <w:right w:type="dxa" w:w="90"/>
+            </w:tcMar>
+            <w:vAlign w:val="top"/>
+          </w:tcPr>
+          <w:p>
+            <w:pPr>
+              <w:keepNext w:val="false"/>
+              <w:bidi/>
+              <w:spacing w:after="30" w:before="30" w:line="264"/>
+            </w:pPr>
+            <w:r>
+              <w:rPr>
+                <w:rFonts w:ascii="Arial" w:cs="Arial" w:eastAsia="Arial" w:hAnsi="Arial"/>
+                <w:b w:val="false"/>
+                <w:bCs w:val="false"/>
+                <w:sz w:val="18"/>
+                <w:szCs w:val="18"/>
+                <w:rtl/>
+              </w:rPr>
+              <w:t xml:space="preserve">خروج</w:t>
+            </w:r>
+          </w:p>
+        </w:tc>
+        <w:tc>
+          <w:tcPr>
+            <w:tcW w:type="dxa" w:w="8888"/>
+            <w:tcBorders>
+              <w:top w:val="single" w:color="BFC9D6" w:sz="4"/>
+              <w:left w:val="single" w:color="BFC9D6" w:sz="4"/>
+              <w:bottom w:val="single" w:color="BFC9D6" w:sz="4"/>
+              <w:right w:val="single" w:color="BFC9D6" w:sz="4"/>
+            </w:tcBorders>
+            <w:tcMar>
+              <w:top w:type="dxa" w:w="50"/>
+              <w:left w:type="dxa" w:w="90"/>
+              <w:bottom w:type="dxa" w:w="50"/>
+              <w:right w:type="dxa" w:w="90"/>
+            </w:tcMar>
+            <w:vAlign w:val="top"/>
+          </w:tcPr>
+          <w:p>
+            <w:pPr>
+              <w:keepNext w:val="false"/>
+              <w:bidi/>
+              <w:spacing w:after="30" w:before="30" w:line="264"/>
+            </w:pPr>
+            <w:r>
+              <w:rPr>
+                <w:rFonts w:ascii="Arial" w:cs="Arial" w:eastAsia="Arial" w:hAnsi="Arial"/>
+                <w:b w:val="false"/>
+                <w:bCs w:val="false"/>
+                <w:sz w:val="18"/>
+                <w:szCs w:val="18"/>
+                <w:rtl/>
+              </w:rPr>
+              <w:t xml:space="preserve">AC-FAC-7 بحالة لكل معطى (docs/10-detailed-analysis/12-m5-facilities-pricing-collateral-obligations.md:762)</w:t>
+            </w:r>
+          </w:p>
+        </w:tc>
+      </w:tr>
+      <w:tr>
+        <w:trPr>
+          <w:cantSplit/>
+        </w:trPr>
+        <w:tc>
+          <w:tcPr>
+            <w:tcW w:type="dxa" w:w="976"/>
+            <w:tcBorders>
+              <w:top w:val="single" w:color="BFC9D6" w:sz="4"/>
+              <w:left w:val="single" w:color="BFC9D6" w:sz="4"/>
+              <w:bottom w:val="single" w:color="BFC9D6" w:sz="4"/>
+              <w:right w:val="single" w:color="BFC9D6" w:sz="4"/>
+            </w:tcBorders>
+            <w:shd w:fill="F5F8FC" w:color="auto" w:val="clear"/>
+            <w:tcMar>
+              <w:top w:type="dxa" w:w="50"/>
+              <w:left w:type="dxa" w:w="90"/>
+              <w:bottom w:type="dxa" w:w="50"/>
+              <w:right w:type="dxa" w:w="90"/>
+            </w:tcMar>
+            <w:vAlign w:val="top"/>
+          </w:tcPr>
+          <w:p>
+            <w:pPr>
+              <w:keepNext w:val="false"/>
+              <w:bidi/>
+              <w:spacing w:after="30" w:before="30" w:line="264"/>
+            </w:pPr>
+            <w:r>
+              <w:rPr>
+                <w:rFonts w:ascii="Arial" w:cs="Arial" w:eastAsia="Arial" w:hAnsi="Arial"/>
+                <w:b w:val="false"/>
+                <w:bCs w:val="false"/>
+                <w:sz w:val="18"/>
+                <w:szCs w:val="18"/>
+                <w:rtl/>
+              </w:rPr>
+              <w:t xml:space="preserve">خروج</w:t>
+            </w:r>
+          </w:p>
+        </w:tc>
+        <w:tc>
+          <w:tcPr>
+            <w:tcW w:type="dxa" w:w="8888"/>
+            <w:tcBorders>
+              <w:top w:val="single" w:color="BFC9D6" w:sz="4"/>
+              <w:left w:val="single" w:color="BFC9D6" w:sz="4"/>
+              <w:bottom w:val="single" w:color="BFC9D6" w:sz="4"/>
+              <w:right w:val="single" w:color="BFC9D6" w:sz="4"/>
+            </w:tcBorders>
+            <w:shd w:fill="F5F8FC" w:color="auto" w:val="clear"/>
+            <w:tcMar>
+              <w:top w:type="dxa" w:w="50"/>
+              <w:left w:type="dxa" w:w="90"/>
+              <w:bottom w:type="dxa" w:w="50"/>
+              <w:right w:type="dxa" w:w="90"/>
+            </w:tcMar>
+            <w:vAlign w:val="top"/>
+          </w:tcPr>
+          <w:p>
+            <w:pPr>
+              <w:keepNext w:val="false"/>
+              <w:bidi/>
+              <w:spacing w:after="30" w:before="30" w:line="264"/>
+            </w:pPr>
+            <w:r>
+              <w:rPr>
+                <w:rFonts w:ascii="Arial" w:cs="Arial" w:eastAsia="Arial" w:hAnsi="Arial"/>
+                <w:b w:val="false"/>
+                <w:bCs w:val="false"/>
+                <w:sz w:val="18"/>
+                <w:szCs w:val="18"/>
+                <w:rtl/>
+              </w:rPr>
+              <w:t xml:space="preserve">AC-FAC-13: لوحة امتثال التسهيل C بمقاييسها في تاريخ ثابت، مطابقةً لـ R-OBL-04 ودون ثانيتين (NFR-PERF-01)</w:t>
+            </w:r>
+          </w:p>
+        </w:tc>
+      </w:tr>
+      <w:tr>
+        <w:trPr>
+          <w:cantSplit/>
+        </w:trPr>
+        <w:tc>
+          <w:tcPr>
+            <w:tcW w:type="dxa" w:w="976"/>
+            <w:tcBorders>
+              <w:top w:val="single" w:color="BFC9D6" w:sz="4"/>
+              <w:left w:val="single" w:color="BFC9D6" w:sz="4"/>
+              <w:bottom w:val="single" w:color="BFC9D6" w:sz="4"/>
+              <w:right w:val="single" w:color="BFC9D6" w:sz="4"/>
+            </w:tcBorders>
+            <w:tcMar>
+              <w:top w:type="dxa" w:w="50"/>
+              <w:left w:type="dxa" w:w="90"/>
+              <w:bottom w:type="dxa" w:w="50"/>
+              <w:right w:type="dxa" w:w="90"/>
+            </w:tcMar>
+            <w:vAlign w:val="top"/>
+          </w:tcPr>
+          <w:p>
+            <w:pPr>
+              <w:keepNext w:val="false"/>
+              <w:bidi/>
+              <w:spacing w:after="30" w:before="30" w:line="264"/>
+            </w:pPr>
+            <w:r>
+              <w:rPr>
+                <w:rFonts w:ascii="Arial" w:cs="Arial" w:eastAsia="Arial" w:hAnsi="Arial"/>
+                <w:b w:val="false"/>
+                <w:bCs w:val="false"/>
+                <w:sz w:val="18"/>
+                <w:szCs w:val="18"/>
+                <w:rtl/>
+              </w:rPr>
+              <w:t xml:space="preserve">خروج</w:t>
+            </w:r>
+          </w:p>
+        </w:tc>
+        <w:tc>
+          <w:tcPr>
+            <w:tcW w:type="dxa" w:w="8888"/>
+            <w:tcBorders>
+              <w:top w:val="single" w:color="BFC9D6" w:sz="4"/>
+              <w:left w:val="single" w:color="BFC9D6" w:sz="4"/>
+              <w:bottom w:val="single" w:color="BFC9D6" w:sz="4"/>
+              <w:right w:val="single" w:color="BFC9D6" w:sz="4"/>
+            </w:tcBorders>
+            <w:tcMar>
+              <w:top w:type="dxa" w:w="50"/>
+              <w:left w:type="dxa" w:w="90"/>
+              <w:bottom w:type="dxa" w:w="50"/>
+              <w:right w:type="dxa" w:w="90"/>
+            </w:tcMar>
+            <w:vAlign w:val="top"/>
+          </w:tcPr>
+          <w:p>
+            <w:pPr>
+              <w:keepNext w:val="false"/>
+              <w:bidi/>
+              <w:spacing w:after="30" w:before="30" w:line="264"/>
+            </w:pPr>
+            <w:r>
+              <w:rPr>
+                <w:rFonts w:ascii="Arial" w:cs="Arial" w:eastAsia="Arial" w:hAnsi="Arial"/>
+                <w:b w:val="false"/>
+                <w:bCs w:val="false"/>
+                <w:sz w:val="18"/>
+                <w:szCs w:val="18"/>
+                <w:rtl/>
+              </w:rPr>
+              <w:t xml:space="preserve">AC-FIN-1 إلى 9 في DOC-B02 §11</w:t>
+            </w:r>
+          </w:p>
+        </w:tc>
+      </w:tr>
+    </w:tbl>
+    <w:p>
+      <w:pPr>
+        <w:bidi/>
+        <w:spacing w:after="120" w:before="0"/>
+      </w:pPr>
+    </w:p>
+    <w:p>
+      <w:pPr>
         <w:pStyle w:val="Heading1"/>
         <w:bidi/>
       </w:pPr>
-      <w:bookmarkStart w:name="_sec13" w:id="13"/>
+      <w:bookmarkStart w:name="_sec14" w:id="14"/>
       <w:r>
         <w:rPr>
           <w:rFonts w:ascii="Arial" w:cs="Arial" w:eastAsia="Arial" w:hAnsi="Arial"/>
@@ -11287,7 +11867,7 @@
         </w:rPr>
         <w:t xml:space="preserve">6. اختبار خروج S0</w:t>
       </w:r>
-      <w:bookmarkEnd w:id="13"/>
+      <w:bookmarkEnd w:id="14"/>
     </w:p>
     <w:p>
       <w:pPr>
@@ -12342,7 +12922,7 @@
         <w:pStyle w:val="Heading1"/>
         <w:bidi/>
       </w:pPr>
-      <w:bookmarkStart w:name="_sec14" w:id="14"/>
+      <w:bookmarkStart w:name="_sec15" w:id="15"/>
       <w:r>
         <w:rPr>
           <w:rFonts w:ascii="Arial" w:cs="Arial" w:eastAsia="Arial" w:hAnsi="Arial"/>
@@ -12355,7 +12935,7 @@
         </w:rPr>
         <w:t xml:space="preserve">7. شدة العيوب وفرزها</w:t>
       </w:r>
-      <w:bookmarkEnd w:id="14"/>
+      <w:bookmarkEnd w:id="15"/>
     </w:p>
     <w:tbl>
       <w:tblPr>
@@ -13304,7 +13884,7 @@
         <w:pStyle w:val="Heading1"/>
         <w:bidi/>
       </w:pPr>
-      <w:bookmarkStart w:name="_sec15" w:id="15"/>
+      <w:bookmarkStart w:name="_sec16" w:id="16"/>
       <w:r>
         <w:rPr>
           <w:rFonts w:ascii="Arial" w:cs="Arial" w:eastAsia="Arial" w:hAnsi="Arial"/>
@@ -13317,7 +13897,7 @@
         </w:rPr>
         <w:t xml:space="preserve">8. قواعد بيانات الاختبار</w:t>
       </w:r>
-      <w:bookmarkEnd w:id="15"/>
+      <w:bookmarkEnd w:id="16"/>
     </w:p>
     <w:p>
       <w:pPr>
@@ -13501,7 +14081,7 @@
         <w:pStyle w:val="Heading1"/>
         <w:bidi/>
       </w:pPr>
-      <w:bookmarkStart w:name="_sec16" w:id="16"/>
+      <w:bookmarkStart w:name="_sec17" w:id="17"/>
       <w:r>
         <w:rPr>
           <w:rFonts w:ascii="Arial" w:cs="Arial" w:eastAsia="Arial" w:hAnsi="Arial"/>
@@ -13514,7 +14094,7 @@
         </w:rPr>
         <w:t xml:space="preserve">9. تسجيل النتائج والتتبع</w:t>
       </w:r>
-      <w:bookmarkEnd w:id="16"/>
+      <w:bookmarkEnd w:id="17"/>
     </w:p>
     <w:p>
       <w:pPr>
@@ -13679,7 +14259,7 @@
         <w:pStyle w:val="Heading1"/>
         <w:bidi/>
       </w:pPr>
-      <w:bookmarkStart w:name="_sec17" w:id="17"/>
+      <w:bookmarkStart w:name="_sec18" w:id="18"/>
       <w:r>
         <w:rPr>
           <w:rFonts w:ascii="Arial" w:cs="Arial" w:eastAsia="Arial" w:hAnsi="Arial"/>
@@ -13692,7 +14272,7 @@
         </w:rPr>
         <w:t xml:space="preserve">10. جدول الاختبار لكل شريحة</w:t>
       </w:r>
-      <w:bookmarkEnd w:id="17"/>
+      <w:bookmarkEnd w:id="18"/>
     </w:p>
     <w:tbl>
       <w:tblPr>
@@ -14760,7 +15340,7 @@
         <w:pStyle w:val="Heading1"/>
         <w:bidi/>
       </w:pPr>
-      <w:bookmarkStart w:name="_sec18" w:id="18"/>
+      <w:bookmarkStart w:name="_sec19" w:id="19"/>
       <w:r>
         <w:rPr>
           <w:rFonts w:ascii="Arial" w:cs="Arial" w:eastAsia="Arial" w:hAnsi="Arial"/>
@@ -14773,7 +15353,7 @@
         </w:rPr>
         <w:t xml:space="preserve">11. القرارات المطلوبة</w:t>
       </w:r>
-      <w:bookmarkEnd w:id="18"/>
+      <w:bookmarkEnd w:id="19"/>
     </w:p>
     <w:tbl>
       <w:tblPr>
@@ -16975,7 +17555,7 @@
         <w:pStyle w:val="Heading1"/>
         <w:bidi/>
       </w:pPr>
-      <w:bookmarkStart w:name="_sec19" w:id="19"/>
+      <w:bookmarkStart w:name="_sec20" w:id="20"/>
       <w:r>
         <w:rPr>
           <w:rFonts w:ascii="Arial" w:cs="Arial" w:eastAsia="Arial" w:hAnsi="Arial"/>
@@ -16988,7 +17568,7 @@
         </w:rPr>
         <w:t xml:space="preserve">12. تعارضات وفجوات في المصادر</w:t>
       </w:r>
-      <w:bookmarkEnd w:id="19"/>
+      <w:bookmarkEnd w:id="20"/>
     </w:p>
     <w:p>
       <w:pPr>
@@ -17132,7 +17712,7 @@
         <w:pStyle w:val="Heading1"/>
         <w:bidi/>
       </w:pPr>
-      <w:bookmarkStart w:name="_sec20" w:id="20"/>
+      <w:bookmarkStart w:name="_sec21" w:id="21"/>
       <w:r>
         <w:rPr>
           <w:rFonts w:ascii="Arial" w:cs="Arial" w:eastAsia="Arial" w:hAnsi="Arial"/>
@@ -17145,7 +17725,7 @@
         </w:rPr>
         <w:t xml:space="preserve">13. التتبع</w:t>
       </w:r>
-      <w:bookmarkEnd w:id="20"/>
+      <w:bookmarkEnd w:id="21"/>
     </w:p>
     <w:tbl>
       <w:tblPr>

</xml_diff>